<commit_message>
2. + 2.1. chapters created in document
</commit_message>
<xml_diff>
--- a/KVDDokumentacija_GodotSpele_Sidorcenko.docx
+++ b/KVDDokumentacija_GodotSpele_Sidorcenko.docx
@@ -9,6 +9,9 @@
         <w:jc w:val="center"/>
       </w:pPr>
       <w:r>
+        <w:rPr>
+          <w:noProof/>
+        </w:rPr>
         <w:drawing>
           <wp:inline distT="0" distB="0" distL="0" distR="0" wp14:anchorId="004B529F" wp14:editId="64AD3E34">
             <wp:extent cx="1455166" cy="513080"/>
@@ -1567,21 +1570,12 @@
         </w:rPr>
         <w:tab/>
       </w:r>
-      <w:proofErr w:type="spellStart"/>
-      <w:r>
-        <w:rPr>
-          <w:color w:val="auto"/>
-          <w:sz w:val="24"/>
-        </w:rPr>
-        <w:t>Lietojumgadījumu</w:t>
-      </w:r>
-      <w:proofErr w:type="spellEnd"/>
-      <w:r>
-        <w:rPr>
-          <w:color w:val="auto"/>
-          <w:sz w:val="24"/>
-        </w:rPr>
-        <w:t xml:space="preserve"> diagramma </w:t>
+      <w:r>
+        <w:rPr>
+          <w:color w:val="auto"/>
+          <w:sz w:val="24"/>
+        </w:rPr>
+        <w:t xml:space="preserve">Lietojumgadījumu diagramma </w:t>
       </w:r>
       <w:r>
         <w:rPr>
@@ -1590,47 +1584,7 @@
           <w:color w:val="auto"/>
           <w:sz w:val="24"/>
         </w:rPr>
-        <w:t>(</w:t>
-      </w:r>
-      <w:proofErr w:type="spellStart"/>
-      <w:r>
-        <w:rPr>
-          <w:i/>
-          <w:iCs/>
-          <w:color w:val="auto"/>
-          <w:sz w:val="24"/>
-        </w:rPr>
-        <w:t>Use</w:t>
-      </w:r>
-      <w:proofErr w:type="spellEnd"/>
-      <w:r>
-        <w:rPr>
-          <w:i/>
-          <w:iCs/>
-          <w:color w:val="auto"/>
-          <w:sz w:val="24"/>
-        </w:rPr>
-        <w:t xml:space="preserve"> </w:t>
-      </w:r>
-      <w:proofErr w:type="spellStart"/>
-      <w:r>
-        <w:rPr>
-          <w:i/>
-          <w:iCs/>
-          <w:color w:val="auto"/>
-          <w:sz w:val="24"/>
-        </w:rPr>
-        <w:t>Case</w:t>
-      </w:r>
-      <w:proofErr w:type="spellEnd"/>
-      <w:r>
-        <w:rPr>
-          <w:i/>
-          <w:iCs/>
-          <w:color w:val="auto"/>
-          <w:sz w:val="24"/>
-        </w:rPr>
-        <w:t>)</w:t>
+        <w:t>(Use Case)</w:t>
       </w:r>
       <w:r>
         <w:rPr>
@@ -1718,27 +1672,7 @@
           <w:color w:val="auto"/>
           <w:sz w:val="24"/>
         </w:rPr>
-        <w:t>(</w:t>
-      </w:r>
-      <w:proofErr w:type="spellStart"/>
-      <w:r>
-        <w:rPr>
-          <w:i/>
-          <w:iCs/>
-          <w:color w:val="auto"/>
-          <w:sz w:val="24"/>
-        </w:rPr>
-        <w:t>Activity</w:t>
-      </w:r>
-      <w:proofErr w:type="spellEnd"/>
-      <w:r>
-        <w:rPr>
-          <w:i/>
-          <w:iCs/>
-          <w:color w:val="auto"/>
-          <w:sz w:val="24"/>
-        </w:rPr>
-        <w:t>)</w:t>
+        <w:t>(Activity)</w:t>
       </w:r>
       <w:r>
         <w:rPr>
@@ -1826,27 +1760,7 @@
           <w:color w:val="auto"/>
           <w:sz w:val="24"/>
         </w:rPr>
-        <w:t>(</w:t>
-      </w:r>
-      <w:proofErr w:type="spellStart"/>
-      <w:r>
-        <w:rPr>
-          <w:i/>
-          <w:iCs/>
-          <w:color w:val="auto"/>
-          <w:sz w:val="24"/>
-        </w:rPr>
-        <w:t>State</w:t>
-      </w:r>
-      <w:proofErr w:type="spellEnd"/>
-      <w:r>
-        <w:rPr>
-          <w:i/>
-          <w:iCs/>
-          <w:color w:val="auto"/>
-          <w:sz w:val="24"/>
-        </w:rPr>
-        <w:t>)</w:t>
+        <w:t>(State)</w:t>
       </w:r>
       <w:r>
         <w:rPr>
@@ -3020,7 +2934,21 @@
         <w:rPr>
           <w:sz w:val="24"/>
         </w:rPr>
-        <w:t xml:space="preserve"> Games”</w:t>
+        <w:t xml:space="preserve"> </w:t>
+      </w:r>
+      <w:proofErr w:type="spellStart"/>
+      <w:r>
+        <w:rPr>
+          <w:sz w:val="24"/>
+        </w:rPr>
+        <w:t>Games</w:t>
+      </w:r>
+      <w:proofErr w:type="spellEnd"/>
+      <w:r>
+        <w:rPr>
+          <w:sz w:val="24"/>
+        </w:rPr>
+        <w:t>”</w:t>
       </w:r>
       <w:r>
         <w:rPr>
@@ -3087,6 +3015,59 @@
           <w:sz w:val="24"/>
         </w:rPr>
         <w:t xml:space="preserve"> spēli, kas piedāvā aizraujošu un daudzveidīgu pieredzi spēlētājiem, vienlaikus attīstot autora prasmes un zināšanas.</w:t>
+      </w:r>
+    </w:p>
+    <w:p>
+      <w:pPr>
+        <w:spacing w:after="0" w:line="360" w:lineRule="auto"/>
+        <w:ind w:left="0" w:right="0" w:firstLine="851"/>
+        <w:rPr>
+          <w:sz w:val="24"/>
+        </w:rPr>
+      </w:pPr>
+      <w:r>
+        <w:rPr>
+          <w:sz w:val="24"/>
+        </w:rPr>
+        <w:t xml:space="preserve">Projekta attīstības gaitā visas spēles versijas un uzlabojumi tiek glabāti </w:t>
+      </w:r>
+      <w:proofErr w:type="spellStart"/>
+      <w:r>
+        <w:rPr>
+          <w:sz w:val="24"/>
+        </w:rPr>
+        <w:t>GitHub</w:t>
+      </w:r>
+      <w:proofErr w:type="spellEnd"/>
+      <w:r>
+        <w:rPr>
+          <w:sz w:val="24"/>
+        </w:rPr>
+        <w:t xml:space="preserve"> repozitorijā</w:t>
+      </w:r>
+      <w:r>
+        <w:rPr>
+          <w:sz w:val="24"/>
+        </w:rPr>
+        <w:t>:</w:t>
+      </w:r>
+      <w:r>
+        <w:rPr>
+          <w:sz w:val="24"/>
+        </w:rPr>
+        <w:t xml:space="preserve"> </w:t>
+      </w:r>
+      <w:r>
+        <w:rPr>
+          <w:sz w:val="24"/>
+        </w:rPr>
+        <w:t>https://github.com/Deather2/GodotGame</w:t>
+      </w:r>
+      <w:r>
+        <w:rPr>
+          <w:sz w:val="24"/>
+        </w:rPr>
+        <w:t xml:space="preserve">. Tas ļauj sekot līdzi spēles progresam, salīdzināt dažādas versijas un viegli dalīties ar projektu. </w:t>
       </w:r>
     </w:p>
     <w:p>
@@ -3683,9 +3664,6 @@
         <w:pStyle w:val="1"/>
         <w:spacing w:after="240" w:line="240" w:lineRule="auto"/>
         <w:ind w:left="431" w:right="11" w:hanging="431"/>
-        <w:rPr>
-          <w:lang w:val="lv-LV"/>
-        </w:rPr>
       </w:pPr>
       <w:bookmarkStart w:id="2" w:name="_Toc212298883"/>
       <w:r>
@@ -3696,6 +3674,21 @@
         <w:t>Programmatūras prasību specifikācija</w:t>
       </w:r>
       <w:bookmarkEnd w:id="2"/>
+    </w:p>
+    <w:p>
+      <w:pPr>
+        <w:spacing w:after="0" w:line="360" w:lineRule="auto"/>
+        <w:ind w:left="0" w:right="0" w:firstLine="851"/>
+        <w:rPr>
+          <w:sz w:val="24"/>
+        </w:rPr>
+      </w:pPr>
+      <w:r>
+        <w:rPr>
+          <w:sz w:val="24"/>
+        </w:rPr>
+        <w:t>Šajā nodaļā tiek aprakstītas galvenās prasības, kas nosaka spēles funkcionalitāti. Tiek sniegts pārskats par programmatūras perspektīvu, sistēmas funkcionālajām un nefunkcionālajām prasībām. Šīs prasības palīdzēs nodrošināt, ka spēle tiek izstrādāta atbilstoši mērķiem, ir lietotājam draudzīga un tehniski stabila. Nodaļā turpmāk detalizēti tiks izklāstīts, kādas funkcijas, īpašības un lietotāja iespējas spēlē ir paredzētas, kā arī kā tiek nodrošināta sistēmas kvalitāte un efektivitāte.</w:t>
+      </w:r>
     </w:p>
     <w:p>
       <w:pPr>
@@ -3704,18 +3697,74 @@
         <w:ind w:left="11" w:right="11" w:hanging="11"/>
         <w:rPr>
           <w:sz w:val="24"/>
+        </w:rPr>
+      </w:pPr>
+      <w:bookmarkStart w:id="3" w:name="_Toc212298884"/>
+      <w:r>
+        <w:rPr>
+          <w:sz w:val="24"/>
           <w:lang w:val="lv-LV"/>
         </w:rPr>
-      </w:pPr>
-      <w:bookmarkStart w:id="3" w:name="_Toc212298884"/>
-      <w:r>
-        <w:rPr>
-          <w:sz w:val="24"/>
-          <w:lang w:val="lv-LV"/>
-        </w:rPr>
         <w:t>Produkta perspektīva</w:t>
       </w:r>
       <w:bookmarkEnd w:id="3"/>
+    </w:p>
+    <w:p>
+      <w:pPr>
+        <w:spacing w:after="0" w:line="360" w:lineRule="auto"/>
+        <w:ind w:left="0" w:right="0" w:firstLine="851"/>
+        <w:rPr>
+          <w:sz w:val="24"/>
+        </w:rPr>
+      </w:pPr>
+      <w:r>
+        <w:rPr>
+          <w:sz w:val="24"/>
+        </w:rPr>
+        <w:t>Spēles perspektīva balstās uz tās paplašināmību un turpmāko attīstību. Projekts ir izstrādāts tā, lai nākotnē būtu iespējams pievienot vairāk līmeņu, dažādas spēles mehānikas un papildinājumus, tādējādi padarot spēli daudzveidīgāku un interesantāku. Spēle ir potenciāli gatava publicēšanai digitālajos izplatīšanas kanālos, piemēram, “</w:t>
+      </w:r>
+      <w:proofErr w:type="spellStart"/>
+      <w:r>
+        <w:rPr>
+          <w:sz w:val="24"/>
+        </w:rPr>
+        <w:t>Steam</w:t>
+      </w:r>
+      <w:proofErr w:type="spellEnd"/>
+      <w:r>
+        <w:rPr>
+          <w:sz w:val="24"/>
+        </w:rPr>
+        <w:t>” vai “</w:t>
+      </w:r>
+      <w:proofErr w:type="spellStart"/>
+      <w:r>
+        <w:rPr>
+          <w:sz w:val="24"/>
+        </w:rPr>
+        <w:t>Epic</w:t>
+      </w:r>
+      <w:proofErr w:type="spellEnd"/>
+      <w:r>
+        <w:rPr>
+          <w:sz w:val="24"/>
+        </w:rPr>
+        <w:t xml:space="preserve"> </w:t>
+      </w:r>
+      <w:proofErr w:type="spellStart"/>
+      <w:r>
+        <w:rPr>
+          <w:sz w:val="24"/>
+        </w:rPr>
+        <w:t>Games</w:t>
+      </w:r>
+      <w:proofErr w:type="spellEnd"/>
+      <w:r>
+        <w:rPr>
+          <w:sz w:val="24"/>
+        </w:rPr>
+        <w:t>”, kas ļautu sasniegt plašu auditoriju. Turklāt projekta struktūra nodrošina iespēju attīstīt turpmākus paplašinājumus, papildinot gan vizuālo dizainu, gan spēles funkcionalitāti. Perspektīva projektam ir kombinēt radošu pieeju ar tehnisko attīstību, veidojot platformu ilgtermiņa spēles uzlabošanai un jaunu satura pievienošanai.</w:t>
+      </w:r>
     </w:p>
     <w:p>
       <w:pPr>

</xml_diff>

<commit_message>
First pages are corrected
</commit_message>
<xml_diff>
--- a/KVDDokumentacija_GodotSpele_Sidorcenko.docx
+++ b/KVDDokumentacija_GodotSpele_Sidorcenko.docx
@@ -9,9 +9,6 @@
         <w:jc w:val="center"/>
       </w:pPr>
       <w:r>
-        <w:rPr>
-          <w:noProof/>
-        </w:rPr>
         <w:drawing>
           <wp:inline distT="0" distB="0" distL="0" distR="0" wp14:anchorId="004B529F" wp14:editId="64AD3E34">
             <wp:extent cx="1455166" cy="513080"/>
@@ -87,7 +84,6 @@
         </w:rPr>
         <w:t xml:space="preserve">2D </w:t>
       </w:r>
-      <w:proofErr w:type="spellStart"/>
       <w:r>
         <w:rPr>
           <w:b/>
@@ -95,9 +91,8 @@
           <w:sz w:val="32"/>
           <w:szCs w:val="32"/>
         </w:rPr>
-        <w:t>Godot</w:t>
-      </w:r>
-      <w:proofErr w:type="spellEnd"/>
+        <w:t>piedzīvojum</w:t>
+      </w:r>
       <w:r>
         <w:rPr>
           <w:b/>
@@ -105,7 +100,65 @@
           <w:sz w:val="32"/>
           <w:szCs w:val="32"/>
         </w:rPr>
+        <w:t>u</w:t>
+      </w:r>
+      <w:r>
+        <w:rPr>
+          <w:b/>
+          <w:bCs/>
+          <w:sz w:val="32"/>
+          <w:szCs w:val="32"/>
+        </w:rPr>
         <w:t xml:space="preserve"> spēle</w:t>
+      </w:r>
+      <w:r>
+        <w:rPr>
+          <w:b/>
+          <w:bCs/>
+          <w:sz w:val="32"/>
+          <w:szCs w:val="32"/>
+        </w:rPr>
+        <w:t xml:space="preserve"> “</w:t>
+      </w:r>
+      <w:proofErr w:type="spellStart"/>
+      <w:r>
+        <w:rPr>
+          <w:b/>
+          <w:bCs/>
+          <w:sz w:val="32"/>
+          <w:szCs w:val="32"/>
+        </w:rPr>
+        <w:t>Light</w:t>
+      </w:r>
+      <w:proofErr w:type="spellEnd"/>
+      <w:r>
+        <w:rPr>
+          <w:b/>
+          <w:bCs/>
+          <w:sz w:val="32"/>
+          <w:szCs w:val="32"/>
+        </w:rPr>
+        <w:t xml:space="preserve"> </w:t>
+      </w:r>
+      <w:proofErr w:type="spellStart"/>
+      <w:r>
+        <w:rPr>
+          <w:b/>
+          <w:bCs/>
+          <w:sz w:val="32"/>
+          <w:szCs w:val="32"/>
+        </w:rPr>
+        <w:t>Seeker</w:t>
+      </w:r>
+      <w:proofErr w:type="spellEnd"/>
+      <w:r>
+        <w:rPr>
+          <w:b/>
+          <w:bCs/>
+          <w:sz w:val="32"/>
+          <w:szCs w:val="32"/>
+        </w:rPr>
+        <w:t>”</w:t>
       </w:r>
     </w:p>
     <w:p>
@@ -265,7 +318,7 @@
         <w:rPr>
           <w:sz w:val="28"/>
         </w:rPr>
-        <w:t>5</w:t>
+        <w:t>6</w:t>
       </w:r>
       <w:r>
         <w:rPr>
@@ -324,7 +377,7 @@
         <w:rPr>
           <w:sz w:val="28"/>
         </w:rPr>
-        <w:t>5</w:t>
+        <w:t>6</w:t>
       </w:r>
       <w:r>
         <w:t xml:space="preserve"> </w:t>
@@ -435,7 +488,7 @@
         <w:rPr>
           <w:sz w:val="24"/>
         </w:rPr>
-        <w:t>3</w:t>
+        <w:t>4</w:t>
       </w:r>
       <w:r>
         <w:rPr>
@@ -512,7 +565,7 @@
         <w:rPr>
           <w:sz w:val="24"/>
         </w:rPr>
-        <w:t>5</w:t>
+        <w:t>6</w:t>
       </w:r>
       <w:r>
         <w:rPr>
@@ -589,7 +642,7 @@
         <w:rPr>
           <w:sz w:val="24"/>
         </w:rPr>
-        <w:t>6</w:t>
+        <w:t>8</w:t>
       </w:r>
       <w:r>
         <w:rPr>
@@ -666,7 +719,7 @@
         <w:rPr>
           <w:sz w:val="24"/>
         </w:rPr>
-        <w:t>6</w:t>
+        <w:t>8</w:t>
       </w:r>
       <w:r>
         <w:rPr>
@@ -743,7 +796,7 @@
         <w:rPr>
           <w:sz w:val="24"/>
         </w:rPr>
-        <w:t>6</w:t>
+        <w:t>8</w:t>
       </w:r>
       <w:r>
         <w:rPr>
@@ -820,7 +873,7 @@
         <w:rPr>
           <w:sz w:val="24"/>
         </w:rPr>
-        <w:t>6</w:t>
+        <w:t>8</w:t>
       </w:r>
       <w:r>
         <w:rPr>
@@ -897,7 +950,7 @@
         <w:rPr>
           <w:sz w:val="24"/>
         </w:rPr>
-        <w:t>6</w:t>
+        <w:t>8</w:t>
       </w:r>
       <w:r>
         <w:rPr>
@@ -974,7 +1027,7 @@
         <w:rPr>
           <w:sz w:val="24"/>
         </w:rPr>
-        <w:t>7</w:t>
+        <w:t>9</w:t>
       </w:r>
       <w:r>
         <w:rPr>
@@ -1051,7 +1104,7 @@
         <w:rPr>
           <w:sz w:val="24"/>
         </w:rPr>
-        <w:t>7</w:t>
+        <w:t>9</w:t>
       </w:r>
       <w:r>
         <w:rPr>
@@ -1142,7 +1195,7 @@
         <w:rPr>
           <w:sz w:val="24"/>
         </w:rPr>
-        <w:t>7</w:t>
+        <w:t>9</w:t>
       </w:r>
       <w:r>
         <w:rPr>
@@ -1219,7 +1272,7 @@
         <w:rPr>
           <w:sz w:val="24"/>
         </w:rPr>
-        <w:t>8</w:t>
+        <w:t>10</w:t>
       </w:r>
       <w:r>
         <w:rPr>
@@ -1296,7 +1349,7 @@
         <w:rPr>
           <w:sz w:val="24"/>
         </w:rPr>
-        <w:t>8</w:t>
+        <w:t>10</w:t>
       </w:r>
       <w:r>
         <w:rPr>
@@ -1375,7 +1428,7 @@
         <w:rPr>
           <w:sz w:val="24"/>
         </w:rPr>
-        <w:t>8</w:t>
+        <w:t>10</w:t>
       </w:r>
       <w:r>
         <w:rPr>
@@ -1454,7 +1507,7 @@
         <w:rPr>
           <w:sz w:val="24"/>
         </w:rPr>
-        <w:t>8</w:t>
+        <w:t>10</w:t>
       </w:r>
       <w:r>
         <w:rPr>
@@ -1531,7 +1584,7 @@
         <w:rPr>
           <w:sz w:val="24"/>
         </w:rPr>
-        <w:t>8</w:t>
+        <w:t>10</w:t>
       </w:r>
       <w:r>
         <w:rPr>
@@ -1570,12 +1623,21 @@
         </w:rPr>
         <w:tab/>
       </w:r>
+      <w:proofErr w:type="spellStart"/>
       <w:r>
         <w:rPr>
           <w:color w:val="auto"/>
           <w:sz w:val="24"/>
         </w:rPr>
-        <w:t xml:space="preserve">Lietojumgadījumu diagramma </w:t>
+        <w:t>Lietojumgadījumu</w:t>
+      </w:r>
+      <w:proofErr w:type="spellEnd"/>
+      <w:r>
+        <w:rPr>
+          <w:color w:val="auto"/>
+          <w:sz w:val="24"/>
+        </w:rPr>
+        <w:t xml:space="preserve"> diagramma </w:t>
       </w:r>
       <w:r>
         <w:rPr>
@@ -1584,7 +1646,47 @@
           <w:color w:val="auto"/>
           <w:sz w:val="24"/>
         </w:rPr>
-        <w:t>(Use Case)</w:t>
+        <w:t>(</w:t>
+      </w:r>
+      <w:proofErr w:type="spellStart"/>
+      <w:r>
+        <w:rPr>
+          <w:i/>
+          <w:iCs/>
+          <w:color w:val="auto"/>
+          <w:sz w:val="24"/>
+        </w:rPr>
+        <w:t>Use</w:t>
+      </w:r>
+      <w:proofErr w:type="spellEnd"/>
+      <w:r>
+        <w:rPr>
+          <w:i/>
+          <w:iCs/>
+          <w:color w:val="auto"/>
+          <w:sz w:val="24"/>
+        </w:rPr>
+        <w:t xml:space="preserve"> </w:t>
+      </w:r>
+      <w:proofErr w:type="spellStart"/>
+      <w:r>
+        <w:rPr>
+          <w:i/>
+          <w:iCs/>
+          <w:color w:val="auto"/>
+          <w:sz w:val="24"/>
+        </w:rPr>
+        <w:t>Case</w:t>
+      </w:r>
+      <w:proofErr w:type="spellEnd"/>
+      <w:r>
+        <w:rPr>
+          <w:i/>
+          <w:iCs/>
+          <w:color w:val="auto"/>
+          <w:sz w:val="24"/>
+        </w:rPr>
+        <w:t>)</w:t>
       </w:r>
       <w:r>
         <w:rPr>
@@ -1619,7 +1721,7 @@
         <w:rPr>
           <w:sz w:val="24"/>
         </w:rPr>
-        <w:t>8</w:t>
+        <w:t>10</w:t>
       </w:r>
       <w:r>
         <w:rPr>
@@ -1672,7 +1774,27 @@
           <w:color w:val="auto"/>
           <w:sz w:val="24"/>
         </w:rPr>
-        <w:t>(Activity)</w:t>
+        <w:t>(</w:t>
+      </w:r>
+      <w:proofErr w:type="spellStart"/>
+      <w:r>
+        <w:rPr>
+          <w:i/>
+          <w:iCs/>
+          <w:color w:val="auto"/>
+          <w:sz w:val="24"/>
+        </w:rPr>
+        <w:t>Activity</w:t>
+      </w:r>
+      <w:proofErr w:type="spellEnd"/>
+      <w:r>
+        <w:rPr>
+          <w:i/>
+          <w:iCs/>
+          <w:color w:val="auto"/>
+          <w:sz w:val="24"/>
+        </w:rPr>
+        <w:t>)</w:t>
       </w:r>
       <w:r>
         <w:rPr>
@@ -1707,7 +1829,7 @@
         <w:rPr>
           <w:sz w:val="24"/>
         </w:rPr>
-        <w:t>8</w:t>
+        <w:t>10</w:t>
       </w:r>
       <w:r>
         <w:rPr>
@@ -1760,7 +1882,27 @@
           <w:color w:val="auto"/>
           <w:sz w:val="24"/>
         </w:rPr>
-        <w:t>(State)</w:t>
+        <w:t>(</w:t>
+      </w:r>
+      <w:proofErr w:type="spellStart"/>
+      <w:r>
+        <w:rPr>
+          <w:i/>
+          <w:iCs/>
+          <w:color w:val="auto"/>
+          <w:sz w:val="24"/>
+        </w:rPr>
+        <w:t>State</w:t>
+      </w:r>
+      <w:proofErr w:type="spellEnd"/>
+      <w:r>
+        <w:rPr>
+          <w:i/>
+          <w:iCs/>
+          <w:color w:val="auto"/>
+          <w:sz w:val="24"/>
+        </w:rPr>
+        <w:t>)</w:t>
       </w:r>
       <w:r>
         <w:rPr>
@@ -1795,7 +1937,7 @@
         <w:rPr>
           <w:sz w:val="24"/>
         </w:rPr>
-        <w:t>8</w:t>
+        <w:t>10</w:t>
       </w:r>
       <w:r>
         <w:rPr>
@@ -1872,7 +2014,7 @@
         <w:rPr>
           <w:sz w:val="24"/>
         </w:rPr>
-        <w:t>8</w:t>
+        <w:t>10</w:t>
       </w:r>
       <w:r>
         <w:rPr>
@@ -1949,7 +2091,7 @@
         <w:rPr>
           <w:sz w:val="24"/>
         </w:rPr>
-        <w:t>9</w:t>
+        <w:t>11</w:t>
       </w:r>
       <w:r>
         <w:rPr>
@@ -2026,7 +2168,7 @@
         <w:rPr>
           <w:sz w:val="24"/>
         </w:rPr>
-        <w:t>10</w:t>
+        <w:t>12</w:t>
       </w:r>
       <w:r>
         <w:rPr>
@@ -2103,7 +2245,7 @@
         <w:rPr>
           <w:sz w:val="24"/>
         </w:rPr>
-        <w:t>10</w:t>
+        <w:t>12</w:t>
       </w:r>
       <w:r>
         <w:rPr>
@@ -2180,7 +2322,7 @@
         <w:rPr>
           <w:sz w:val="24"/>
         </w:rPr>
-        <w:t>10</w:t>
+        <w:t>12</w:t>
       </w:r>
       <w:r>
         <w:rPr>
@@ -2257,7 +2399,7 @@
         <w:rPr>
           <w:sz w:val="24"/>
         </w:rPr>
-        <w:t>10</w:t>
+        <w:t>12</w:t>
       </w:r>
       <w:r>
         <w:rPr>
@@ -2319,7 +2461,7 @@
         <w:rPr>
           <w:sz w:val="24"/>
         </w:rPr>
-        <w:t>11</w:t>
+        <w:t>13</w:t>
       </w:r>
       <w:r>
         <w:rPr>
@@ -2347,12 +2489,10 @@
         <w:rPr>
           <w:sz w:val="24"/>
         </w:rPr>
-        <w:t>7.</w:t>
-      </w:r>
-      <w:r>
-        <w:rPr>
-          <w:rFonts w:asciiTheme="minorHAnsi" w:eastAsiaTheme="minorEastAsia" w:hAnsiTheme="minorHAnsi" w:cstheme="minorBidi"/>
-          <w:color w:val="auto"/>
+        <w:t>Lietoto terminu un saīsinājumu skaidrojumi</w:t>
+      </w:r>
+      <w:r>
+        <w:rPr>
           <w:sz w:val="24"/>
         </w:rPr>
         <w:tab/>
@@ -2361,18 +2501,6 @@
         <w:rPr>
           <w:sz w:val="24"/>
         </w:rPr>
-        <w:t>Lietoto terminu un saīsinājumu skaidrojumi</w:t>
-      </w:r>
-      <w:r>
-        <w:rPr>
-          <w:sz w:val="24"/>
-        </w:rPr>
-        <w:tab/>
-      </w:r>
-      <w:r>
-        <w:rPr>
-          <w:sz w:val="24"/>
-        </w:rPr>
         <w:fldChar w:fldCharType="begin"/>
       </w:r>
       <w:r>
@@ -2396,7 +2524,7 @@
         <w:rPr>
           <w:sz w:val="24"/>
         </w:rPr>
-        <w:t>12</w:t>
+        <w:t>14</w:t>
       </w:r>
       <w:r>
         <w:rPr>
@@ -2458,7 +2586,7 @@
         <w:rPr>
           <w:sz w:val="24"/>
         </w:rPr>
-        <w:t>13</w:t>
+        <w:t>15</w:t>
       </w:r>
       <w:r>
         <w:rPr>
@@ -2521,7 +2649,7 @@
         <w:rPr>
           <w:sz w:val="24"/>
         </w:rPr>
-        <w:t>14</w:t>
+        <w:t>16</w:t>
       </w:r>
       <w:r>
         <w:rPr>
@@ -2562,11 +2690,6 @@
           <w:ilvl w:val="0"/>
           <w:numId w:val="0"/>
         </w:numPr>
-        <w:spacing w:after="240" w:line="240" w:lineRule="auto"/>
-        <w:ind w:right="11"/>
-        <w:rPr>
-          <w:lang w:val="lv-LV"/>
-        </w:rPr>
         <w:sectPr>
           <w:pgSz w:w="11906" w:h="16838"/>
           <w:pgMar w:top="1134" w:right="1134" w:bottom="1134" w:left="1418" w:header="720" w:footer="720" w:gutter="0"/>
@@ -2582,16 +2705,8 @@
           <w:ilvl w:val="0"/>
           <w:numId w:val="0"/>
         </w:numPr>
-        <w:spacing w:after="240" w:line="240" w:lineRule="auto"/>
-        <w:ind w:right="11"/>
-        <w:rPr>
-          <w:lang w:val="lv-LV"/>
-        </w:rPr>
-      </w:pPr>
-      <w:r>
-        <w:rPr>
-          <w:lang w:val="lv-LV"/>
-        </w:rPr>
+      </w:pPr>
+      <w:r>
         <w:lastRenderedPageBreak/>
         <w:t>Ievads</w:t>
       </w:r>
@@ -2609,33 +2724,7 @@
         <w:rPr>
           <w:sz w:val="24"/>
         </w:rPr>
-        <w:t xml:space="preserve">Videospēles jau daudzus gadus ir nozīmīga izklaides un kultūras sastāvdaļa. Tās ietekmē gan jaunākās paaudzes, gan pieaugušos, kuri atceras, kāda bija sajūta spēlēt savas mīļākās spēles bērnībā. 2D </w:t>
-      </w:r>
-      <w:proofErr w:type="spellStart"/>
-      <w:r>
-        <w:rPr>
-          <w:sz w:val="24"/>
-        </w:rPr>
-        <w:t>platformeri</w:t>
-      </w:r>
-      <w:proofErr w:type="spellEnd"/>
-      <w:r>
-        <w:rPr>
-          <w:sz w:val="24"/>
-        </w:rPr>
-        <w:t xml:space="preserve"> saglabā īpašu pievilcību </w:t>
-      </w:r>
-      <w:r>
-        <w:rPr>
-          <w:sz w:val="24"/>
-        </w:rPr>
-        <w:t>-</w:t>
-      </w:r>
-      <w:r>
-        <w:rPr>
-          <w:sz w:val="24"/>
-        </w:rPr>
-        <w:t xml:space="preserve"> tie ir saprotami, dinamiskie un piedāvā pakāpenisku progresu. Man pašam šis žanrs vienmēr šķitis īpašs, jo tas ļauj kombinēt izaicinājumu un prieku vienlaikus.</w:t>
+        <w:t>Videospēles jau daudzus gadus ir nozīmīga izklaides un kultūras sastāvdaļa. Tās ietekmē gan jaunākās paaudzes, gan pieaugušos, kuri atceras, kāda bija sajūta spēlēt savas mīļākās spēles bērnībā. 2D piedzīvojumu spēles saglabā īpašu pievilcību — tās ir saprotamas, dinamiskas un piedāvā pakāpenisku progresu. Darba autors uzskata, ka šis žanrs ļauj veiksmīgi apvienot izaicinājumu un prieku vienlaikus.</w:t>
       </w:r>
     </w:p>
     <w:p>
@@ -2748,45 +2837,22 @@
         <w:rPr>
           <w:sz w:val="24"/>
         </w:rPr>
-        <w:t xml:space="preserve">” piešķir dinamiku un piedzīvojuma sajūtu, kas aizrauj un iedvesmo, lai gan tās vizuālā struktūra atšķiras no tradicionālā 2D </w:t>
+        <w:t xml:space="preserve">” piešķir dinamiku un piedzīvojuma sajūtu, lai gan to vizuālā struktūra atšķiras no tradicionālām 2D </w:t>
       </w:r>
       <w:proofErr w:type="spellStart"/>
       <w:r>
         <w:rPr>
           <w:sz w:val="24"/>
         </w:rPr>
-        <w:t>platformera</w:t>
+        <w:t>platform</w:t>
       </w:r>
       <w:proofErr w:type="spellEnd"/>
       <w:r>
         <w:rPr>
           <w:sz w:val="24"/>
         </w:rPr>
-        <w:t>. Šīs spēles iedvesmoja arī mani, un tieši šī sajūta</w:t>
-      </w:r>
-      <w:r>
-        <w:rPr>
-          <w:sz w:val="24"/>
-        </w:rPr>
-        <w:t xml:space="preserve">, </w:t>
-      </w:r>
-      <w:r>
-        <w:rPr>
-          <w:sz w:val="24"/>
-        </w:rPr>
-        <w:t>kad spēle aizrauj no pirmās minūtes</w:t>
-      </w:r>
-      <w:r>
-        <w:rPr>
-          <w:sz w:val="24"/>
-        </w:rPr>
-        <w:t>,</w:t>
-      </w:r>
-      <w:r>
-        <w:rPr>
-          <w:sz w:val="24"/>
-        </w:rPr>
-        <w:t xml:space="preserve"> ir tas, ko gribu panākt savā projektā.</w:t>
+        <w:softHyphen/>
+        <w:t>-mehānikām. Šīs spēles iedvesmoja arī šo projektu, kura mērķis ir panākt līdzīgu sajūtu spēlētājam.</w:t>
       </w:r>
     </w:p>
     <w:p>
@@ -2801,21 +2867,7 @@
         <w:rPr>
           <w:sz w:val="24"/>
         </w:rPr>
-        <w:t xml:space="preserve">Šī kvalifikācijas darba mērķis ir radīt savu 2D </w:t>
-      </w:r>
-      <w:proofErr w:type="spellStart"/>
-      <w:r>
-        <w:rPr>
-          <w:sz w:val="24"/>
-        </w:rPr>
-        <w:t>platformera</w:t>
-      </w:r>
-      <w:proofErr w:type="spellEnd"/>
-      <w:r>
-        <w:rPr>
-          <w:sz w:val="24"/>
-        </w:rPr>
-        <w:t xml:space="preserve"> spēli ar vairākiem līmeņiem, kuros pakāpeniski tiek ieviestas jaunas mehānikas. Katrs līmenis būs citāds pēc dizaina un stilistikas, lai saglabātu spēles daudzveidību un piedzīvojuma sajūtu. Man svarīgi, lai spēlētājs jūtas motivēts turpināt piedzīvojumu, pat ja kāds līmenis sākumā šķiet sarežģīts.</w:t>
+        <w:t>Šī kvalifikācijas darba mērķis ir radīt 2D piedzīvojumu spēli ar vairākiem līmeņiem, kuros pakāpeniski tiek ieviestas jaunas mehānikas. Katrs līmenis būs atšķirīgs pēc dizaina un stilistikas, lai nodrošinātu daudzveidību un piedzīvojuma sajūtu. Darba autors uzskata, ka ir svarīgi, lai spēlētājs justos motivēts turpināt piedzīvojumu, pat ja kāds līmenis sākumā šķiet sarežģīts.</w:t>
       </w:r>
     </w:p>
     <w:p>
@@ -2830,7 +2882,7 @@
         <w:rPr>
           <w:sz w:val="24"/>
         </w:rPr>
-        <w:t>Spēlei būs arī veikals, kur spēlētājs varēs mainīt dažādus vizuālos elementus, piemēram, sava varoņa tēlu, ienaidniekus vai fonu. Man pašam šī ideja šķiet forša, jo ļauj spēlei kļūt daudz personiskākai un dod iespēju katram spēlētājam radīt savu versiju. Tas padara pieredzi interesantāku un sniedz papildus motivāciju atgriezties spēlē vēlreiz.</w:t>
+        <w:t>Spēlei būs arī veikals, kurā spēlētājs varēs mainīt vizuālos elementus, piemēram, varoņa tēlu, ienaidniekus vai fonu. Darba autors uzskata, ka šī ideja ļauj spēlei kļūt daudz personiskākai un dod iespēju katram spēlētājam radīt savu versiju. Tas padarīs pieredzi interesantāku un sniegs papildus motivāciju atgriezties spēlē vēlreiz.</w:t>
       </w:r>
     </w:p>
     <w:p>
@@ -2845,19 +2897,7 @@
         <w:rPr>
           <w:sz w:val="24"/>
         </w:rPr>
-        <w:t xml:space="preserve">Personīgā motivācija šim darbam </w:t>
-      </w:r>
-      <w:r>
-        <w:rPr>
-          <w:sz w:val="24"/>
-        </w:rPr>
-        <w:t xml:space="preserve">man </w:t>
-      </w:r>
-      <w:r>
-        <w:rPr>
-          <w:sz w:val="24"/>
-        </w:rPr>
-        <w:t xml:space="preserve">nāk no bērnības pieredzes ar </w:t>
+        <w:t xml:space="preserve">Personīgā motivācija šim darbam balstās uz bērnības pieredzi ar </w:t>
       </w:r>
       <w:proofErr w:type="spellStart"/>
       <w:r>
@@ -2871,7 +2911,7 @@
         <w:rPr>
           <w:sz w:val="24"/>
         </w:rPr>
-        <w:t xml:space="preserve"> spēlēm. Tās sniedza gan prieku, gan izaicinājumus, kas attīstīja stratēģisko domāšanu un reakciju. Šis projekts ir mēģinājums apvienot radošumu un tehniskās prasmes, radot spēli, kas varētu sniegt līdzīgu pieredzi nākamajām spēļu paaudzēm, vienlaikus atgādinot pieaugušajiem, kāda bija sajūta spēlēt šādas spēles viņu jaunībā.</w:t>
+        <w:t xml:space="preserve"> spēlēm. Tās sniedza gan prieku, gan izaicinājumus, attīstot stratēģisko domāšanu un reakciju. Projekts ir mēģinājums apvienot radošumu un tehniskās prasmes, radot spēli, kas varētu sniegt līdzīgu pieredzi nākamajām spēļu paaudzēm, vienlaikus atgādinot pieaugušajiem, kāda bija sajūta spēlēt šādas spēles viņu jaunībā.</w:t>
       </w:r>
     </w:p>
     <w:p>
@@ -2886,75 +2926,49 @@
         <w:rPr>
           <w:sz w:val="24"/>
         </w:rPr>
-        <w:t xml:space="preserve">Galvenais mērķis ir radīt </w:t>
+        <w:t>Galvenais mērķis ir radīt spēli, kas ir interesanta, dinamiska un potenciāli gatava publicēšanai digitālajos izplatīšanas kanālos kā, piemēram, “</w:t>
       </w:r>
       <w:proofErr w:type="spellStart"/>
       <w:r>
         <w:rPr>
           <w:sz w:val="24"/>
         </w:rPr>
-        <w:t>platformera</w:t>
+        <w:t>Steam</w:t>
       </w:r>
       <w:proofErr w:type="spellEnd"/>
       <w:r>
         <w:rPr>
           <w:sz w:val="24"/>
         </w:rPr>
-        <w:t xml:space="preserve"> spēli, kas ir interesanta, dinamiska un potenciāli gatava publicēšanai digitālajos izplatīšanas kanālos</w:t>
-      </w:r>
-      <w:r>
-        <w:rPr>
-          <w:sz w:val="24"/>
-        </w:rPr>
-        <w:t xml:space="preserve"> kā, piemēram, “</w:t>
+        <w:t>” vai “</w:t>
       </w:r>
       <w:proofErr w:type="spellStart"/>
       <w:r>
         <w:rPr>
           <w:sz w:val="24"/>
         </w:rPr>
-        <w:t>Steam</w:t>
+        <w:t>Epic</w:t>
       </w:r>
       <w:proofErr w:type="spellEnd"/>
       <w:r>
         <w:rPr>
           <w:sz w:val="24"/>
         </w:rPr>
-        <w:t>” vai “</w:t>
+        <w:t xml:space="preserve"> </w:t>
       </w:r>
       <w:proofErr w:type="spellStart"/>
       <w:r>
         <w:rPr>
           <w:sz w:val="24"/>
         </w:rPr>
-        <w:t>Epic</w:t>
+        <w:t>Games</w:t>
       </w:r>
       <w:proofErr w:type="spellEnd"/>
       <w:r>
         <w:rPr>
           <w:sz w:val="24"/>
         </w:rPr>
-        <w:t xml:space="preserve"> </w:t>
-      </w:r>
-      <w:proofErr w:type="spellStart"/>
-      <w:r>
-        <w:rPr>
-          <w:sz w:val="24"/>
-        </w:rPr>
-        <w:t>Games</w:t>
-      </w:r>
-      <w:proofErr w:type="spellEnd"/>
-      <w:r>
-        <w:rPr>
-          <w:sz w:val="24"/>
-        </w:rPr>
-        <w:t>”</w:t>
-      </w:r>
-      <w:r>
-        <w:rPr>
-          <w:sz w:val="24"/>
-        </w:rPr>
-        <w:t>. Projekts ļauj apvienot radošo darbu ar praktisko pieredzi līmeņu izstrādē, spēles mehāniku veidošanā un testēšanā, kā arī parāda autora spēju plānot un īstenot pilnvērtīgu spēļu projektu.</w:t>
+        <w:t>”. Projekts ļauj apvienot radošo darbu ar praktisko pieredzi līmeņu izstrādē, spēles mehāniku veidošanā un testēšanā, kā arī demonstrē autora spēju plānot un īstenot pilnvērtīgu spēļu projektu.</w:t>
       </w:r>
     </w:p>
     <w:p>
@@ -2969,23 +2983,8 @@
         <w:rPr>
           <w:sz w:val="24"/>
         </w:rPr>
-        <w:t>Kvalifikācijas darbā tiks detalizēti aprakstīti līmeņu dizains, spēles mehāniku izveide, vizuālā noformējuma izvēle un veikala funkcionalitātes realizācija. Tas ļaus parādīt, kā no idejas tiek radīta gatava un interesanta spēle, kas spēj piesaistīt dažādu vecumu spēlētājus.</w:t>
-      </w:r>
-    </w:p>
-    <w:p>
-      <w:pPr>
-        <w:rPr>
-          <w:sz w:val="24"/>
-        </w:rPr>
-      </w:pPr>
-    </w:p>
-    <w:p>
-      <w:pPr>
-        <w:jc w:val="center"/>
-        <w:rPr>
-          <w:sz w:val="24"/>
-        </w:rPr>
-      </w:pPr>
+        <w:t>Kvalifikācijas darbā tiks detalizēti aprakstīts līmeņu dizains, spēles mehāniku izveide, vizuālā noformējuma izvēle un veikala funkcionalitātes realizācija. Tas ļaus parādīt, kā no idejas tiek radīta gatava un interesanta spēle, kas spēj piesaistīt dažādu vecumu spēlētājus.</w:t>
+      </w:r>
     </w:p>
     <w:p>
       <w:pPr>
@@ -3000,74 +2999,36 @@
           <w:sz w:val="24"/>
         </w:rPr>
         <w:lastRenderedPageBreak/>
-        <w:t xml:space="preserve">Kopumā šis projekts apvieno radošumu, spēļu dizainu un tehnisko izpildi, radot 2D </w:t>
+        <w:t xml:space="preserve">Kopumā šis projekts apvieno radošumu, spēļu dizainu un tehnisko izpildi, radot 2D piedzīvojumu spēli, kas piedāvā aizraujošu un daudzveidīgu pieredzi spēlētājiem, vienlaikus attīstot autora prasmes un zināšanas. Projekta attīstības gaitā visas spēles versijas un uzlabojumi tiek glabāti </w:t>
       </w:r>
       <w:proofErr w:type="spellStart"/>
       <w:r>
         <w:rPr>
           <w:sz w:val="24"/>
         </w:rPr>
-        <w:t>platformera</w:t>
+        <w:t>GitHub</w:t>
       </w:r>
       <w:proofErr w:type="spellEnd"/>
       <w:r>
         <w:rPr>
           <w:sz w:val="24"/>
         </w:rPr>
-        <w:t xml:space="preserve"> spēli, kas piedāvā aizraujošu un daudzveidīgu pieredzi spēlētājiem, vienlaikus attīstot autora prasmes un zināšanas.</w:t>
-      </w:r>
-    </w:p>
-    <w:p>
-      <w:pPr>
-        <w:spacing w:after="0" w:line="360" w:lineRule="auto"/>
-        <w:ind w:left="0" w:right="0" w:firstLine="851"/>
-        <w:rPr>
-          <w:sz w:val="24"/>
-        </w:rPr>
-      </w:pPr>
-      <w:r>
-        <w:rPr>
-          <w:sz w:val="24"/>
-        </w:rPr>
-        <w:t xml:space="preserve">Projekta attīstības gaitā visas spēles versijas un uzlabojumi tiek glabāti </w:t>
-      </w:r>
-      <w:proofErr w:type="spellStart"/>
-      <w:r>
-        <w:rPr>
-          <w:sz w:val="24"/>
-        </w:rPr>
-        <w:t>GitHub</w:t>
-      </w:r>
-      <w:proofErr w:type="spellEnd"/>
-      <w:r>
-        <w:rPr>
-          <w:sz w:val="24"/>
-        </w:rPr>
-        <w:t xml:space="preserve"> repozitorijā</w:t>
-      </w:r>
-      <w:r>
-        <w:rPr>
-          <w:sz w:val="24"/>
-        </w:rPr>
-        <w:t>:</w:t>
-      </w:r>
-      <w:r>
-        <w:rPr>
-          <w:sz w:val="24"/>
-        </w:rPr>
-        <w:t xml:space="preserve"> </w:t>
-      </w:r>
-      <w:r>
-        <w:rPr>
-          <w:sz w:val="24"/>
-        </w:rPr>
-        <w:t>https://github.com/Deather2/GodotGame</w:t>
-      </w:r>
-      <w:r>
-        <w:rPr>
-          <w:sz w:val="24"/>
-        </w:rPr>
-        <w:t xml:space="preserve">. Tas ļauj sekot līdzi spēles progresam, salīdzināt dažādas versijas un viegli dalīties ar projektu. </w:t>
+        <w:t xml:space="preserve"> repozitorijā: </w:t>
+      </w:r>
+      <w:hyperlink r:id="rId9" w:tgtFrame="_new" w:history="1">
+        <w:r>
+          <w:rPr>
+            <w:rStyle w:val="a9"/>
+            <w:sz w:val="24"/>
+          </w:rPr>
+          <w:t>https://github.com/Deather2/GodotGame</w:t>
+        </w:r>
+      </w:hyperlink>
+      <w:r>
+        <w:rPr>
+          <w:sz w:val="24"/>
+        </w:rPr>
+        <w:t>. Tas ļauj sekot līdzi spēles progresam, salīdzināt dažādas versijas un viegli dalīties ar projektu.</w:t>
       </w:r>
     </w:p>
     <w:p>
@@ -3087,17 +3048,9 @@
     <w:p>
       <w:pPr>
         <w:pStyle w:val="1"/>
-        <w:spacing w:after="240" w:line="240" w:lineRule="auto"/>
-        <w:ind w:left="431" w:right="11" w:hanging="431"/>
-        <w:rPr>
-          <w:lang w:val="lv-LV"/>
-        </w:rPr>
       </w:pPr>
       <w:bookmarkStart w:id="1" w:name="_Toc212298882"/>
       <w:r>
-        <w:rPr>
-          <w:lang w:val="lv-LV"/>
-        </w:rPr>
         <w:lastRenderedPageBreak/>
         <w:t>Uzdevuma formulējums</w:t>
       </w:r>
@@ -3108,58 +3061,28 @@
         <w:spacing w:after="0" w:line="360" w:lineRule="auto"/>
         <w:ind w:left="0" w:right="0" w:firstLine="851"/>
         <w:rPr>
-          <w:color w:val="auto"/>
-          <w:kern w:val="0"/>
-          <w:sz w:val="24"/>
-          <w14:ligatures w14:val="none"/>
-        </w:rPr>
-      </w:pPr>
-      <w:r>
-        <w:rPr>
-          <w:color w:val="auto"/>
-          <w:kern w:val="0"/>
-          <w:sz w:val="24"/>
-          <w14:ligatures w14:val="none"/>
+          <w:sz w:val="24"/>
+        </w:rPr>
+      </w:pPr>
+      <w:r>
+        <w:rPr>
+          <w:sz w:val="24"/>
         </w:rPr>
         <w:t xml:space="preserve">Lai izstrādātu kvalifikācijas darba ietvaros paredzēto 2D </w:t>
       </w:r>
       <w:proofErr w:type="spellStart"/>
       <w:r>
         <w:rPr>
-          <w:color w:val="auto"/>
-          <w:kern w:val="0"/>
-          <w:sz w:val="24"/>
-          <w14:ligatures w14:val="none"/>
+          <w:sz w:val="24"/>
         </w:rPr>
         <w:t>platformera</w:t>
       </w:r>
       <w:proofErr w:type="spellEnd"/>
       <w:r>
         <w:rPr>
-          <w:color w:val="auto"/>
-          <w:kern w:val="0"/>
-          <w:sz w:val="24"/>
-          <w14:ligatures w14:val="none"/>
-        </w:rPr>
-        <w:t xml:space="preserve"> spēli, ir nepieciešams noteikt konkrētus uzdevumus, kas nodrošina pilnvērtīgu projekta izveidi </w:t>
-      </w:r>
-      <w:r>
-        <w:rPr>
-          <w:color w:val="auto"/>
-          <w:kern w:val="0"/>
-          <w:sz w:val="24"/>
-          <w14:ligatures w14:val="none"/>
-        </w:rPr>
-        <w:t>-</w:t>
-      </w:r>
-      <w:r>
-        <w:rPr>
-          <w:color w:val="auto"/>
-          <w:kern w:val="0"/>
-          <w:sz w:val="24"/>
-          <w14:ligatures w14:val="none"/>
-        </w:rPr>
-        <w:t xml:space="preserve"> no idejas izstrādes līdz gatavam produktam. Uzdevuma formulējums palīdz sadalīt darbu vairākos posmos, plānot laiku un noteikt galvenos mērķus, kas jāīsteno spēles izstrādes procesā.</w:t>
+          <w:sz w:val="24"/>
+        </w:rPr>
+        <w:t xml:space="preserve"> spēli, ir nepieciešams noteikt konkrētus uzdevumus, kas nodrošina pilnvērtīgu projekta izveidi — no idejas izstrādes līdz gatavam produktam. Uzdevuma formulējums palīdz sadalīt darbu vairākos posmos, plānot laiku un noteikt galvenos mērķus, kas jāīsteno spēles izstrādes procesā.</w:t>
       </w:r>
     </w:p>
     <w:p>
@@ -3167,398 +3090,283 @@
         <w:spacing w:after="0" w:line="360" w:lineRule="auto"/>
         <w:ind w:left="0" w:right="0" w:firstLine="851"/>
         <w:rPr>
-          <w:color w:val="auto"/>
-          <w:kern w:val="0"/>
-          <w:sz w:val="24"/>
-          <w14:ligatures w14:val="none"/>
-        </w:rPr>
-      </w:pPr>
-      <w:r>
-        <w:rPr>
-          <w:color w:val="auto"/>
-          <w:kern w:val="0"/>
-          <w:sz w:val="24"/>
-          <w14:ligatures w14:val="none"/>
+          <w:sz w:val="24"/>
+        </w:rPr>
+      </w:pPr>
+      <w:r>
+        <w:rPr>
+          <w:sz w:val="24"/>
         </w:rPr>
         <w:t xml:space="preserve">Galvenais šī darba uzdevums ir izstrādāt funkcionējošu 2D </w:t>
       </w:r>
       <w:proofErr w:type="spellStart"/>
       <w:r>
         <w:rPr>
-          <w:color w:val="auto"/>
-          <w:kern w:val="0"/>
-          <w:sz w:val="24"/>
-          <w14:ligatures w14:val="none"/>
+          <w:sz w:val="24"/>
         </w:rPr>
         <w:t>platformera</w:t>
       </w:r>
       <w:proofErr w:type="spellEnd"/>
       <w:r>
         <w:rPr>
-          <w:color w:val="auto"/>
-          <w:kern w:val="0"/>
-          <w:sz w:val="24"/>
-          <w14:ligatures w14:val="none"/>
-        </w:rPr>
-        <w:t xml:space="preserve"> spēli ar vairākiem līmeņiem un pakāpeniski pieaugošu sarežģītību. Spēlei jābūt tehniski stabilai, vizuāli pievilcīgai un interesantai plašākai auditorijai. Lai sasniegtu šo mērķi, ir izvirzīti vairāki konkrēti uzdevumi.</w:t>
-      </w:r>
-    </w:p>
-    <w:p>
-      <w:pPr>
-        <w:pStyle w:val="a3"/>
+          <w:sz w:val="24"/>
+        </w:rPr>
+        <w:t xml:space="preserve"> spēli ar vairākiem līmeņiem un pakāpeniski pieaugošu sarežģītību. Spēlei jābūt tehniski stabilai, vizuāli pievilcīgai un interesantai plašākai auditorijai. Lai sasniegtu šo mērķi, ir izvirzīti vairāki konkrēti uzdevumi:</w:t>
+      </w:r>
+    </w:p>
+    <w:p>
+      <w:pPr>
         <w:numPr>
           <w:ilvl w:val="0"/>
-          <w:numId w:val="20"/>
+          <w:numId w:val="21"/>
         </w:numPr>
         <w:spacing w:after="0" w:line="360" w:lineRule="auto"/>
-        <w:ind w:left="0" w:right="0" w:firstLine="851"/>
+        <w:ind w:left="1135" w:right="0" w:hanging="284"/>
         <w:rPr>
           <w:b/>
           <w:bCs/>
-          <w:color w:val="auto"/>
-          <w:kern w:val="0"/>
-          <w:sz w:val="24"/>
-          <w14:ligatures w14:val="none"/>
+          <w:sz w:val="24"/>
         </w:rPr>
       </w:pPr>
       <w:r>
         <w:rPr>
           <w:b/>
           <w:bCs/>
-          <w:color w:val="auto"/>
-          <w:kern w:val="0"/>
-          <w:sz w:val="24"/>
-          <w14:ligatures w14:val="none"/>
+          <w:sz w:val="24"/>
         </w:rPr>
         <w:t>Idejas un koncepcijas izstrāde.</w:t>
       </w:r>
     </w:p>
     <w:p>
       <w:pPr>
-        <w:pStyle w:val="a3"/>
         <w:spacing w:after="0" w:line="360" w:lineRule="auto"/>
         <w:ind w:left="0" w:right="0" w:firstLine="851"/>
         <w:rPr>
-          <w:color w:val="auto"/>
-          <w:kern w:val="0"/>
-          <w:sz w:val="24"/>
-          <w14:ligatures w14:val="none"/>
-        </w:rPr>
-      </w:pPr>
-      <w:r>
-        <w:rPr>
-          <w:color w:val="auto"/>
-          <w:kern w:val="0"/>
-          <w:sz w:val="24"/>
-          <w14:ligatures w14:val="none"/>
-        </w:rPr>
-        <w:t>Šajā posmā tiek precizēta spēles ideja, tās stils, mērķauditorija un galvenās spēles mehānikas. Ir jāizlemj, kāda būs spēles vide, sižets un varoņu raksturojums. Tiek veikta līdzīgu spēļu analīze, lai saprastu, kādi elementi padara šāda tipa spēles aizraujošas un kā tos iespējams pilnveidot.</w:t>
-      </w:r>
-    </w:p>
-    <w:p>
-      <w:pPr>
-        <w:pStyle w:val="a3"/>
+          <w:sz w:val="24"/>
+        </w:rPr>
+      </w:pPr>
+      <w:r>
+        <w:rPr>
+          <w:sz w:val="24"/>
+        </w:rPr>
+        <w:t>Šajā posmā tiek precizēta spēles ideja, tās stils, mērķauditorija un galvenās spēles mehānikas. Autors nosaka spēles vidi, sižetu un varoņu raksturojumu. Tiek veikta līdzīgu spēļu analīze, lai saprastu, kādi elementi padara šāda tipa spēles aizraujošas un kā tos iespējams pilnveidot.</w:t>
+      </w:r>
+    </w:p>
+    <w:p>
+      <w:pPr>
         <w:numPr>
           <w:ilvl w:val="0"/>
-          <w:numId w:val="20"/>
+          <w:numId w:val="21"/>
         </w:numPr>
         <w:spacing w:after="0" w:line="360" w:lineRule="auto"/>
-        <w:ind w:left="0" w:right="0" w:firstLine="851"/>
+        <w:ind w:left="1135" w:right="0" w:hanging="284"/>
         <w:rPr>
           <w:b/>
           <w:bCs/>
-          <w:color w:val="auto"/>
-          <w:kern w:val="0"/>
-          <w:sz w:val="24"/>
-          <w14:ligatures w14:val="none"/>
+          <w:sz w:val="24"/>
         </w:rPr>
       </w:pPr>
       <w:r>
         <w:rPr>
           <w:b/>
           <w:bCs/>
-          <w:color w:val="auto"/>
-          <w:kern w:val="0"/>
-          <w:sz w:val="24"/>
-          <w14:ligatures w14:val="none"/>
+          <w:sz w:val="24"/>
         </w:rPr>
         <w:t>Līmeņu un mehāniku plānošana.</w:t>
       </w:r>
     </w:p>
     <w:p>
       <w:pPr>
-        <w:pStyle w:val="a3"/>
         <w:spacing w:after="0" w:line="360" w:lineRule="auto"/>
         <w:ind w:left="0" w:right="0" w:firstLine="851"/>
         <w:rPr>
-          <w:color w:val="auto"/>
-          <w:kern w:val="0"/>
-          <w:sz w:val="24"/>
-          <w14:ligatures w14:val="none"/>
-        </w:rPr>
-      </w:pPr>
-      <w:r>
-        <w:rPr>
-          <w:color w:val="auto"/>
-          <w:kern w:val="0"/>
-          <w:sz w:val="24"/>
-          <w14:ligatures w14:val="none"/>
-        </w:rPr>
-        <w:t>Jāizveido līmeņu struktūra, nosakot to skaitu, sarežģītību un vizuālo stilu. Katram līmenim jābūt ar savu izaicinājumu un jaunu mehānisku elementu, kas pakāpeniski paplašina spēlētāja pieredzi. Šajā posmā tiek izstrādāti skices, shēmas vai apraksti, kas palīdz strukturēt spēles gaitu.</w:t>
-      </w:r>
-    </w:p>
-    <w:p>
-      <w:pPr>
-        <w:pStyle w:val="a3"/>
+          <w:sz w:val="24"/>
+        </w:rPr>
+      </w:pPr>
+      <w:r>
+        <w:rPr>
+          <w:sz w:val="24"/>
+        </w:rPr>
+        <w:t>Autors izveido līmeņu struktūru, nosakot to skaitu, sarežģītību un vizuālo stilu. Katram līmenim jābūt ar savu izaicinājumu un jaunu mehānisku elementu, kas pakāpeniski paplašina spēlētāja pieredzi. Šajā posmā tiek izstrādātas skices, shēmas vai apraksti, kas palīdz strukturēt spēles gaitu.</w:t>
+      </w:r>
+    </w:p>
+    <w:p>
+      <w:pPr>
         <w:numPr>
           <w:ilvl w:val="0"/>
-          <w:numId w:val="20"/>
+          <w:numId w:val="21"/>
         </w:numPr>
         <w:spacing w:after="0" w:line="360" w:lineRule="auto"/>
-        <w:ind w:left="0" w:right="0" w:firstLine="851"/>
+        <w:ind w:left="1135" w:right="0" w:hanging="284"/>
         <w:rPr>
           <w:b/>
           <w:bCs/>
-          <w:color w:val="auto"/>
-          <w:kern w:val="0"/>
-          <w:sz w:val="24"/>
-          <w14:ligatures w14:val="none"/>
+          <w:sz w:val="24"/>
         </w:rPr>
       </w:pPr>
       <w:r>
         <w:rPr>
           <w:b/>
           <w:bCs/>
-          <w:color w:val="auto"/>
-          <w:kern w:val="0"/>
-          <w:sz w:val="24"/>
-          <w14:ligatures w14:val="none"/>
+          <w:sz w:val="24"/>
         </w:rPr>
         <w:t>Spēles vides un objektu izveide.</w:t>
       </w:r>
     </w:p>
     <w:p>
       <w:pPr>
-        <w:pStyle w:val="a3"/>
         <w:spacing w:after="0" w:line="360" w:lineRule="auto"/>
         <w:ind w:left="0" w:right="0" w:firstLine="851"/>
         <w:rPr>
-          <w:color w:val="auto"/>
-          <w:kern w:val="0"/>
-          <w:sz w:val="24"/>
-          <w14:ligatures w14:val="none"/>
-        </w:rPr>
-      </w:pPr>
-      <w:r>
-        <w:rPr>
-          <w:color w:val="auto"/>
-          <w:kern w:val="0"/>
-          <w:sz w:val="24"/>
-          <w14:ligatures w14:val="none"/>
-        </w:rPr>
-        <w:t xml:space="preserve">Jāizstrādā spēles vizuālie elementi </w:t>
-      </w:r>
-      <w:r>
-        <w:rPr>
-          <w:color w:val="auto"/>
-          <w:kern w:val="0"/>
-          <w:sz w:val="24"/>
-          <w14:ligatures w14:val="none"/>
-        </w:rPr>
-        <w:t>kā</w:t>
-      </w:r>
-      <w:r>
-        <w:rPr>
-          <w:color w:val="auto"/>
-          <w:kern w:val="0"/>
-          <w:sz w:val="24"/>
-          <w14:ligatures w14:val="none"/>
-        </w:rPr>
-        <w:t xml:space="preserve"> foni, platformas, ienaidnieki, varoņi un interaktīvie objekti. Īpaša uzmanība jāpievērš vizuālajai saskaņotībai un estētikai, lai spēlei būtu patīkams un saprotams dizains.</w:t>
-      </w:r>
-    </w:p>
-    <w:p>
-      <w:pPr>
-        <w:pStyle w:val="a3"/>
+          <w:sz w:val="24"/>
+        </w:rPr>
+      </w:pPr>
+      <w:r>
+        <w:rPr>
+          <w:sz w:val="24"/>
+        </w:rPr>
+        <w:t>A</w:t>
+      </w:r>
+      <w:r>
+        <w:rPr>
+          <w:sz w:val="24"/>
+        </w:rPr>
+        <w:t>utors izstrādā spēles vizuālos elementus kā foni, platformas, ienaidniekus, varoņus un interaktīvos objektus. Īpaša uzmanība tiek pievērsta vizuālajai saskaņotībai un estētikai, lai spēlei būtu patīkams un saprotams dizains.</w:t>
+      </w:r>
+    </w:p>
+    <w:p>
+      <w:pPr>
         <w:numPr>
           <w:ilvl w:val="0"/>
-          <w:numId w:val="20"/>
+          <w:numId w:val="21"/>
         </w:numPr>
         <w:spacing w:after="0" w:line="360" w:lineRule="auto"/>
-        <w:ind w:left="0" w:right="0" w:firstLine="851"/>
+        <w:ind w:left="1135" w:right="0" w:hanging="284"/>
         <w:rPr>
           <w:b/>
           <w:bCs/>
-          <w:color w:val="auto"/>
-          <w:kern w:val="0"/>
-          <w:sz w:val="24"/>
-          <w14:ligatures w14:val="none"/>
+          <w:sz w:val="24"/>
         </w:rPr>
       </w:pPr>
       <w:r>
         <w:rPr>
           <w:b/>
           <w:bCs/>
-          <w:color w:val="auto"/>
-          <w:kern w:val="0"/>
-          <w:sz w:val="24"/>
-          <w14:ligatures w14:val="none"/>
+          <w:sz w:val="24"/>
         </w:rPr>
         <w:t>Spēles loģikas un mehāniku programmēšana.</w:t>
       </w:r>
     </w:p>
     <w:p>
       <w:pPr>
-        <w:pStyle w:val="a3"/>
         <w:spacing w:after="0" w:line="360" w:lineRule="auto"/>
         <w:ind w:left="0" w:right="0" w:firstLine="851"/>
         <w:rPr>
-          <w:color w:val="auto"/>
-          <w:kern w:val="0"/>
-          <w:sz w:val="24"/>
-          <w14:ligatures w14:val="none"/>
-        </w:rPr>
-      </w:pPr>
-      <w:r>
-        <w:rPr>
-          <w:color w:val="auto"/>
-          <w:kern w:val="0"/>
-          <w:sz w:val="24"/>
-          <w14:ligatures w14:val="none"/>
-        </w:rPr>
-        <w:t>Šajā posmā tiek īstenota varoņa kustība, ienaidnieku uzvedība, sadursmju noteikšana un citu spēles mehānismu darbība. Ir jānodrošina, lai spēle darbotos vienmērīgi, bez kļūdām un ar atbilstošu reakciju uz spēlētāja darbībām.</w:t>
-      </w:r>
-    </w:p>
-    <w:p>
-      <w:pPr>
-        <w:pStyle w:val="a3"/>
+          <w:sz w:val="24"/>
+        </w:rPr>
+      </w:pPr>
+      <w:r>
+        <w:rPr>
+          <w:sz w:val="24"/>
+        </w:rPr>
+        <w:t>Šajā posmā autors īsteno varoņa kustību, ienaidnieku uzvedību, sadursmju noteikšanu un citu spēles mehānismu darbību. Tiek nodrošināts, lai spēle darbotos vienmērīgi, bez kļūdām un ar atbilstošu reakciju uz spēlētāja darbībām.</w:t>
+      </w:r>
+    </w:p>
+    <w:p>
+      <w:pPr>
         <w:numPr>
           <w:ilvl w:val="0"/>
-          <w:numId w:val="20"/>
+          <w:numId w:val="21"/>
         </w:numPr>
         <w:spacing w:after="0" w:line="360" w:lineRule="auto"/>
-        <w:ind w:left="0" w:right="0" w:firstLine="851"/>
+        <w:ind w:left="1135" w:right="0" w:hanging="284"/>
         <w:rPr>
           <w:b/>
           <w:bCs/>
-          <w:color w:val="auto"/>
-          <w:kern w:val="0"/>
-          <w:sz w:val="24"/>
-          <w14:ligatures w14:val="none"/>
+          <w:sz w:val="24"/>
         </w:rPr>
       </w:pPr>
       <w:r>
         <w:rPr>
           <w:b/>
           <w:bCs/>
-          <w:color w:val="auto"/>
-          <w:kern w:val="0"/>
-          <w:sz w:val="24"/>
-          <w14:ligatures w14:val="none"/>
+          <w:sz w:val="24"/>
         </w:rPr>
         <w:t>Veikala un pielāgojamu elementu ieviešana.</w:t>
       </w:r>
     </w:p>
     <w:p>
       <w:pPr>
-        <w:pStyle w:val="a3"/>
         <w:spacing w:after="0" w:line="360" w:lineRule="auto"/>
         <w:ind w:left="0" w:right="0" w:firstLine="851"/>
         <w:rPr>
-          <w:color w:val="auto"/>
-          <w:kern w:val="0"/>
-          <w:sz w:val="24"/>
-          <w14:ligatures w14:val="none"/>
-        </w:rPr>
-      </w:pPr>
-      <w:r>
-        <w:rPr>
-          <w:color w:val="auto"/>
-          <w:kern w:val="0"/>
-          <w:sz w:val="24"/>
-          <w14:ligatures w14:val="none"/>
-        </w:rPr>
-        <w:t>Viens no nozīmīgākajiem uzdevumiem ir veikala funkcionalitātes izstrāde. Tajā spēlētājs varēs mainīt dažādus vizuālos elementus, piemēram, varoņa izskatu vai fona dizainu. Tas prasa gan tehnisko risinājumu, gan vizuālo pielāgojumu plānošanu.</w:t>
-      </w:r>
-    </w:p>
-    <w:p>
-      <w:pPr>
-        <w:pStyle w:val="a3"/>
+          <w:sz w:val="24"/>
+        </w:rPr>
+      </w:pPr>
+      <w:r>
+        <w:rPr>
+          <w:sz w:val="24"/>
+        </w:rPr>
+        <w:t>Viens no nozīmīgākajiem uzdevumiem ir veikala funkcionalitātes izstrāde. Tajā spēlētājs var mainīt dažādus vizuālos elementus, piemēram, varoņa izskatu vai fona dizainu. Tas prasa gan tehnisko risinājumu, gan vizuālo pielāgojumu plānošanu.</w:t>
+      </w:r>
+    </w:p>
+    <w:p>
+      <w:pPr>
         <w:numPr>
           <w:ilvl w:val="0"/>
-          <w:numId w:val="20"/>
+          <w:numId w:val="21"/>
         </w:numPr>
         <w:spacing w:after="0" w:line="360" w:lineRule="auto"/>
-        <w:ind w:left="0" w:right="0" w:firstLine="851"/>
+        <w:ind w:left="1135" w:right="0" w:hanging="284"/>
         <w:rPr>
           <w:b/>
           <w:bCs/>
-          <w:color w:val="auto"/>
-          <w:kern w:val="0"/>
-          <w:sz w:val="24"/>
-          <w14:ligatures w14:val="none"/>
+          <w:sz w:val="24"/>
         </w:rPr>
       </w:pPr>
       <w:r>
         <w:rPr>
           <w:b/>
           <w:bCs/>
-          <w:color w:val="auto"/>
-          <w:kern w:val="0"/>
-          <w:sz w:val="24"/>
-          <w14:ligatures w14:val="none"/>
+          <w:sz w:val="24"/>
         </w:rPr>
         <w:t>Testēšana un kļūdu labošana.</w:t>
       </w:r>
     </w:p>
     <w:p>
       <w:pPr>
-        <w:pStyle w:val="a3"/>
         <w:spacing w:after="0" w:line="360" w:lineRule="auto"/>
         <w:ind w:left="0" w:right="0" w:firstLine="851"/>
         <w:rPr>
-          <w:color w:val="auto"/>
-          <w:kern w:val="0"/>
-          <w:sz w:val="24"/>
-          <w14:ligatures w14:val="none"/>
-        </w:rPr>
-      </w:pPr>
-      <w:r>
-        <w:rPr>
-          <w:color w:val="auto"/>
-          <w:kern w:val="0"/>
-          <w:sz w:val="24"/>
-          <w14:ligatures w14:val="none"/>
-        </w:rPr>
-        <w:t>Kad spēles galvenā funkcionalitāte ir pabeigta, jāveic testēšana, lai pārliecinātos par stabilitāti un lietošanas ērtumu. Tiek pārbaudītas visas mehānikas, pārejas starp līmeņiem un veikala darbība. Ja tiek atklātas kļūdas, tās jānovērš, pirms spēle tiek uzskatīta par pabeigtu.</w:t>
-      </w:r>
-    </w:p>
-    <w:p>
-      <w:pPr>
-        <w:pStyle w:val="a3"/>
+          <w:sz w:val="24"/>
+        </w:rPr>
+      </w:pPr>
+      <w:r>
+        <w:rPr>
+          <w:sz w:val="24"/>
+        </w:rPr>
+        <w:t>Kad spēles galvenā funkcionalitāte ir pabeigta, autors veic testēšanu, lai pārliecinātos par stabilitāti un lietošanas ērtumu. Tiek pārbaudītas visas mehānikas, pārejas starp līmeņiem un veikala darbība. Ja tiek atklātas kļūdas, tās tiek novērstas pirms spēles uzskatīšanas par pabeigtu.</w:t>
+      </w:r>
+    </w:p>
+    <w:p>
+      <w:pPr>
         <w:numPr>
           <w:ilvl w:val="0"/>
-          <w:numId w:val="20"/>
+          <w:numId w:val="21"/>
         </w:numPr>
         <w:spacing w:after="0" w:line="360" w:lineRule="auto"/>
-        <w:ind w:left="0" w:right="0" w:firstLine="851"/>
+        <w:ind w:left="1135" w:right="0" w:hanging="284"/>
         <w:rPr>
           <w:b/>
           <w:bCs/>
-          <w:color w:val="auto"/>
-          <w:kern w:val="0"/>
-          <w:sz w:val="24"/>
-          <w14:ligatures w14:val="none"/>
+          <w:sz w:val="24"/>
         </w:rPr>
       </w:pPr>
       <w:r>
         <w:rPr>
           <w:b/>
           <w:bCs/>
-          <w:color w:val="auto"/>
-          <w:kern w:val="0"/>
-          <w:sz w:val="24"/>
-          <w14:ligatures w14:val="none"/>
+          <w:sz w:val="24"/>
         </w:rPr>
         <w:lastRenderedPageBreak/>
         <w:t>Dokumentācijas sagatavošana.</w:t>
@@ -3566,81 +3374,45 @@
     </w:p>
     <w:p>
       <w:pPr>
-        <w:pStyle w:val="a3"/>
         <w:spacing w:after="0" w:line="360" w:lineRule="auto"/>
         <w:ind w:left="0" w:right="0" w:firstLine="851"/>
         <w:rPr>
-          <w:color w:val="auto"/>
-          <w:kern w:val="0"/>
-          <w:sz w:val="24"/>
-          <w14:ligatures w14:val="none"/>
-        </w:rPr>
-      </w:pPr>
-      <w:r>
-        <w:rPr>
-          <w:color w:val="auto"/>
-          <w:kern w:val="0"/>
-          <w:sz w:val="24"/>
-          <w14:ligatures w14:val="none"/>
-        </w:rPr>
-        <w:t>Pēdējais uzdevums ir sagatavot detalizētu dokumentāciju par spēles izstrādes procesu, tehniskajiem risinājumiem un iegūtajiem rezultātiem. Tas ļauj skaidri parādīt, kā tika plānota un realizēta katra projekta daļa.</w:t>
+          <w:sz w:val="24"/>
+          <w:lang w:val="ru-RU"/>
+        </w:rPr>
+      </w:pPr>
+      <w:r>
+        <w:rPr>
+          <w:sz w:val="24"/>
+        </w:rPr>
+        <w:t>Šo uzdevumu autors veic paralēli visiem pārējiem, sagatavojot detalizētu dokumentāciju par spēles izstrādes procesu, tehniskajiem risinājumiem un iegūtajiem rezultātiem. Tas ļauj skaidri parādīt, kā tiek plānota un realizēta katra projekta daļa.</w:t>
       </w:r>
     </w:p>
     <w:p>
       <w:pPr>
         <w:spacing w:after="0" w:line="360" w:lineRule="auto"/>
-        <w:ind w:right="0" w:firstLine="851"/>
-        <w:rPr>
-          <w:color w:val="auto"/>
-          <w:kern w:val="0"/>
-          <w:sz w:val="24"/>
-          <w14:ligatures w14:val="none"/>
-        </w:rPr>
-      </w:pPr>
-      <w:r>
-        <w:rPr>
-          <w:color w:val="auto"/>
-          <w:kern w:val="0"/>
-          <w:sz w:val="24"/>
-          <w14:ligatures w14:val="none"/>
-        </w:rPr>
-        <w:t xml:space="preserve">Veicot visus šos uzdevumus, tiks sasniegts kvalifikācijas darba mērķis </w:t>
-      </w:r>
-      <w:r>
-        <w:rPr>
-          <w:color w:val="auto"/>
-          <w:kern w:val="0"/>
-          <w:sz w:val="24"/>
-          <w14:ligatures w14:val="none"/>
-        </w:rPr>
-        <w:t>-</w:t>
-      </w:r>
-      <w:r>
-        <w:rPr>
-          <w:color w:val="auto"/>
-          <w:kern w:val="0"/>
-          <w:sz w:val="24"/>
-          <w14:ligatures w14:val="none"/>
-        </w:rPr>
-        <w:t xml:space="preserve"> radīt pilnvērtīgu un interesantu 2D </w:t>
+        <w:ind w:left="0" w:right="0" w:firstLine="851"/>
+        <w:rPr>
+          <w:sz w:val="24"/>
+        </w:rPr>
+      </w:pPr>
+      <w:r>
+        <w:rPr>
+          <w:sz w:val="24"/>
+        </w:rPr>
+        <w:t xml:space="preserve">Veicot visus šos uzdevumus, tiek sasniegts kvalifikācijas darba mērķis — radīt pilnvērtīgu un interesantu 2D </w:t>
       </w:r>
       <w:proofErr w:type="spellStart"/>
       <w:r>
         <w:rPr>
-          <w:color w:val="auto"/>
-          <w:kern w:val="0"/>
-          <w:sz w:val="24"/>
-          <w14:ligatures w14:val="none"/>
+          <w:sz w:val="24"/>
         </w:rPr>
         <w:t>platformera</w:t>
       </w:r>
       <w:proofErr w:type="spellEnd"/>
       <w:r>
         <w:rPr>
-          <w:color w:val="auto"/>
-          <w:kern w:val="0"/>
-          <w:sz w:val="24"/>
-          <w14:ligatures w14:val="none"/>
+          <w:sz w:val="24"/>
         </w:rPr>
         <w:t xml:space="preserve"> spēli, kas apvieno radošumu un tehnisko izpildījumu, demonstrējot autora spējas gan dizaina, gan programmēšanas jomā.</w:t>
       </w:r>
@@ -3662,14 +3434,9 @@
     <w:p>
       <w:pPr>
         <w:pStyle w:val="1"/>
-        <w:spacing w:after="240" w:line="240" w:lineRule="auto"/>
-        <w:ind w:left="431" w:right="11" w:hanging="431"/>
       </w:pPr>
       <w:bookmarkStart w:id="2" w:name="_Toc212298883"/>
       <w:r>
-        <w:rPr>
-          <w:lang w:val="lv-LV"/>
-        </w:rPr>
         <w:lastRenderedPageBreak/>
         <w:t>Programmatūras prasību specifikācija</w:t>
       </w:r>
@@ -3693,18 +3460,9 @@
     <w:p>
       <w:pPr>
         <w:pStyle w:val="2"/>
-        <w:spacing w:before="240" w:after="240" w:line="240" w:lineRule="auto"/>
-        <w:ind w:left="11" w:right="11" w:hanging="11"/>
-        <w:rPr>
-          <w:sz w:val="24"/>
-        </w:rPr>
       </w:pPr>
       <w:bookmarkStart w:id="3" w:name="_Toc212298884"/>
       <w:r>
-        <w:rPr>
-          <w:sz w:val="24"/>
-          <w:lang w:val="lv-LV"/>
-        </w:rPr>
         <w:t>Produkta perspektīva</w:t>
       </w:r>
       <w:bookmarkEnd w:id="3"/>
@@ -3769,19 +3527,9 @@
     <w:p>
       <w:pPr>
         <w:pStyle w:val="2"/>
-        <w:spacing w:before="240" w:after="240" w:line="240" w:lineRule="auto"/>
-        <w:ind w:left="11" w:right="11" w:hanging="11"/>
-        <w:rPr>
-          <w:sz w:val="24"/>
-          <w:lang w:val="lv-LV"/>
-        </w:rPr>
       </w:pPr>
       <w:bookmarkStart w:id="4" w:name="_Toc212298885"/>
       <w:r>
-        <w:rPr>
-          <w:sz w:val="24"/>
-          <w:lang w:val="lv-LV"/>
-        </w:rPr>
         <w:t>Sistēmas funkcionālās prasības</w:t>
       </w:r>
       <w:bookmarkEnd w:id="4"/>
@@ -3789,19 +3537,9 @@
     <w:p>
       <w:pPr>
         <w:pStyle w:val="2"/>
-        <w:spacing w:before="240" w:after="240" w:line="240" w:lineRule="auto"/>
-        <w:ind w:left="11" w:right="11" w:hanging="11"/>
-        <w:rPr>
-          <w:sz w:val="24"/>
-          <w:lang w:val="lv-LV"/>
-        </w:rPr>
       </w:pPr>
       <w:bookmarkStart w:id="5" w:name="_Toc212298886"/>
       <w:r>
-        <w:rPr>
-          <w:sz w:val="24"/>
-          <w:lang w:val="lv-LV"/>
-        </w:rPr>
         <w:t>Sistēmas nefunkcionālās prasības</w:t>
       </w:r>
       <w:bookmarkEnd w:id="5"/>
@@ -3809,19 +3547,9 @@
     <w:p>
       <w:pPr>
         <w:pStyle w:val="2"/>
-        <w:spacing w:before="240" w:after="240" w:line="240" w:lineRule="auto"/>
-        <w:ind w:left="11" w:right="11" w:hanging="11"/>
-        <w:rPr>
-          <w:sz w:val="24"/>
-          <w:lang w:val="lv-LV"/>
-        </w:rPr>
       </w:pPr>
       <w:bookmarkStart w:id="6" w:name="_Toc212298887"/>
       <w:r>
-        <w:rPr>
-          <w:sz w:val="24"/>
-          <w:lang w:val="lv-LV"/>
-        </w:rPr>
         <w:t>Gala lietotāja raksturiezīmes</w:t>
       </w:r>
       <w:bookmarkEnd w:id="6"/>
@@ -3843,17 +3571,9 @@
     <w:p>
       <w:pPr>
         <w:pStyle w:val="1"/>
-        <w:spacing w:after="240" w:line="240" w:lineRule="auto"/>
-        <w:ind w:left="431" w:right="11" w:hanging="431"/>
-        <w:rPr>
-          <w:lang w:val="lv-LV"/>
-        </w:rPr>
       </w:pPr>
       <w:bookmarkStart w:id="7" w:name="_Toc212298888"/>
       <w:r>
-        <w:rPr>
-          <w:lang w:val="lv-LV"/>
-        </w:rPr>
         <w:lastRenderedPageBreak/>
         <w:t>Izstrādes līdzekļu, rīku apraksts un izvēles pamatojums</w:t>
       </w:r>
@@ -3862,19 +3582,9 @@
     <w:p>
       <w:pPr>
         <w:pStyle w:val="2"/>
-        <w:spacing w:before="240" w:after="240" w:line="240" w:lineRule="auto"/>
-        <w:ind w:left="11" w:right="11" w:hanging="11"/>
-        <w:rPr>
-          <w:sz w:val="24"/>
-          <w:lang w:val="lv-LV"/>
-        </w:rPr>
       </w:pPr>
       <w:bookmarkStart w:id="8" w:name="_Toc212298889"/>
       <w:r>
-        <w:rPr>
-          <w:sz w:val="24"/>
-          <w:lang w:val="lv-LV"/>
-        </w:rPr>
         <w:t>Izvēlēto risinājuma līdzekļu un valodu apraksts</w:t>
       </w:r>
       <w:bookmarkEnd w:id="8"/>
@@ -3882,42 +3592,22 @@
     <w:p>
       <w:pPr>
         <w:pStyle w:val="2"/>
-        <w:spacing w:before="240" w:after="240" w:line="240" w:lineRule="auto"/>
-        <w:ind w:left="11" w:right="11" w:hanging="11"/>
-        <w:rPr>
-          <w:sz w:val="24"/>
-          <w:lang w:val="lv-LV"/>
-        </w:rPr>
       </w:pPr>
       <w:bookmarkStart w:id="9" w:name="_Toc212298890"/>
       <w:r>
-        <w:rPr>
-          <w:sz w:val="24"/>
-          <w:lang w:val="lv-LV"/>
-        </w:rPr>
         <w:t xml:space="preserve">Iespējamo </w:t>
       </w:r>
       <w:r>
         <w:rPr>
           <w:i/>
           <w:iCs/>
-          <w:sz w:val="24"/>
-          <w:lang w:val="lv-LV"/>
         </w:rPr>
         <w:t xml:space="preserve">(alternatīvo) </w:t>
       </w:r>
       <w:r>
-        <w:rPr>
-          <w:sz w:val="24"/>
-          <w:lang w:val="lv-LV"/>
-        </w:rPr>
         <w:t xml:space="preserve">risinājuma </w:t>
       </w:r>
       <w:r>
-        <w:rPr>
-          <w:sz w:val="24"/>
-          <w:lang w:val="lv-LV"/>
-        </w:rPr>
         <w:t>līdzekļu un valodu apraksts</w:t>
       </w:r>
       <w:bookmarkEnd w:id="9"/>
@@ -3939,24 +3629,13 @@
     <w:p>
       <w:pPr>
         <w:pStyle w:val="1"/>
-        <w:spacing w:after="240" w:line="240" w:lineRule="auto"/>
-        <w:ind w:left="431" w:right="11" w:hanging="431"/>
-        <w:rPr>
-          <w:lang w:val="lv-LV"/>
-        </w:rPr>
       </w:pPr>
       <w:bookmarkStart w:id="10" w:name="_Toc212298891"/>
       <w:r>
-        <w:rPr>
-          <w:lang w:val="lv-LV"/>
-        </w:rPr>
         <w:lastRenderedPageBreak/>
         <w:t>Sistēmas modelēšana</w:t>
       </w:r>
       <w:r>
-        <w:rPr>
-          <w:lang w:val="lv-LV"/>
-        </w:rPr>
         <w:t xml:space="preserve"> un projektēšana</w:t>
       </w:r>
       <w:bookmarkEnd w:id="10"/>
@@ -3964,19 +3643,9 @@
     <w:p>
       <w:pPr>
         <w:pStyle w:val="2"/>
-        <w:spacing w:before="240" w:after="240" w:line="240" w:lineRule="auto"/>
-        <w:ind w:left="11" w:right="11" w:hanging="11"/>
-        <w:rPr>
-          <w:sz w:val="24"/>
-          <w:lang w:val="lv-LV"/>
-        </w:rPr>
       </w:pPr>
       <w:bookmarkStart w:id="11" w:name="_Toc212298892"/>
       <w:r>
-        <w:rPr>
-          <w:sz w:val="24"/>
-          <w:lang w:val="lv-LV"/>
-        </w:rPr>
         <w:t>Sistēmas struktūras modelis</w:t>
       </w:r>
       <w:bookmarkEnd w:id="11"/>
@@ -3984,33 +3653,12 @@
     <w:p>
       <w:pPr>
         <w:pStyle w:val="3"/>
-        <w:spacing w:before="240" w:after="240" w:line="240" w:lineRule="auto"/>
-        <w:ind w:left="11" w:right="6" w:hanging="11"/>
-        <w:jc w:val="left"/>
-        <w:rPr>
-          <w:rFonts w:ascii="Times New Roman" w:hAnsi="Times New Roman" w:cs="Times New Roman"/>
-          <w:b/>
-          <w:bCs/>
-          <w:color w:val="auto"/>
-        </w:rPr>
       </w:pPr>
       <w:bookmarkStart w:id="12" w:name="_Toc212298893"/>
       <w:r>
-        <w:rPr>
-          <w:rFonts w:ascii="Times New Roman" w:hAnsi="Times New Roman" w:cs="Times New Roman"/>
-          <w:b/>
-          <w:bCs/>
-          <w:color w:val="auto"/>
-        </w:rPr>
         <w:t>Sistēmas struktūra</w:t>
       </w:r>
       <w:r>
-        <w:rPr>
-          <w:rFonts w:ascii="Times New Roman" w:hAnsi="Times New Roman" w:cs="Times New Roman"/>
-          <w:b/>
-          <w:bCs/>
-          <w:color w:val="auto"/>
-        </w:rPr>
         <w:t xml:space="preserve"> (izvietojuma diagramma / komponenšu diagramma)</w:t>
       </w:r>
       <w:bookmarkEnd w:id="12"/>
@@ -4018,24 +3666,9 @@
     <w:p>
       <w:pPr>
         <w:pStyle w:val="3"/>
-        <w:spacing w:before="240" w:after="240" w:line="240" w:lineRule="auto"/>
-        <w:ind w:left="11" w:right="6" w:hanging="11"/>
-        <w:jc w:val="left"/>
-        <w:rPr>
-          <w:rFonts w:ascii="Times New Roman" w:hAnsi="Times New Roman" w:cs="Times New Roman"/>
-          <w:b/>
-          <w:bCs/>
-          <w:color w:val="auto"/>
-        </w:rPr>
       </w:pPr>
       <w:bookmarkStart w:id="13" w:name="_Toc212298894"/>
       <w:r>
-        <w:rPr>
-          <w:rFonts w:ascii="Times New Roman" w:hAnsi="Times New Roman" w:cs="Times New Roman"/>
-          <w:b/>
-          <w:bCs/>
-          <w:color w:val="auto"/>
-        </w:rPr>
         <w:t>Klašu diagramma / ER diagramma</w:t>
       </w:r>
       <w:bookmarkEnd w:id="13"/>
@@ -4043,26 +3676,12 @@
     <w:p>
       <w:pPr>
         <w:pStyle w:val="2"/>
-        <w:spacing w:before="240" w:after="240" w:line="240" w:lineRule="auto"/>
-        <w:ind w:left="11" w:right="11" w:hanging="11"/>
-        <w:rPr>
-          <w:sz w:val="24"/>
-          <w:lang w:val="lv-LV"/>
-        </w:rPr>
       </w:pPr>
       <w:bookmarkStart w:id="14" w:name="_Toc212298895"/>
       <w:r>
-        <w:rPr>
-          <w:sz w:val="24"/>
-          <w:lang w:val="lv-LV"/>
-        </w:rPr>
         <w:t>Funkcionālais un dinamiskais sistēmas</w:t>
       </w:r>
       <w:r>
-        <w:rPr>
-          <w:sz w:val="24"/>
-          <w:lang w:val="lv-LV"/>
-        </w:rPr>
         <w:t xml:space="preserve"> modelis</w:t>
       </w:r>
       <w:bookmarkEnd w:id="14"/>
@@ -4070,93 +3689,52 @@
     <w:p>
       <w:pPr>
         <w:pStyle w:val="3"/>
-        <w:spacing w:before="240" w:after="240" w:line="240" w:lineRule="auto"/>
-        <w:ind w:left="11" w:right="6" w:hanging="11"/>
-        <w:jc w:val="left"/>
-        <w:rPr>
-          <w:rFonts w:ascii="Times New Roman" w:hAnsi="Times New Roman" w:cs="Times New Roman"/>
-          <w:b/>
-          <w:bCs/>
-          <w:color w:val="auto"/>
-        </w:rPr>
       </w:pPr>
       <w:bookmarkStart w:id="15" w:name="_Toc212298896"/>
       <w:proofErr w:type="spellStart"/>
       <w:r>
-        <w:rPr>
-          <w:rFonts w:ascii="Times New Roman" w:hAnsi="Times New Roman" w:cs="Times New Roman"/>
-          <w:b/>
-          <w:bCs/>
-          <w:color w:val="auto"/>
-        </w:rPr>
         <w:t>Lietojumgadījumu</w:t>
       </w:r>
       <w:proofErr w:type="spellEnd"/>
       <w:r>
-        <w:rPr>
-          <w:rFonts w:ascii="Times New Roman" w:hAnsi="Times New Roman" w:cs="Times New Roman"/>
-          <w:b/>
-          <w:bCs/>
-          <w:color w:val="auto"/>
-        </w:rPr>
         <w:t xml:space="preserve"> diagramma </w:t>
       </w:r>
       <w:r>
         <w:rPr>
-          <w:rFonts w:ascii="Times New Roman" w:hAnsi="Times New Roman" w:cs="Times New Roman"/>
-          <w:b/>
-          <w:bCs/>
           <w:i/>
           <w:iCs/>
-          <w:color w:val="auto"/>
         </w:rPr>
         <w:t>(</w:t>
       </w:r>
       <w:proofErr w:type="spellStart"/>
       <w:r>
         <w:rPr>
-          <w:rFonts w:ascii="Times New Roman" w:hAnsi="Times New Roman" w:cs="Times New Roman"/>
-          <w:b/>
-          <w:bCs/>
           <w:i/>
           <w:iCs/>
-          <w:color w:val="auto"/>
         </w:rPr>
         <w:t>Use</w:t>
       </w:r>
       <w:proofErr w:type="spellEnd"/>
       <w:r>
         <w:rPr>
-          <w:rFonts w:ascii="Times New Roman" w:hAnsi="Times New Roman" w:cs="Times New Roman"/>
-          <w:b/>
-          <w:bCs/>
           <w:i/>
           <w:iCs/>
-          <w:color w:val="auto"/>
         </w:rPr>
         <w:t xml:space="preserve"> </w:t>
       </w:r>
       <w:proofErr w:type="spellStart"/>
       <w:r>
         <w:rPr>
-          <w:rFonts w:ascii="Times New Roman" w:hAnsi="Times New Roman" w:cs="Times New Roman"/>
-          <w:b/>
-          <w:bCs/>
           <w:i/>
           <w:iCs/>
-          <w:color w:val="auto"/>
         </w:rPr>
         <w:t>Case</w:t>
       </w:r>
       <w:proofErr w:type="spellEnd"/>
       <w:r>
         <w:rPr>
-          <w:rFonts w:ascii="Times New Roman" w:hAnsi="Times New Roman" w:cs="Times New Roman"/>
-          <w:b/>
-          <w:bCs/>
           <w:i/>
           <w:iCs/>
-          <w:color w:val="auto"/>
         </w:rPr>
         <w:t>)</w:t>
       </w:r>
@@ -4165,60 +3743,35 @@
     <w:p>
       <w:pPr>
         <w:pStyle w:val="3"/>
-        <w:spacing w:before="240" w:after="240" w:line="240" w:lineRule="auto"/>
-        <w:ind w:left="11" w:right="6" w:hanging="11"/>
-        <w:jc w:val="left"/>
-        <w:rPr>
-          <w:rFonts w:ascii="Times New Roman" w:hAnsi="Times New Roman" w:cs="Times New Roman"/>
-          <w:b/>
-          <w:bCs/>
+        <w:rPr>
           <w:i/>
           <w:iCs/>
-          <w:color w:val="auto"/>
         </w:rPr>
       </w:pPr>
       <w:bookmarkStart w:id="16" w:name="_Toc212298897"/>
       <w:r>
-        <w:rPr>
-          <w:rFonts w:ascii="Times New Roman" w:hAnsi="Times New Roman" w:cs="Times New Roman"/>
-          <w:b/>
-          <w:bCs/>
-          <w:color w:val="auto"/>
-        </w:rPr>
         <w:t xml:space="preserve">Aktivitāšu diagramma </w:t>
       </w:r>
       <w:r>
         <w:rPr>
-          <w:rFonts w:ascii="Times New Roman" w:hAnsi="Times New Roman" w:cs="Times New Roman"/>
-          <w:b/>
-          <w:bCs/>
           <w:i/>
           <w:iCs/>
-          <w:color w:val="auto"/>
         </w:rPr>
         <w:t>(</w:t>
       </w:r>
       <w:proofErr w:type="spellStart"/>
       <w:r>
         <w:rPr>
-          <w:rFonts w:ascii="Times New Roman" w:hAnsi="Times New Roman" w:cs="Times New Roman"/>
-          <w:b/>
-          <w:bCs/>
           <w:i/>
           <w:iCs/>
-          <w:color w:val="auto"/>
         </w:rPr>
         <w:t>Activity</w:t>
       </w:r>
       <w:proofErr w:type="spellEnd"/>
       <w:r>
         <w:rPr>
-          <w:rFonts w:ascii="Times New Roman" w:hAnsi="Times New Roman" w:cs="Times New Roman"/>
-          <w:b/>
-          <w:bCs/>
           <w:i/>
           <w:iCs/>
-          <w:color w:val="auto"/>
         </w:rPr>
         <w:t>)</w:t>
       </w:r>
@@ -4227,69 +3780,38 @@
     <w:p>
       <w:pPr>
         <w:pStyle w:val="3"/>
-        <w:spacing w:before="240" w:after="240" w:line="240" w:lineRule="auto"/>
-        <w:ind w:right="6"/>
-        <w:jc w:val="left"/>
-        <w:rPr>
-          <w:rFonts w:ascii="Times New Roman" w:hAnsi="Times New Roman" w:cs="Times New Roman"/>
-          <w:b/>
-          <w:bCs/>
+        <w:rPr>
           <w:i/>
           <w:iCs/>
-          <w:color w:val="auto"/>
         </w:rPr>
       </w:pPr>
       <w:bookmarkStart w:id="17" w:name="_Toc212298898"/>
       <w:r>
-        <w:rPr>
-          <w:rFonts w:ascii="Times New Roman" w:hAnsi="Times New Roman" w:cs="Times New Roman"/>
-          <w:b/>
-          <w:bCs/>
-          <w:color w:val="auto"/>
-        </w:rPr>
         <w:t xml:space="preserve">Stāvokļu </w:t>
       </w:r>
       <w:r>
-        <w:rPr>
-          <w:rFonts w:ascii="Times New Roman" w:hAnsi="Times New Roman" w:cs="Times New Roman"/>
-          <w:b/>
-          <w:bCs/>
-          <w:color w:val="auto"/>
-        </w:rPr>
         <w:t xml:space="preserve">diagramma </w:t>
       </w:r>
       <w:r>
         <w:rPr>
-          <w:rFonts w:ascii="Times New Roman" w:hAnsi="Times New Roman" w:cs="Times New Roman"/>
-          <w:b/>
-          <w:bCs/>
           <w:i/>
           <w:iCs/>
-          <w:color w:val="auto"/>
         </w:rPr>
         <w:t>(</w:t>
       </w:r>
       <w:proofErr w:type="spellStart"/>
       <w:r>
         <w:rPr>
-          <w:rFonts w:ascii="Times New Roman" w:hAnsi="Times New Roman" w:cs="Times New Roman"/>
-          <w:b/>
-          <w:bCs/>
           <w:i/>
           <w:iCs/>
-          <w:color w:val="auto"/>
         </w:rPr>
         <w:t>State</w:t>
       </w:r>
       <w:proofErr w:type="spellEnd"/>
       <w:r>
         <w:rPr>
-          <w:rFonts w:ascii="Times New Roman" w:hAnsi="Times New Roman" w:cs="Times New Roman"/>
-          <w:b/>
-          <w:bCs/>
           <w:i/>
           <w:iCs/>
-          <w:color w:val="auto"/>
         </w:rPr>
         <w:t>)</w:t>
       </w:r>
@@ -4298,19 +3820,9 @@
     <w:p>
       <w:pPr>
         <w:pStyle w:val="2"/>
-        <w:spacing w:before="240" w:after="240" w:line="240" w:lineRule="auto"/>
-        <w:ind w:left="11" w:right="11" w:hanging="11"/>
-        <w:rPr>
-          <w:sz w:val="24"/>
-          <w:lang w:val="lv-LV"/>
-        </w:rPr>
       </w:pPr>
       <w:bookmarkStart w:id="18" w:name="_Toc212298899"/>
       <w:r>
-        <w:rPr>
-          <w:sz w:val="24"/>
-          <w:lang w:val="lv-LV"/>
-        </w:rPr>
         <w:t>Datu struktūru apraksts</w:t>
       </w:r>
       <w:bookmarkEnd w:id="18"/>
@@ -4332,17 +3844,9 @@
     <w:p>
       <w:pPr>
         <w:pStyle w:val="1"/>
-        <w:spacing w:after="240" w:line="240" w:lineRule="auto"/>
-        <w:ind w:left="431" w:right="11" w:hanging="431"/>
-        <w:rPr>
-          <w:lang w:val="lv-LV"/>
-        </w:rPr>
       </w:pPr>
       <w:bookmarkStart w:id="19" w:name="_Toc212298900"/>
       <w:r>
-        <w:rPr>
-          <w:lang w:val="lv-LV"/>
-        </w:rPr>
         <w:lastRenderedPageBreak/>
         <w:t>Lietotāju ceļvedis</w:t>
       </w:r>
@@ -4365,17 +3869,9 @@
     <w:p>
       <w:pPr>
         <w:pStyle w:val="1"/>
-        <w:spacing w:after="240" w:line="240" w:lineRule="auto"/>
-        <w:ind w:left="431" w:right="11" w:hanging="431"/>
-        <w:rPr>
-          <w:lang w:val="lv-LV"/>
-        </w:rPr>
       </w:pPr>
       <w:bookmarkStart w:id="20" w:name="_Toc212298901"/>
       <w:r>
-        <w:rPr>
-          <w:lang w:val="lv-LV"/>
-        </w:rPr>
         <w:lastRenderedPageBreak/>
         <w:t>Testēšanas dokumentācija</w:t>
       </w:r>
@@ -4384,19 +3880,9 @@
     <w:p>
       <w:pPr>
         <w:pStyle w:val="2"/>
-        <w:spacing w:before="240" w:after="240" w:line="240" w:lineRule="auto"/>
-        <w:ind w:left="11" w:right="11" w:hanging="11"/>
-        <w:rPr>
-          <w:sz w:val="24"/>
-          <w:lang w:val="lv-LV"/>
-        </w:rPr>
       </w:pPr>
       <w:bookmarkStart w:id="21" w:name="_Toc212298902"/>
       <w:r>
-        <w:rPr>
-          <w:sz w:val="24"/>
-          <w:lang w:val="lv-LV"/>
-        </w:rPr>
         <w:t>Izvēlētās testēšanas metodes, rīku apraksts un pamatojums</w:t>
       </w:r>
       <w:bookmarkEnd w:id="21"/>
@@ -4404,19 +3890,9 @@
     <w:p>
       <w:pPr>
         <w:pStyle w:val="2"/>
-        <w:spacing w:before="240" w:after="240" w:line="240" w:lineRule="auto"/>
-        <w:ind w:left="11" w:right="11" w:hanging="11"/>
-        <w:rPr>
-          <w:sz w:val="24"/>
-          <w:lang w:val="lv-LV"/>
-        </w:rPr>
       </w:pPr>
       <w:bookmarkStart w:id="22" w:name="_Toc212298903"/>
       <w:r>
-        <w:rPr>
-          <w:sz w:val="24"/>
-          <w:lang w:val="lv-LV"/>
-        </w:rPr>
         <w:t>Testpiemēru kopa</w:t>
       </w:r>
       <w:bookmarkEnd w:id="22"/>
@@ -4424,19 +3900,9 @@
     <w:p>
       <w:pPr>
         <w:pStyle w:val="2"/>
-        <w:spacing w:before="240" w:after="240" w:line="240" w:lineRule="auto"/>
-        <w:ind w:left="11" w:right="11" w:hanging="11"/>
-        <w:rPr>
-          <w:sz w:val="24"/>
-          <w:lang w:val="lv-LV"/>
-        </w:rPr>
       </w:pPr>
       <w:bookmarkStart w:id="23" w:name="_Toc212298904"/>
       <w:r>
-        <w:rPr>
-          <w:sz w:val="24"/>
-          <w:lang w:val="lv-LV"/>
-        </w:rPr>
         <w:t>Testēšanas žurnāls</w:t>
       </w:r>
       <w:bookmarkEnd w:id="23"/>
@@ -4462,60 +3928,13 @@
           <w:ilvl w:val="0"/>
           <w:numId w:val="0"/>
         </w:numPr>
-        <w:spacing w:after="240" w:line="240" w:lineRule="auto"/>
-        <w:ind w:right="11"/>
-        <w:rPr>
-          <w:lang w:val="lv-LV"/>
-        </w:rPr>
       </w:pPr>
       <w:bookmarkStart w:id="24" w:name="_Toc212298905"/>
       <w:r>
-        <w:rPr>
-          <w:lang w:val="lv-LV"/>
-        </w:rPr>
         <w:lastRenderedPageBreak/>
         <w:t>Secinājumi</w:t>
       </w:r>
       <w:bookmarkEnd w:id="24"/>
-    </w:p>
-    <w:p>
-      <w:pPr>
-        <w:spacing w:after="160" w:line="278" w:lineRule="auto"/>
-        <w:ind w:left="0" w:right="0" w:firstLine="0"/>
-        <w:jc w:val="left"/>
-        <w:rPr>
-          <w:b/>
-          <w:sz w:val="28"/>
-        </w:rPr>
-      </w:pPr>
-      <w:r>
-        <w:br w:type="page"/>
-      </w:r>
-    </w:p>
-    <w:p>
-      <w:pPr>
-        <w:pStyle w:val="1"/>
-        <w:spacing w:after="240" w:line="240" w:lineRule="auto"/>
-        <w:ind w:left="431" w:right="11" w:hanging="431"/>
-        <w:rPr>
-          <w:lang w:val="lv-LV"/>
-        </w:rPr>
-      </w:pPr>
-      <w:bookmarkStart w:id="25" w:name="_Toc212298906"/>
-      <w:r>
-        <w:rPr>
-          <w:lang w:val="lv-LV"/>
-        </w:rPr>
-        <w:lastRenderedPageBreak/>
-        <w:t>Lietoto</w:t>
-      </w:r>
-      <w:r>
-        <w:rPr>
-          <w:lang w:val="lv-LV"/>
-        </w:rPr>
-        <w:t xml:space="preserve"> terminu un saīsinājumu skaidrojumi</w:t>
-      </w:r>
-      <w:bookmarkEnd w:id="25"/>
     </w:p>
     <w:p>
       <w:pPr>
@@ -4538,40 +3957,71 @@
           <w:ilvl w:val="0"/>
           <w:numId w:val="0"/>
         </w:numPr>
-        <w:spacing w:after="240" w:line="240" w:lineRule="auto"/>
-        <w:ind w:right="11"/>
-        <w:rPr>
-          <w:lang w:val="lv-LV"/>
-        </w:rPr>
-      </w:pPr>
-      <w:bookmarkStart w:id="26" w:name="_Toc212298907"/>
-      <w:r>
-        <w:rPr>
-          <w:lang w:val="lv-LV"/>
-        </w:rPr>
+      </w:pPr>
+      <w:bookmarkStart w:id="25" w:name="_Toc212298906"/>
+      <w:r>
         <w:lastRenderedPageBreak/>
-        <w:t>Literatūras un informācijas avotu saraksts</w:t>
-      </w:r>
-      <w:bookmarkEnd w:id="26"/>
-    </w:p>
-    <w:p>
-      <w:pPr>
-        <w:spacing w:after="160" w:line="278" w:lineRule="auto"/>
-        <w:ind w:left="0" w:right="0" w:firstLine="0"/>
-        <w:jc w:val="left"/>
+        <w:t>Lietoto</w:t>
+      </w:r>
+      <w:r>
+        <w:t xml:space="preserve"> terminu un saīsinājumu skaidrojumi</w:t>
+      </w:r>
+      <w:bookmarkEnd w:id="25"/>
+    </w:p>
+    <w:p>
+      <w:pPr>
+        <w:spacing w:after="0" w:line="360" w:lineRule="auto"/>
+        <w:ind w:left="0" w:right="0" w:firstLine="851"/>
+        <w:rPr>
+          <w:b/>
+          <w:sz w:val="24"/>
+        </w:rPr>
+      </w:pPr>
+      <w:proofErr w:type="spellStart"/>
+      <w:r>
         <w:rPr>
           <w:b/>
           <w:bCs/>
-          <w:sz w:val="28"/>
-          <w:szCs w:val="28"/>
-        </w:rPr>
-      </w:pPr>
+          <w:sz w:val="24"/>
+        </w:rPr>
+        <w:t>Platformer</w:t>
+      </w:r>
+      <w:proofErr w:type="spellEnd"/>
       <w:r>
         <w:rPr>
           <w:b/>
           <w:bCs/>
-          <w:sz w:val="28"/>
-          <w:szCs w:val="28"/>
+          <w:sz w:val="24"/>
+        </w:rPr>
+        <w:t xml:space="preserve"> (</w:t>
+      </w:r>
+      <w:proofErr w:type="spellStart"/>
+      <w:r>
+        <w:rPr>
+          <w:b/>
+          <w:bCs/>
+          <w:sz w:val="24"/>
+        </w:rPr>
+        <w:t>platformeru</w:t>
+      </w:r>
+      <w:proofErr w:type="spellEnd"/>
+      <w:r>
+        <w:rPr>
+          <w:b/>
+          <w:bCs/>
+          <w:sz w:val="24"/>
+        </w:rPr>
+        <w:t xml:space="preserve"> spēle)</w:t>
+      </w:r>
+      <w:r>
+        <w:rPr>
+          <w:sz w:val="24"/>
+        </w:rPr>
+        <w:t xml:space="preserve"> — videospēļu žanrs, kurā spēlētājs vada varoni, kas pārvietojas pa dažādiem līmeņiem, lecot starp platformām, izvairoties no šķēršļiem un ienaidniekiem. Galvenais uzsvars tiek likts uz precīzu kustību un reakcijas ātrumu.</w:t>
+      </w:r>
+      <w:r>
+        <w:rPr>
+          <w:sz w:val="24"/>
         </w:rPr>
         <w:br w:type="page"/>
       </w:r>
@@ -4583,21 +4033,53 @@
           <w:ilvl w:val="0"/>
           <w:numId w:val="0"/>
         </w:numPr>
-        <w:spacing w:after="240" w:line="240" w:lineRule="auto"/>
-        <w:ind w:right="11"/>
+      </w:pPr>
+      <w:bookmarkStart w:id="26" w:name="_Toc212298907"/>
+      <w:r>
+        <w:lastRenderedPageBreak/>
+        <w:t>Literatūras un informācijas avotu saraksts</w:t>
+      </w:r>
+      <w:bookmarkEnd w:id="26"/>
+    </w:p>
+    <w:p>
+      <w:pPr>
+        <w:spacing w:after="160" w:line="278" w:lineRule="auto"/>
+        <w:ind w:left="0" w:right="0" w:firstLine="0"/>
+        <w:jc w:val="left"/>
+        <w:rPr>
+          <w:b/>
+          <w:bCs/>
+          <w:sz w:val="28"/>
+          <w:szCs w:val="28"/>
+        </w:rPr>
+      </w:pPr>
+      <w:r>
+        <w:rPr>
+          <w:b/>
+          <w:bCs/>
+          <w:sz w:val="28"/>
+          <w:szCs w:val="28"/>
+        </w:rPr>
+        <w:br w:type="page"/>
+      </w:r>
+    </w:p>
+    <w:p>
+      <w:pPr>
+        <w:pStyle w:val="1"/>
+        <w:numPr>
+          <w:ilvl w:val="0"/>
+          <w:numId w:val="0"/>
+        </w:numPr>
       </w:pPr>
       <w:bookmarkStart w:id="27" w:name="_Toc212298908"/>
       <w:r>
-        <w:rPr>
-          <w:lang w:val="lv-LV"/>
-        </w:rPr>
         <w:lastRenderedPageBreak/>
         <w:t>Pielikumi</w:t>
       </w:r>
       <w:bookmarkEnd w:id="27"/>
     </w:p>
     <w:sectPr>
-      <w:footerReference w:type="default" r:id="rId9"/>
+      <w:footerReference w:type="default" r:id="rId10"/>
       <w:pgSz w:w="11906" w:h="16838"/>
       <w:pgMar w:top="1134" w:right="1134" w:bottom="1134" w:left="1418" w:header="720" w:footer="720" w:gutter="0"/>
       <w:cols w:space="720"/>
@@ -5340,7 +4822,7 @@
   <w:abstractNum w:abstractNumId="3" w15:restartNumberingAfterBreak="0">
     <w:nsid w:val="15227B45"/>
     <w:multiLevelType w:val="multilevel"/>
-    <w:tmpl w:val="4AE007DE"/>
+    <w:tmpl w:val="85743814"/>
     <w:lvl w:ilvl="0">
       <w:start w:val="1"/>
       <w:numFmt w:val="decimal"/>
@@ -6610,6 +6092,146 @@
     </w:lvl>
   </w:abstractNum>
   <w:abstractNum w:abstractNumId="10" w15:restartNumberingAfterBreak="0">
+    <w:nsid w:val="46975059"/>
+    <w:multiLevelType w:val="multilevel"/>
+    <w:tmpl w:val="5F328562"/>
+    <w:lvl w:ilvl="0">
+      <w:start w:val="1"/>
+      <w:numFmt w:val="decimal"/>
+      <w:lvlText w:val="%1."/>
+      <w:lvlJc w:val="left"/>
+      <w:pPr>
+        <w:tabs>
+          <w:tab w:val="num" w:pos="720"/>
+        </w:tabs>
+        <w:ind w:left="567" w:hanging="207"/>
+      </w:pPr>
+      <w:rPr>
+        <w:rFonts w:hint="default"/>
+      </w:rPr>
+    </w:lvl>
+    <w:lvl w:ilvl="1">
+      <w:start w:val="1"/>
+      <w:numFmt w:val="decimal"/>
+      <w:lvlText w:val="%2."/>
+      <w:lvlJc w:val="left"/>
+      <w:pPr>
+        <w:tabs>
+          <w:tab w:val="num" w:pos="1440"/>
+        </w:tabs>
+        <w:ind w:left="1440" w:hanging="360"/>
+      </w:pPr>
+      <w:rPr>
+        <w:rFonts w:hint="default"/>
+      </w:rPr>
+    </w:lvl>
+    <w:lvl w:ilvl="2">
+      <w:start w:val="1"/>
+      <w:numFmt w:val="decimal"/>
+      <w:lvlText w:val="%3."/>
+      <w:lvlJc w:val="left"/>
+      <w:pPr>
+        <w:tabs>
+          <w:tab w:val="num" w:pos="2160"/>
+        </w:tabs>
+        <w:ind w:left="2160" w:hanging="360"/>
+      </w:pPr>
+      <w:rPr>
+        <w:rFonts w:hint="default"/>
+      </w:rPr>
+    </w:lvl>
+    <w:lvl w:ilvl="3">
+      <w:start w:val="1"/>
+      <w:numFmt w:val="decimal"/>
+      <w:lvlText w:val="%4."/>
+      <w:lvlJc w:val="left"/>
+      <w:pPr>
+        <w:tabs>
+          <w:tab w:val="num" w:pos="2880"/>
+        </w:tabs>
+        <w:ind w:left="2880" w:hanging="360"/>
+      </w:pPr>
+      <w:rPr>
+        <w:rFonts w:hint="default"/>
+      </w:rPr>
+    </w:lvl>
+    <w:lvl w:ilvl="4">
+      <w:start w:val="1"/>
+      <w:numFmt w:val="decimal"/>
+      <w:lvlText w:val="%5."/>
+      <w:lvlJc w:val="left"/>
+      <w:pPr>
+        <w:tabs>
+          <w:tab w:val="num" w:pos="3600"/>
+        </w:tabs>
+        <w:ind w:left="3600" w:hanging="360"/>
+      </w:pPr>
+      <w:rPr>
+        <w:rFonts w:hint="default"/>
+      </w:rPr>
+    </w:lvl>
+    <w:lvl w:ilvl="5">
+      <w:start w:val="1"/>
+      <w:numFmt w:val="decimal"/>
+      <w:lvlText w:val="%6."/>
+      <w:lvlJc w:val="left"/>
+      <w:pPr>
+        <w:tabs>
+          <w:tab w:val="num" w:pos="4320"/>
+        </w:tabs>
+        <w:ind w:left="4320" w:hanging="360"/>
+      </w:pPr>
+      <w:rPr>
+        <w:rFonts w:hint="default"/>
+      </w:rPr>
+    </w:lvl>
+    <w:lvl w:ilvl="6">
+      <w:start w:val="1"/>
+      <w:numFmt w:val="decimal"/>
+      <w:lvlText w:val="%7."/>
+      <w:lvlJc w:val="left"/>
+      <w:pPr>
+        <w:tabs>
+          <w:tab w:val="num" w:pos="5040"/>
+        </w:tabs>
+        <w:ind w:left="5040" w:hanging="360"/>
+      </w:pPr>
+      <w:rPr>
+        <w:rFonts w:hint="default"/>
+      </w:rPr>
+    </w:lvl>
+    <w:lvl w:ilvl="7">
+      <w:start w:val="1"/>
+      <w:numFmt w:val="decimal"/>
+      <w:lvlText w:val="%8."/>
+      <w:lvlJc w:val="left"/>
+      <w:pPr>
+        <w:tabs>
+          <w:tab w:val="num" w:pos="5760"/>
+        </w:tabs>
+        <w:ind w:left="5760" w:hanging="360"/>
+      </w:pPr>
+      <w:rPr>
+        <w:rFonts w:hint="default"/>
+      </w:rPr>
+    </w:lvl>
+    <w:lvl w:ilvl="8">
+      <w:start w:val="1"/>
+      <w:numFmt w:val="decimal"/>
+      <w:lvlText w:val="%9."/>
+      <w:lvlJc w:val="left"/>
+      <w:pPr>
+        <w:tabs>
+          <w:tab w:val="num" w:pos="6480"/>
+        </w:tabs>
+        <w:ind w:left="6480" w:hanging="360"/>
+      </w:pPr>
+      <w:rPr>
+        <w:rFonts w:hint="default"/>
+      </w:rPr>
+    </w:lvl>
+  </w:abstractNum>
+  <w:abstractNum w:abstractNumId="11" w15:restartNumberingAfterBreak="0">
     <w:nsid w:val="495C108F"/>
     <w:multiLevelType w:val="hybridMultilevel"/>
     <w:tmpl w:val="DE2245D6"/>
@@ -6821,7 +6443,7 @@
       </w:rPr>
     </w:lvl>
   </w:abstractNum>
-  <w:abstractNum w:abstractNumId="11" w15:restartNumberingAfterBreak="0">
+  <w:abstractNum w:abstractNumId="12" w15:restartNumberingAfterBreak="0">
     <w:nsid w:val="54742FCB"/>
     <w:multiLevelType w:val="multilevel"/>
     <w:tmpl w:val="C12ADBC8"/>
@@ -7033,7 +6655,7 @@
       </w:rPr>
     </w:lvl>
   </w:abstractNum>
-  <w:abstractNum w:abstractNumId="12" w15:restartNumberingAfterBreak="0">
+  <w:abstractNum w:abstractNumId="13" w15:restartNumberingAfterBreak="0">
     <w:nsid w:val="5FDB294F"/>
     <w:multiLevelType w:val="hybridMultilevel"/>
     <w:tmpl w:val="EE18C9C2"/>
@@ -7245,7 +6867,7 @@
       </w:rPr>
     </w:lvl>
   </w:abstractNum>
-  <w:abstractNum w:abstractNumId="13" w15:restartNumberingAfterBreak="0">
+  <w:abstractNum w:abstractNumId="14" w15:restartNumberingAfterBreak="0">
     <w:nsid w:val="6B87794B"/>
     <w:multiLevelType w:val="hybridMultilevel"/>
     <w:tmpl w:val="0F081C92"/>
@@ -7457,7 +7079,7 @@
       </w:rPr>
     </w:lvl>
   </w:abstractNum>
-  <w:abstractNum w:abstractNumId="14" w15:restartNumberingAfterBreak="0">
+  <w:abstractNum w:abstractNumId="15" w15:restartNumberingAfterBreak="0">
     <w:nsid w:val="71215CB6"/>
     <w:multiLevelType w:val="hybridMultilevel"/>
     <w:tmpl w:val="03DC4AE6"/>
@@ -7669,7 +7291,7 @@
       </w:rPr>
     </w:lvl>
   </w:abstractNum>
-  <w:abstractNum w:abstractNumId="15" w15:restartNumberingAfterBreak="0">
+  <w:abstractNum w:abstractNumId="16" w15:restartNumberingAfterBreak="0">
     <w:nsid w:val="73FA0568"/>
     <w:multiLevelType w:val="hybridMultilevel"/>
     <w:tmpl w:val="35A0C126"/>
@@ -7755,7 +7377,7 @@
       </w:pPr>
     </w:lvl>
   </w:abstractNum>
-  <w:abstractNum w:abstractNumId="16" w15:restartNumberingAfterBreak="0">
+  <w:abstractNum w:abstractNumId="17" w15:restartNumberingAfterBreak="0">
     <w:nsid w:val="74664AF8"/>
     <w:multiLevelType w:val="hybridMultilevel"/>
     <w:tmpl w:val="AEB8784E"/>
@@ -7967,7 +7589,7 @@
       </w:rPr>
     </w:lvl>
   </w:abstractNum>
-  <w:abstractNum w:abstractNumId="17" w15:restartNumberingAfterBreak="0">
+  <w:abstractNum w:abstractNumId="18" w15:restartNumberingAfterBreak="0">
     <w:nsid w:val="75812135"/>
     <w:multiLevelType w:val="hybridMultilevel"/>
     <w:tmpl w:val="59161448"/>
@@ -8179,7 +7801,7 @@
       </w:rPr>
     </w:lvl>
   </w:abstractNum>
-  <w:abstractNum w:abstractNumId="18" w15:restartNumberingAfterBreak="0">
+  <w:abstractNum w:abstractNumId="19" w15:restartNumberingAfterBreak="0">
     <w:nsid w:val="75E8251C"/>
     <w:multiLevelType w:val="hybridMultilevel"/>
     <w:tmpl w:val="5FEA12B4"/>
@@ -8400,7 +8022,7 @@
       </w:rPr>
     </w:lvl>
   </w:abstractNum>
-  <w:abstractNum w:abstractNumId="19" w15:restartNumberingAfterBreak="0">
+  <w:abstractNum w:abstractNumId="20" w15:restartNumberingAfterBreak="0">
     <w:nsid w:val="76173469"/>
     <w:multiLevelType w:val="hybridMultilevel"/>
     <w:tmpl w:val="C32E48CE"/>
@@ -8613,10 +8235,10 @@
     </w:lvl>
   </w:abstractNum>
   <w:num w:numId="1" w16cid:durableId="871303984">
-    <w:abstractNumId w:val="11"/>
+    <w:abstractNumId w:val="12"/>
   </w:num>
   <w:num w:numId="2" w16cid:durableId="1262910627">
-    <w:abstractNumId w:val="16"/>
+    <w:abstractNumId w:val="17"/>
   </w:num>
   <w:num w:numId="3" w16cid:durableId="1760517672">
     <w:abstractNumId w:val="9"/>
@@ -8634,13 +8256,13 @@
     <w:abstractNumId w:val="2"/>
   </w:num>
   <w:num w:numId="8" w16cid:durableId="186793166">
-    <w:abstractNumId w:val="14"/>
+    <w:abstractNumId w:val="15"/>
   </w:num>
   <w:num w:numId="9" w16cid:durableId="1679649967">
-    <w:abstractNumId w:val="12"/>
+    <w:abstractNumId w:val="13"/>
   </w:num>
   <w:num w:numId="10" w16cid:durableId="1613972653">
-    <w:abstractNumId w:val="13"/>
+    <w:abstractNumId w:val="14"/>
   </w:num>
   <w:num w:numId="11" w16cid:durableId="486744876">
     <w:abstractNumId w:val="0"/>
@@ -8649,19 +8271,19 @@
     <w:abstractNumId w:val="5"/>
   </w:num>
   <w:num w:numId="13" w16cid:durableId="67699304">
-    <w:abstractNumId w:val="10"/>
+    <w:abstractNumId w:val="11"/>
   </w:num>
   <w:num w:numId="14" w16cid:durableId="1656029628">
-    <w:abstractNumId w:val="19"/>
+    <w:abstractNumId w:val="20"/>
   </w:num>
   <w:num w:numId="15" w16cid:durableId="1014962492">
-    <w:abstractNumId w:val="17"/>
+    <w:abstractNumId w:val="18"/>
   </w:num>
   <w:num w:numId="16" w16cid:durableId="612059645">
     <w:abstractNumId w:val="4"/>
   </w:num>
   <w:num w:numId="17" w16cid:durableId="156114076">
-    <w:abstractNumId w:val="18"/>
+    <w:abstractNumId w:val="19"/>
   </w:num>
   <w:num w:numId="18" w16cid:durableId="414400323">
     <w:abstractNumId w:val="7"/>
@@ -8670,7 +8292,166 @@
     <w:abstractNumId w:val="3"/>
   </w:num>
   <w:num w:numId="20" w16cid:durableId="665477012">
-    <w:abstractNumId w:val="15"/>
+    <w:abstractNumId w:val="16"/>
+  </w:num>
+  <w:num w:numId="21" w16cid:durableId="1180045182">
+    <w:abstractNumId w:val="10"/>
+  </w:num>
+  <w:num w:numId="22" w16cid:durableId="1744062689">
+    <w:abstractNumId w:val="10"/>
+    <w:lvlOverride w:ilvl="0">
+      <w:lvl w:ilvl="0">
+        <w:start w:val="1"/>
+        <w:numFmt w:val="decimal"/>
+        <w:lvlText w:val="%1."/>
+        <w:lvlJc w:val="left"/>
+        <w:pPr>
+          <w:tabs>
+            <w:tab w:val="num" w:pos="720"/>
+          </w:tabs>
+          <w:ind w:left="567" w:hanging="207"/>
+        </w:pPr>
+        <w:rPr>
+          <w:rFonts w:hint="default"/>
+        </w:rPr>
+      </w:lvl>
+    </w:lvlOverride>
+    <w:lvlOverride w:ilvl="1">
+      <w:lvl w:ilvl="1">
+        <w:start w:val="1"/>
+        <w:numFmt w:val="decimal"/>
+        <w:lvlText w:val="%2."/>
+        <w:lvlJc w:val="left"/>
+        <w:pPr>
+          <w:tabs>
+            <w:tab w:val="num" w:pos="1440"/>
+          </w:tabs>
+          <w:ind w:left="1440" w:hanging="360"/>
+        </w:pPr>
+        <w:rPr>
+          <w:rFonts w:hint="default"/>
+        </w:rPr>
+      </w:lvl>
+    </w:lvlOverride>
+    <w:lvlOverride w:ilvl="2">
+      <w:lvl w:ilvl="2">
+        <w:start w:val="1"/>
+        <w:numFmt w:val="decimal"/>
+        <w:lvlText w:val="%3."/>
+        <w:lvlJc w:val="left"/>
+        <w:pPr>
+          <w:tabs>
+            <w:tab w:val="num" w:pos="2160"/>
+          </w:tabs>
+          <w:ind w:left="2160" w:hanging="360"/>
+        </w:pPr>
+        <w:rPr>
+          <w:rFonts w:hint="default"/>
+        </w:rPr>
+      </w:lvl>
+    </w:lvlOverride>
+    <w:lvlOverride w:ilvl="3">
+      <w:lvl w:ilvl="3">
+        <w:start w:val="1"/>
+        <w:numFmt w:val="decimal"/>
+        <w:lvlText w:val="%4."/>
+        <w:lvlJc w:val="left"/>
+        <w:pPr>
+          <w:tabs>
+            <w:tab w:val="num" w:pos="2880"/>
+          </w:tabs>
+          <w:ind w:left="2880" w:hanging="360"/>
+        </w:pPr>
+        <w:rPr>
+          <w:rFonts w:hint="default"/>
+        </w:rPr>
+      </w:lvl>
+    </w:lvlOverride>
+    <w:lvlOverride w:ilvl="4">
+      <w:lvl w:ilvl="4">
+        <w:start w:val="1"/>
+        <w:numFmt w:val="decimal"/>
+        <w:lvlText w:val="%5."/>
+        <w:lvlJc w:val="left"/>
+        <w:pPr>
+          <w:tabs>
+            <w:tab w:val="num" w:pos="3600"/>
+          </w:tabs>
+          <w:ind w:left="3600" w:hanging="360"/>
+        </w:pPr>
+        <w:rPr>
+          <w:rFonts w:hint="default"/>
+        </w:rPr>
+      </w:lvl>
+    </w:lvlOverride>
+    <w:lvlOverride w:ilvl="5">
+      <w:lvl w:ilvl="5">
+        <w:start w:val="1"/>
+        <w:numFmt w:val="decimal"/>
+        <w:lvlText w:val="%6."/>
+        <w:lvlJc w:val="left"/>
+        <w:pPr>
+          <w:tabs>
+            <w:tab w:val="num" w:pos="4320"/>
+          </w:tabs>
+          <w:ind w:left="4320" w:hanging="360"/>
+        </w:pPr>
+        <w:rPr>
+          <w:rFonts w:hint="default"/>
+        </w:rPr>
+      </w:lvl>
+    </w:lvlOverride>
+    <w:lvlOverride w:ilvl="6">
+      <w:lvl w:ilvl="6">
+        <w:start w:val="1"/>
+        <w:numFmt w:val="decimal"/>
+        <w:lvlText w:val="%7."/>
+        <w:lvlJc w:val="left"/>
+        <w:pPr>
+          <w:tabs>
+            <w:tab w:val="num" w:pos="5040"/>
+          </w:tabs>
+          <w:ind w:left="5040" w:hanging="360"/>
+        </w:pPr>
+        <w:rPr>
+          <w:rFonts w:hint="default"/>
+        </w:rPr>
+      </w:lvl>
+    </w:lvlOverride>
+    <w:lvlOverride w:ilvl="7">
+      <w:lvl w:ilvl="7">
+        <w:start w:val="1"/>
+        <w:numFmt w:val="decimal"/>
+        <w:lvlText w:val="%8."/>
+        <w:lvlJc w:val="left"/>
+        <w:pPr>
+          <w:tabs>
+            <w:tab w:val="num" w:pos="5760"/>
+          </w:tabs>
+          <w:ind w:left="5760" w:hanging="360"/>
+        </w:pPr>
+        <w:rPr>
+          <w:rFonts w:hint="default"/>
+        </w:rPr>
+      </w:lvl>
+    </w:lvlOverride>
+    <w:lvlOverride w:ilvl="8">
+      <w:lvl w:ilvl="8">
+        <w:start w:val="1"/>
+        <w:numFmt w:val="decimal"/>
+        <w:lvlText w:val="%9."/>
+        <w:lvlJc w:val="left"/>
+        <w:pPr>
+          <w:tabs>
+            <w:tab w:val="num" w:pos="6480"/>
+          </w:tabs>
+          <w:ind w:left="6480" w:hanging="360"/>
+        </w:pPr>
+        <w:rPr>
+          <w:rFonts w:hint="default"/>
+        </w:rPr>
+      </w:lvl>
+    </w:lvlOverride>
   </w:num>
 </w:numbering>
 </file>
@@ -9093,14 +8874,15 @@
     <w:link w:val="10"/>
     <w:uiPriority w:val="9"/>
     <w:qFormat/>
+    <w:rsid w:val="00546C5A"/>
     <w:pPr>
       <w:keepNext/>
       <w:keepLines/>
       <w:numPr>
         <w:numId w:val="19"/>
       </w:numPr>
-      <w:spacing w:after="295" w:line="265" w:lineRule="auto"/>
-      <w:ind w:right="9"/>
+      <w:spacing w:after="240" w:line="240" w:lineRule="auto"/>
+      <w:ind w:left="431" w:right="11" w:hanging="431"/>
       <w:jc w:val="center"/>
       <w:outlineLvl w:val="0"/>
     </w:pPr>
@@ -9109,6 +8891,7 @@
       <w:b/>
       <w:color w:val="000000"/>
       <w:sz w:val="28"/>
+      <w:lang w:val="lv-LV"/>
     </w:rPr>
   </w:style>
   <w:style w:type="paragraph" w:styleId="2">
@@ -9118,6 +8901,7 @@
     <w:uiPriority w:val="9"/>
     <w:unhideWhenUsed/>
     <w:qFormat/>
+    <w:rsid w:val="00546C5A"/>
     <w:pPr>
       <w:keepNext/>
       <w:keepLines/>
@@ -9125,8 +8909,8 @@
         <w:ilvl w:val="1"/>
         <w:numId w:val="19"/>
       </w:numPr>
-      <w:spacing w:after="295" w:line="265" w:lineRule="auto"/>
-      <w:ind w:right="9"/>
+      <w:spacing w:before="240" w:after="240" w:line="240" w:lineRule="auto"/>
+      <w:ind w:left="11" w:right="11" w:hanging="11"/>
       <w:jc w:val="center"/>
       <w:outlineLvl w:val="1"/>
     </w:pPr>
@@ -9134,7 +8918,7 @@
       <w:rFonts w:ascii="Times New Roman" w:eastAsia="Times New Roman" w:hAnsi="Times New Roman" w:cs="Times New Roman"/>
       <w:b/>
       <w:color w:val="000000"/>
-      <w:sz w:val="28"/>
+      <w:lang w:val="lv-LV"/>
     </w:rPr>
   </w:style>
   <w:style w:type="paragraph" w:styleId="3">
@@ -9145,7 +8929,7 @@
     <w:uiPriority w:val="9"/>
     <w:unhideWhenUsed/>
     <w:qFormat/>
-    <w:rsid w:val="00F14A0C"/>
+    <w:rsid w:val="00546C5A"/>
     <w:pPr>
       <w:keepNext/>
       <w:keepLines/>
@@ -9153,12 +8937,16 @@
         <w:ilvl w:val="2"/>
         <w:numId w:val="19"/>
       </w:numPr>
-      <w:spacing w:before="40" w:after="0"/>
+      <w:spacing w:before="240" w:after="240" w:line="240" w:lineRule="auto"/>
+      <w:ind w:left="11" w:right="6" w:hanging="11"/>
+      <w:jc w:val="left"/>
       <w:outlineLvl w:val="2"/>
     </w:pPr>
     <w:rPr>
-      <w:rFonts w:asciiTheme="majorHAnsi" w:eastAsiaTheme="majorEastAsia" w:hAnsiTheme="majorHAnsi" w:cstheme="majorBidi"/>
-      <w:color w:val="0A2F40" w:themeColor="accent1" w:themeShade="7F"/>
+      <w:rFonts w:eastAsiaTheme="majorEastAsia"/>
+      <w:b/>
+      <w:bCs/>
+      <w:color w:val="auto"/>
       <w:sz w:val="24"/>
     </w:rPr>
   </w:style>
@@ -9351,21 +9139,26 @@
   <w:style w:type="character" w:customStyle="1" w:styleId="10">
     <w:name w:val="Заголовок 1 Знак"/>
     <w:link w:val="1"/>
+    <w:uiPriority w:val="9"/>
+    <w:rsid w:val="00546C5A"/>
     <w:rPr>
       <w:rFonts w:ascii="Times New Roman" w:eastAsia="Times New Roman" w:hAnsi="Times New Roman" w:cs="Times New Roman"/>
       <w:b/>
       <w:color w:val="000000"/>
       <w:sz w:val="28"/>
+      <w:lang w:val="lv-LV"/>
     </w:rPr>
   </w:style>
   <w:style w:type="character" w:customStyle="1" w:styleId="20">
     <w:name w:val="Заголовок 2 Знак"/>
     <w:link w:val="2"/>
+    <w:uiPriority w:val="9"/>
+    <w:rsid w:val="00546C5A"/>
     <w:rPr>
       <w:rFonts w:ascii="Times New Roman" w:eastAsia="Times New Roman" w:hAnsi="Times New Roman" w:cs="Times New Roman"/>
       <w:b/>
       <w:color w:val="000000"/>
-      <w:sz w:val="28"/>
+      <w:lang w:val="lv-LV"/>
     </w:rPr>
   </w:style>
   <w:style w:type="table" w:customStyle="1" w:styleId="TableGrid">
@@ -9398,10 +9191,11 @@
     <w:basedOn w:val="a0"/>
     <w:link w:val="3"/>
     <w:uiPriority w:val="9"/>
-    <w:rsid w:val="00F14A0C"/>
+    <w:rsid w:val="00546C5A"/>
     <w:rPr>
-      <w:rFonts w:asciiTheme="majorHAnsi" w:eastAsiaTheme="majorEastAsia" w:hAnsiTheme="majorHAnsi" w:cstheme="majorBidi"/>
-      <w:color w:val="0A2F40" w:themeColor="accent1" w:themeShade="7F"/>
+      <w:rFonts w:ascii="Times New Roman" w:eastAsiaTheme="majorEastAsia" w:hAnsi="Times New Roman" w:cs="Times New Roman"/>
+      <w:b/>
+      <w:bCs/>
       <w:lang w:val="lv-LV"/>
     </w:rPr>
   </w:style>
@@ -9610,6 +9404,29 @@
       <w:sz w:val="24"/>
       <w:lang w:val="ru-RU"/>
       <w14:ligatures w14:val="none"/>
+    </w:rPr>
+  </w:style>
+  <w:style w:type="character" w:styleId="a9">
+    <w:name w:val="Hyperlink"/>
+    <w:basedOn w:val="a0"/>
+    <w:uiPriority w:val="99"/>
+    <w:unhideWhenUsed/>
+    <w:rsid w:val="00954753"/>
+    <w:rPr>
+      <w:color w:val="467886" w:themeColor="hyperlink"/>
+      <w:u w:val="single"/>
+    </w:rPr>
+  </w:style>
+  <w:style w:type="character" w:styleId="aa">
+    <w:name w:val="Unresolved Mention"/>
+    <w:basedOn w:val="a0"/>
+    <w:uiPriority w:val="99"/>
+    <w:semiHidden/>
+    <w:unhideWhenUsed/>
+    <w:rsid w:val="00954753"/>
+    <w:rPr>
+      <w:color w:val="605E5C"/>
+      <w:shd w:val="clear" w:color="auto" w:fill="E1DFDD"/>
     </w:rPr>
   </w:style>
 </w:styles>

</xml_diff>

<commit_message>
Chapter 3 full done
</commit_message>
<xml_diff>
--- a/KVDDokumentacija_GodotSpele_Sidorcenko.docx
+++ b/KVDDokumentacija_GodotSpele_Sidorcenko.docx
@@ -9,9 +9,6 @@
         <w:jc w:val="center"/>
       </w:pPr>
       <w:r>
-        <w:rPr>
-          <w:noProof/>
-        </w:rPr>
         <w:drawing>
           <wp:inline distT="0" distB="0" distL="0" distR="0" wp14:anchorId="004B529F" wp14:editId="64AD3E34">
             <wp:extent cx="1455166" cy="513080"/>
@@ -1626,12 +1623,21 @@
         </w:rPr>
         <w:tab/>
       </w:r>
+      <w:proofErr w:type="spellStart"/>
       <w:r>
         <w:rPr>
           <w:color w:val="auto"/>
           <w:sz w:val="24"/>
         </w:rPr>
-        <w:t xml:space="preserve">Lietojumgadījumu diagramma </w:t>
+        <w:t>Lietojumgadījumu</w:t>
+      </w:r>
+      <w:proofErr w:type="spellEnd"/>
+      <w:r>
+        <w:rPr>
+          <w:color w:val="auto"/>
+          <w:sz w:val="24"/>
+        </w:rPr>
+        <w:t xml:space="preserve"> diagramma </w:t>
       </w:r>
       <w:r>
         <w:rPr>
@@ -1640,7 +1646,47 @@
           <w:color w:val="auto"/>
           <w:sz w:val="24"/>
         </w:rPr>
-        <w:t>(Use Case)</w:t>
+        <w:t>(</w:t>
+      </w:r>
+      <w:proofErr w:type="spellStart"/>
+      <w:r>
+        <w:rPr>
+          <w:i/>
+          <w:iCs/>
+          <w:color w:val="auto"/>
+          <w:sz w:val="24"/>
+        </w:rPr>
+        <w:t>Use</w:t>
+      </w:r>
+      <w:proofErr w:type="spellEnd"/>
+      <w:r>
+        <w:rPr>
+          <w:i/>
+          <w:iCs/>
+          <w:color w:val="auto"/>
+          <w:sz w:val="24"/>
+        </w:rPr>
+        <w:t xml:space="preserve"> </w:t>
+      </w:r>
+      <w:proofErr w:type="spellStart"/>
+      <w:r>
+        <w:rPr>
+          <w:i/>
+          <w:iCs/>
+          <w:color w:val="auto"/>
+          <w:sz w:val="24"/>
+        </w:rPr>
+        <w:t>Case</w:t>
+      </w:r>
+      <w:proofErr w:type="spellEnd"/>
+      <w:r>
+        <w:rPr>
+          <w:i/>
+          <w:iCs/>
+          <w:color w:val="auto"/>
+          <w:sz w:val="24"/>
+        </w:rPr>
+        <w:t>)</w:t>
       </w:r>
       <w:r>
         <w:rPr>
@@ -1728,7 +1774,27 @@
           <w:color w:val="auto"/>
           <w:sz w:val="24"/>
         </w:rPr>
-        <w:t>(Activity)</w:t>
+        <w:t>(</w:t>
+      </w:r>
+      <w:proofErr w:type="spellStart"/>
+      <w:r>
+        <w:rPr>
+          <w:i/>
+          <w:iCs/>
+          <w:color w:val="auto"/>
+          <w:sz w:val="24"/>
+        </w:rPr>
+        <w:t>Activity</w:t>
+      </w:r>
+      <w:proofErr w:type="spellEnd"/>
+      <w:r>
+        <w:rPr>
+          <w:i/>
+          <w:iCs/>
+          <w:color w:val="auto"/>
+          <w:sz w:val="24"/>
+        </w:rPr>
+        <w:t>)</w:t>
       </w:r>
       <w:r>
         <w:rPr>
@@ -1816,7 +1882,27 @@
           <w:color w:val="auto"/>
           <w:sz w:val="24"/>
         </w:rPr>
-        <w:t>(State)</w:t>
+        <w:t>(</w:t>
+      </w:r>
+      <w:proofErr w:type="spellStart"/>
+      <w:r>
+        <w:rPr>
+          <w:i/>
+          <w:iCs/>
+          <w:color w:val="auto"/>
+          <w:sz w:val="24"/>
+        </w:rPr>
+        <w:t>State</w:t>
+      </w:r>
+      <w:proofErr w:type="spellEnd"/>
+      <w:r>
+        <w:rPr>
+          <w:i/>
+          <w:iCs/>
+          <w:color w:val="auto"/>
+          <w:sz w:val="24"/>
+        </w:rPr>
+        <w:t>)</w:t>
       </w:r>
       <w:r>
         <w:rPr>
@@ -3440,9 +3526,6 @@
     <w:p>
       <w:pPr>
         <w:pStyle w:val="2"/>
-        <w:rPr>
-          <w:lang w:val="ru-RU"/>
-        </w:rPr>
       </w:pPr>
       <w:bookmarkStart w:id="4" w:name="_Toc212298885"/>
       <w:r>
@@ -3714,23 +3797,7 @@
           <w:bCs/>
           <w:sz w:val="24"/>
         </w:rPr>
-        <w:t>FP.</w:t>
-      </w:r>
-      <w:r>
-        <w:rPr>
-          <w:b/>
-          <w:bCs/>
-          <w:sz w:val="24"/>
-        </w:rPr>
-        <w:t>2</w:t>
-      </w:r>
-      <w:r>
-        <w:rPr>
-          <w:b/>
-          <w:bCs/>
-          <w:sz w:val="24"/>
-        </w:rPr>
-        <w:t xml:space="preserve">. </w:t>
+        <w:t xml:space="preserve">FP.2. </w:t>
       </w:r>
       <w:r>
         <w:rPr>
@@ -3937,31 +4004,7 @@
           <w:bCs/>
           <w:sz w:val="24"/>
         </w:rPr>
-        <w:t>FP.</w:t>
-      </w:r>
-      <w:r>
-        <w:rPr>
-          <w:b/>
-          <w:bCs/>
-          <w:sz w:val="24"/>
-        </w:rPr>
-        <w:t>3</w:t>
-      </w:r>
-      <w:r>
-        <w:rPr>
-          <w:b/>
-          <w:bCs/>
-          <w:sz w:val="24"/>
-        </w:rPr>
-        <w:t xml:space="preserve">. </w:t>
-      </w:r>
-      <w:r>
-        <w:rPr>
-          <w:b/>
-          <w:bCs/>
-          <w:sz w:val="24"/>
-        </w:rPr>
-        <w:t>Līmeņu saraksta attēlošana</w:t>
+        <w:t>FP.3. Līmeņu saraksta attēlošana</w:t>
       </w:r>
     </w:p>
     <w:p>
@@ -4179,31 +4222,7 @@
           <w:bCs/>
           <w:sz w:val="24"/>
         </w:rPr>
-        <w:t>FP.</w:t>
-      </w:r>
-      <w:r>
-        <w:rPr>
-          <w:b/>
-          <w:bCs/>
-          <w:sz w:val="24"/>
-        </w:rPr>
-        <w:t>4</w:t>
-      </w:r>
-      <w:r>
-        <w:rPr>
-          <w:b/>
-          <w:bCs/>
-          <w:sz w:val="24"/>
-        </w:rPr>
-        <w:t xml:space="preserve">. </w:t>
-      </w:r>
-      <w:r>
-        <w:rPr>
-          <w:b/>
-          <w:bCs/>
-          <w:sz w:val="24"/>
-        </w:rPr>
-        <w:t xml:space="preserve">Līmeņu </w:t>
+        <w:t xml:space="preserve">FP.4. Līmeņu </w:t>
       </w:r>
       <w:r>
         <w:rPr>
@@ -4431,31 +4450,7 @@
           <w:bCs/>
           <w:sz w:val="24"/>
         </w:rPr>
-        <w:t>FP.</w:t>
-      </w:r>
-      <w:r>
-        <w:rPr>
-          <w:b/>
-          <w:bCs/>
-          <w:sz w:val="24"/>
-        </w:rPr>
-        <w:t>5</w:t>
-      </w:r>
-      <w:r>
-        <w:rPr>
-          <w:b/>
-          <w:bCs/>
-          <w:sz w:val="24"/>
-        </w:rPr>
-        <w:t xml:space="preserve">. </w:t>
-      </w:r>
-      <w:r>
-        <w:rPr>
-          <w:b/>
-          <w:bCs/>
-          <w:sz w:val="24"/>
-        </w:rPr>
-        <w:t>Zvaigžņu vērtēšanas</w:t>
+        <w:t>FP.5. Zvaigžņu vērtēšanas</w:t>
       </w:r>
       <w:r>
         <w:rPr>
@@ -4699,15 +4694,7 @@
           <w:bCs/>
           <w:sz w:val="24"/>
         </w:rPr>
-        <w:t xml:space="preserve">. </w:t>
-      </w:r>
-      <w:r>
-        <w:rPr>
-          <w:b/>
-          <w:bCs/>
-          <w:sz w:val="24"/>
-        </w:rPr>
-        <w:t>Līmeņa sākšana</w:t>
+        <w:t>. Līmeņa sākšana</w:t>
       </w:r>
     </w:p>
     <w:p>
@@ -4900,31 +4887,7 @@
           <w:bCs/>
           <w:sz w:val="24"/>
         </w:rPr>
-        <w:t>FP.</w:t>
-      </w:r>
-      <w:r>
-        <w:rPr>
-          <w:b/>
-          <w:bCs/>
-          <w:sz w:val="24"/>
-        </w:rPr>
-        <w:t>7</w:t>
-      </w:r>
-      <w:r>
-        <w:rPr>
-          <w:b/>
-          <w:bCs/>
-          <w:sz w:val="24"/>
-        </w:rPr>
-        <w:t xml:space="preserve">. </w:t>
-      </w:r>
-      <w:r>
-        <w:rPr>
-          <w:b/>
-          <w:bCs/>
-          <w:sz w:val="24"/>
-        </w:rPr>
-        <w:t>Pauzes izvēlne</w:t>
+        <w:t>FP.7. Pauzes izvēlne</w:t>
       </w:r>
     </w:p>
     <w:p>
@@ -5118,31 +5081,7 @@
           <w:bCs/>
           <w:sz w:val="24"/>
         </w:rPr>
-        <w:t>FP.</w:t>
-      </w:r>
-      <w:r>
-        <w:rPr>
-          <w:b/>
-          <w:bCs/>
-          <w:sz w:val="24"/>
-        </w:rPr>
-        <w:t>8</w:t>
-      </w:r>
-      <w:r>
-        <w:rPr>
-          <w:b/>
-          <w:bCs/>
-          <w:sz w:val="24"/>
-        </w:rPr>
-        <w:t xml:space="preserve">. </w:t>
-      </w:r>
-      <w:r>
-        <w:rPr>
-          <w:b/>
-          <w:bCs/>
-          <w:sz w:val="24"/>
-        </w:rPr>
-        <w:t>Līmeņa</w:t>
+        <w:t>FP.8. Līmeņa</w:t>
       </w:r>
       <w:r>
         <w:rPr>
@@ -5350,31 +5289,7 @@
           <w:bCs/>
           <w:sz w:val="24"/>
         </w:rPr>
-        <w:t>FP.</w:t>
-      </w:r>
-      <w:r>
-        <w:rPr>
-          <w:b/>
-          <w:bCs/>
-          <w:sz w:val="24"/>
-        </w:rPr>
-        <w:t>9</w:t>
-      </w:r>
-      <w:r>
-        <w:rPr>
-          <w:b/>
-          <w:bCs/>
-          <w:sz w:val="24"/>
-        </w:rPr>
-        <w:t xml:space="preserve">. </w:t>
-      </w:r>
-      <w:r>
-        <w:rPr>
-          <w:b/>
-          <w:bCs/>
-          <w:sz w:val="24"/>
-        </w:rPr>
-        <w:t>Progresu saglabāšana</w:t>
+        <w:t>FP.9. Progresu saglabāšana</w:t>
       </w:r>
     </w:p>
     <w:p>
@@ -5561,31 +5476,7 @@
           <w:sz w:val="24"/>
         </w:rPr>
         <w:lastRenderedPageBreak/>
-        <w:t>FP.</w:t>
-      </w:r>
-      <w:r>
-        <w:rPr>
-          <w:b/>
-          <w:bCs/>
-          <w:sz w:val="24"/>
-        </w:rPr>
-        <w:t>10</w:t>
-      </w:r>
-      <w:r>
-        <w:rPr>
-          <w:b/>
-          <w:bCs/>
-          <w:sz w:val="24"/>
-        </w:rPr>
-        <w:t xml:space="preserve">. </w:t>
-      </w:r>
-      <w:r>
-        <w:rPr>
-          <w:b/>
-          <w:bCs/>
-          <w:sz w:val="24"/>
-        </w:rPr>
-        <w:t>Progresu saglabāšana</w:t>
+        <w:t>FP.10. Progresu saglabāšana</w:t>
       </w:r>
     </w:p>
     <w:p>
@@ -5777,31 +5668,7 @@
           <w:bCs/>
           <w:sz w:val="24"/>
         </w:rPr>
-        <w:t>FP.</w:t>
-      </w:r>
-      <w:r>
-        <w:rPr>
-          <w:b/>
-          <w:bCs/>
-          <w:sz w:val="24"/>
-        </w:rPr>
-        <w:t>11</w:t>
-      </w:r>
-      <w:r>
-        <w:rPr>
-          <w:b/>
-          <w:bCs/>
-          <w:sz w:val="24"/>
-        </w:rPr>
-        <w:t xml:space="preserve">. </w:t>
-      </w:r>
-      <w:r>
-        <w:rPr>
-          <w:b/>
-          <w:bCs/>
-          <w:sz w:val="24"/>
-        </w:rPr>
-        <w:t>Iestatījumu logs</w:t>
+        <w:t>FP.11. Iestatījumu logs</w:t>
       </w:r>
     </w:p>
     <w:p>
@@ -5987,31 +5854,7 @@
           <w:bCs/>
           <w:sz w:val="24"/>
         </w:rPr>
-        <w:t>FP.</w:t>
-      </w:r>
-      <w:r>
-        <w:rPr>
-          <w:b/>
-          <w:bCs/>
-          <w:sz w:val="24"/>
-        </w:rPr>
-        <w:t>12</w:t>
-      </w:r>
-      <w:r>
-        <w:rPr>
-          <w:b/>
-          <w:bCs/>
-          <w:sz w:val="24"/>
-        </w:rPr>
-        <w:t xml:space="preserve">. </w:t>
-      </w:r>
-      <w:r>
-        <w:rPr>
-          <w:b/>
-          <w:bCs/>
-          <w:sz w:val="24"/>
-        </w:rPr>
-        <w:t>Skaņas skaļuma kontrole</w:t>
+        <w:t>FP.12. Skaņas skaļuma kontrole</w:t>
       </w:r>
     </w:p>
     <w:p>
@@ -6255,31 +6098,7 @@
           <w:bCs/>
           <w:sz w:val="24"/>
         </w:rPr>
-        <w:t>FP.</w:t>
-      </w:r>
-      <w:r>
-        <w:rPr>
-          <w:b/>
-          <w:bCs/>
-          <w:sz w:val="24"/>
-        </w:rPr>
-        <w:t>13</w:t>
-      </w:r>
-      <w:r>
-        <w:rPr>
-          <w:b/>
-          <w:bCs/>
-          <w:sz w:val="24"/>
-        </w:rPr>
-        <w:t xml:space="preserve">. </w:t>
-      </w:r>
-      <w:r>
-        <w:rPr>
-          <w:b/>
-          <w:bCs/>
-          <w:sz w:val="24"/>
-        </w:rPr>
-        <w:t>Veikala attēlošana</w:t>
+        <w:t>FP.13. Veikala attēlošana</w:t>
       </w:r>
     </w:p>
     <w:p>
@@ -6484,31 +6303,7 @@
           <w:bCs/>
           <w:sz w:val="24"/>
         </w:rPr>
-        <w:t>FP.</w:t>
-      </w:r>
-      <w:r>
-        <w:rPr>
-          <w:b/>
-          <w:bCs/>
-          <w:sz w:val="24"/>
-        </w:rPr>
-        <w:t>14</w:t>
-      </w:r>
-      <w:r>
-        <w:rPr>
-          <w:b/>
-          <w:bCs/>
-          <w:sz w:val="24"/>
-        </w:rPr>
-        <w:t xml:space="preserve">. </w:t>
-      </w:r>
-      <w:r>
-        <w:rPr>
-          <w:b/>
-          <w:bCs/>
-          <w:sz w:val="24"/>
-        </w:rPr>
-        <w:t>Pirkuma veikšana veikalā</w:t>
+        <w:t>FP.14. Pirkuma veikšana veikalā</w:t>
       </w:r>
     </w:p>
     <w:p>
@@ -6770,31 +6565,7 @@
           <w:bCs/>
           <w:sz w:val="24"/>
         </w:rPr>
-        <w:t>FP.</w:t>
-      </w:r>
-      <w:r>
-        <w:rPr>
-          <w:b/>
-          <w:bCs/>
-          <w:sz w:val="24"/>
-        </w:rPr>
-        <w:t>15</w:t>
-      </w:r>
-      <w:r>
-        <w:rPr>
-          <w:b/>
-          <w:bCs/>
-          <w:sz w:val="24"/>
-        </w:rPr>
-        <w:t xml:space="preserve">. </w:t>
-      </w:r>
-      <w:r>
-        <w:rPr>
-          <w:b/>
-          <w:bCs/>
-          <w:sz w:val="24"/>
-        </w:rPr>
-        <w:t>Skapja attēlošana</w:t>
+        <w:t>FP.15. Skapja attēlošana</w:t>
       </w:r>
     </w:p>
     <w:p>
@@ -7010,31 +6781,7 @@
           <w:bCs/>
           <w:sz w:val="24"/>
         </w:rPr>
-        <w:t>FP.</w:t>
-      </w:r>
-      <w:r>
-        <w:rPr>
-          <w:b/>
-          <w:bCs/>
-          <w:sz w:val="24"/>
-        </w:rPr>
-        <w:t>16</w:t>
-      </w:r>
-      <w:r>
-        <w:rPr>
-          <w:b/>
-          <w:bCs/>
-          <w:sz w:val="24"/>
-        </w:rPr>
-        <w:t xml:space="preserve">. </w:t>
-      </w:r>
-      <w:r>
-        <w:rPr>
-          <w:b/>
-          <w:bCs/>
-          <w:sz w:val="24"/>
-        </w:rPr>
-        <w:t>Tērpa izvēle</w:t>
+        <w:t>FP.16. Tērpa izvēle</w:t>
       </w:r>
     </w:p>
     <w:p>
@@ -7238,31 +6985,7 @@
           <w:bCs/>
           <w:sz w:val="24"/>
         </w:rPr>
-        <w:t>FP.</w:t>
-      </w:r>
-      <w:r>
-        <w:rPr>
-          <w:b/>
-          <w:bCs/>
-          <w:sz w:val="24"/>
-        </w:rPr>
-        <w:t>17</w:t>
-      </w:r>
-      <w:r>
-        <w:rPr>
-          <w:b/>
-          <w:bCs/>
-          <w:sz w:val="24"/>
-        </w:rPr>
-        <w:t xml:space="preserve">. </w:t>
-      </w:r>
-      <w:r>
-        <w:rPr>
-          <w:b/>
-          <w:bCs/>
-          <w:sz w:val="24"/>
-        </w:rPr>
-        <w:t>Atgriešanās uz galveno izvēlni</w:t>
+        <w:t>FP.17. Atgriešanās uz galveno izvēlni</w:t>
       </w:r>
     </w:p>
     <w:p>
@@ -7461,31 +7184,7 @@
           <w:bCs/>
           <w:sz w:val="24"/>
         </w:rPr>
-        <w:t>FP.</w:t>
-      </w:r>
-      <w:r>
-        <w:rPr>
-          <w:b/>
-          <w:bCs/>
-          <w:sz w:val="24"/>
-        </w:rPr>
-        <w:t>18</w:t>
-      </w:r>
-      <w:r>
-        <w:rPr>
-          <w:b/>
-          <w:bCs/>
-          <w:sz w:val="24"/>
-        </w:rPr>
-        <w:t xml:space="preserve">. </w:t>
-      </w:r>
-      <w:r>
-        <w:rPr>
-          <w:b/>
-          <w:bCs/>
-          <w:sz w:val="24"/>
-        </w:rPr>
-        <w:t>Spēles aizvēršana</w:t>
+        <w:t>FP.18. Spēles aizvēršana</w:t>
       </w:r>
     </w:p>
     <w:p>
@@ -7689,40 +7388,7 @@
           <w:bCs/>
           <w:sz w:val="24"/>
         </w:rPr>
-        <w:t>FP.</w:t>
-      </w:r>
-      <w:r>
-        <w:rPr>
-          <w:b/>
-          <w:bCs/>
-          <w:sz w:val="24"/>
-        </w:rPr>
-        <w:t>1</w:t>
-      </w:r>
-      <w:r>
-        <w:rPr>
-          <w:b/>
-          <w:bCs/>
-          <w:sz w:val="24"/>
-          <w:lang w:val="ru-RU"/>
-        </w:rPr>
-        <w:t>9</w:t>
-      </w:r>
-      <w:r>
-        <w:rPr>
-          <w:b/>
-          <w:bCs/>
-          <w:sz w:val="24"/>
-        </w:rPr>
-        <w:t xml:space="preserve">. </w:t>
-      </w:r>
-      <w:r>
-        <w:rPr>
-          <w:b/>
-          <w:bCs/>
-          <w:sz w:val="24"/>
-        </w:rPr>
-        <w:t>Skaņas efekti</w:t>
+        <w:t>FP.19. Skaņas efekti</w:t>
       </w:r>
     </w:p>
     <w:p>
@@ -7940,31 +7606,7 @@
           <w:bCs/>
           <w:sz w:val="24"/>
         </w:rPr>
-        <w:t>FP.</w:t>
-      </w:r>
-      <w:r>
-        <w:rPr>
-          <w:b/>
-          <w:bCs/>
-          <w:sz w:val="24"/>
-        </w:rPr>
-        <w:t>20</w:t>
-      </w:r>
-      <w:r>
-        <w:rPr>
-          <w:b/>
-          <w:bCs/>
-          <w:sz w:val="24"/>
-        </w:rPr>
-        <w:t xml:space="preserve">. </w:t>
-      </w:r>
-      <w:r>
-        <w:rPr>
-          <w:b/>
-          <w:bCs/>
-          <w:sz w:val="24"/>
-        </w:rPr>
-        <w:t>Fona mūzika</w:t>
+        <w:t>FP.20. Fona mūzika</w:t>
       </w:r>
     </w:p>
     <w:p>
@@ -8171,31 +7813,7 @@
           <w:sz w:val="24"/>
         </w:rPr>
         <w:lastRenderedPageBreak/>
-        <w:t>FP.</w:t>
-      </w:r>
-      <w:r>
-        <w:rPr>
-          <w:b/>
-          <w:bCs/>
-          <w:sz w:val="24"/>
-        </w:rPr>
-        <w:t>21</w:t>
-      </w:r>
-      <w:r>
-        <w:rPr>
-          <w:b/>
-          <w:bCs/>
-          <w:sz w:val="24"/>
-        </w:rPr>
-        <w:t xml:space="preserve">. </w:t>
-      </w:r>
-      <w:r>
-        <w:rPr>
-          <w:b/>
-          <w:bCs/>
-          <w:sz w:val="24"/>
-        </w:rPr>
-        <w:t xml:space="preserve">Nākamā līmeņa </w:t>
+        <w:t xml:space="preserve">FP.21. Nākamā līmeņa </w:t>
       </w:r>
       <w:proofErr w:type="spellStart"/>
       <w:r>
@@ -8397,31 +8015,7 @@
           <w:bCs/>
           <w:sz w:val="24"/>
         </w:rPr>
-        <w:t>FP.</w:t>
-      </w:r>
-      <w:r>
-        <w:rPr>
-          <w:b/>
-          <w:bCs/>
-          <w:sz w:val="24"/>
-        </w:rPr>
-        <w:t>22</w:t>
-      </w:r>
-      <w:r>
-        <w:rPr>
-          <w:b/>
-          <w:bCs/>
-          <w:sz w:val="24"/>
-        </w:rPr>
-        <w:t xml:space="preserve">. </w:t>
-      </w:r>
-      <w:r>
-        <w:rPr>
-          <w:b/>
-          <w:bCs/>
-          <w:sz w:val="24"/>
-        </w:rPr>
-        <w:t>Autom</w:t>
+        <w:t>FP.22. Autom</w:t>
       </w:r>
       <w:r>
         <w:rPr>
@@ -8650,9 +8244,6 @@
     <w:p>
       <w:pPr>
         <w:pStyle w:val="2"/>
-        <w:rPr>
-          <w:lang w:val="ru-RU"/>
-        </w:rPr>
       </w:pPr>
       <w:bookmarkStart w:id="5" w:name="_Toc212298886"/>
       <w:r>
@@ -8718,93 +8309,135 @@
           <w:bCs/>
           <w:sz w:val="24"/>
         </w:rPr>
-        <w:t>NP.</w:t>
-      </w:r>
-      <w:r>
+        <w:t>NP.2. Saderība</w:t>
+      </w:r>
+    </w:p>
+    <w:p>
+      <w:pPr>
+        <w:spacing w:after="0" w:line="360" w:lineRule="auto"/>
+        <w:ind w:left="0" w:right="0" w:firstLine="851"/>
+        <w:rPr>
+          <w:sz w:val="24"/>
+        </w:rPr>
+      </w:pPr>
+      <w:r>
+        <w:rPr>
+          <w:sz w:val="24"/>
+        </w:rPr>
+        <w:t xml:space="preserve">Spēlei </w:t>
+      </w:r>
+      <w:r>
+        <w:rPr>
+          <w:sz w:val="24"/>
+        </w:rPr>
+        <w:t>jābūt saderīgai vismaz ar Windows operētājsistēm</w:t>
+      </w:r>
+      <w:r>
+        <w:rPr>
+          <w:sz w:val="24"/>
+        </w:rPr>
+        <w:t>u.</w:t>
+      </w:r>
+    </w:p>
+    <w:p>
+      <w:pPr>
+        <w:spacing w:after="0" w:line="360" w:lineRule="auto"/>
+        <w:ind w:left="0" w:right="0" w:firstLine="851"/>
         <w:rPr>
           <w:b/>
           <w:bCs/>
           <w:sz w:val="24"/>
         </w:rPr>
-        <w:t>2</w:t>
-      </w:r>
+      </w:pPr>
       <w:r>
         <w:rPr>
           <w:b/>
           <w:bCs/>
           <w:sz w:val="24"/>
         </w:rPr>
-        <w:t xml:space="preserve">. </w:t>
-      </w:r>
-      <w:r>
+        <w:t>NP.3. Lietojamība</w:t>
+      </w:r>
+    </w:p>
+    <w:p>
+      <w:pPr>
+        <w:spacing w:after="0" w:line="360" w:lineRule="auto"/>
+        <w:ind w:left="0" w:right="0" w:firstLine="851"/>
+        <w:rPr>
+          <w:sz w:val="24"/>
+        </w:rPr>
+      </w:pPr>
+      <w:r>
+        <w:rPr>
+          <w:sz w:val="24"/>
+        </w:rPr>
+        <w:t>Lietotāja interfeisam jābūt saprotamam un ērti izmantojamam bez apmācības.</w:t>
+      </w:r>
+    </w:p>
+    <w:p>
+      <w:pPr>
+        <w:spacing w:after="0" w:line="360" w:lineRule="auto"/>
+        <w:ind w:left="0" w:right="0" w:firstLine="851"/>
         <w:rPr>
           <w:b/>
           <w:bCs/>
           <w:sz w:val="24"/>
         </w:rPr>
-        <w:t>Saderība</w:t>
-      </w:r>
-    </w:p>
-    <w:p>
-      <w:pPr>
-        <w:spacing w:after="0" w:line="360" w:lineRule="auto"/>
-        <w:ind w:left="0" w:right="0" w:firstLine="851"/>
-        <w:rPr>
-          <w:sz w:val="24"/>
-        </w:rPr>
-      </w:pPr>
-      <w:r>
-        <w:rPr>
-          <w:sz w:val="24"/>
-        </w:rPr>
-        <w:t xml:space="preserve">Spēlei </w:t>
-      </w:r>
-      <w:r>
-        <w:rPr>
-          <w:sz w:val="24"/>
-        </w:rPr>
-        <w:t>jābūt saderīgai vismaz ar Windows operētājsistēm</w:t>
-      </w:r>
-      <w:r>
-        <w:rPr>
-          <w:sz w:val="24"/>
-        </w:rPr>
-        <w:t>u.</w:t>
-      </w:r>
-    </w:p>
-    <w:p>
-      <w:pPr>
-        <w:spacing w:after="0" w:line="360" w:lineRule="auto"/>
-        <w:ind w:left="0" w:right="0" w:firstLine="851"/>
+      </w:pPr>
+      <w:r>
         <w:rPr>
           <w:b/>
           <w:bCs/>
           <w:sz w:val="24"/>
         </w:rPr>
-      </w:pPr>
+        <w:t xml:space="preserve">NP.4. </w:t>
+      </w:r>
       <w:r>
         <w:rPr>
           <w:b/>
           <w:bCs/>
           <w:sz w:val="24"/>
         </w:rPr>
-        <w:t>NP.</w:t>
-      </w:r>
-      <w:r>
+        <w:t>Datu drošība</w:t>
+      </w:r>
+    </w:p>
+    <w:p>
+      <w:pPr>
+        <w:spacing w:after="0" w:line="360" w:lineRule="auto"/>
+        <w:ind w:left="0" w:right="0" w:firstLine="851"/>
+        <w:rPr>
+          <w:sz w:val="24"/>
+        </w:rPr>
+      </w:pPr>
+      <w:r>
+        <w:rPr>
+          <w:sz w:val="24"/>
+        </w:rPr>
+        <w:t>Lietotāja iestatījumi un progress</w:t>
+      </w:r>
+      <w:r>
+        <w:rPr>
+          <w:sz w:val="24"/>
+        </w:rPr>
+        <w:t xml:space="preserve"> jāglabā droši, bez bojājumiem.</w:t>
+      </w:r>
+    </w:p>
+    <w:p>
+      <w:pPr>
+        <w:spacing w:after="0" w:line="360" w:lineRule="auto"/>
+        <w:ind w:left="0" w:right="0" w:firstLine="851"/>
         <w:rPr>
           <w:b/>
           <w:bCs/>
           <w:sz w:val="24"/>
         </w:rPr>
-        <w:t>3</w:t>
-      </w:r>
+      </w:pPr>
       <w:r>
         <w:rPr>
           <w:b/>
           <w:bCs/>
           <w:sz w:val="24"/>
         </w:rPr>
-        <w:t xml:space="preserve">. </w:t>
+        <w:t xml:space="preserve">NP.5. </w:t>
       </w:r>
       <w:r>
         <w:rPr>
@@ -8812,22 +8445,34 @@
           <w:bCs/>
           <w:sz w:val="24"/>
         </w:rPr>
-        <w:t>Lietojamība</w:t>
-      </w:r>
-    </w:p>
-    <w:p>
-      <w:pPr>
-        <w:spacing w:after="0" w:line="360" w:lineRule="auto"/>
-        <w:ind w:left="0" w:right="0" w:firstLine="851"/>
-        <w:rPr>
-          <w:sz w:val="24"/>
-        </w:rPr>
-      </w:pPr>
-      <w:r>
-        <w:rPr>
-          <w:sz w:val="24"/>
-        </w:rPr>
-        <w:t>Lietotāja interfeisam jābūt saprotamam un ērti izmantojamam bez apmācības.</w:t>
+        <w:t>Atjaunošana</w:t>
+      </w:r>
+    </w:p>
+    <w:p>
+      <w:pPr>
+        <w:spacing w:after="0" w:line="360" w:lineRule="auto"/>
+        <w:ind w:left="0" w:right="0" w:firstLine="851"/>
+        <w:rPr>
+          <w:sz w:val="24"/>
+        </w:rPr>
+      </w:pPr>
+      <w:r>
+        <w:rPr>
+          <w:sz w:val="24"/>
+        </w:rPr>
+        <w:t xml:space="preserve">Spēlei jābūt viegli papildināmai ar jauniem līmeņiem un </w:t>
+      </w:r>
+      <w:r>
+        <w:rPr>
+          <w:sz w:val="24"/>
+        </w:rPr>
+        <w:t>funkcijām</w:t>
+      </w:r>
+      <w:r>
+        <w:rPr>
+          <w:sz w:val="24"/>
+        </w:rPr>
+        <w:t>.</w:t>
       </w:r>
     </w:p>
     <w:p>
@@ -8846,7 +8491,7 @@
           <w:bCs/>
           <w:sz w:val="24"/>
         </w:rPr>
-        <w:t>NP.</w:t>
+        <w:t xml:space="preserve">NP.6. </w:t>
       </w:r>
       <w:r>
         <w:rPr>
@@ -8854,71 +8499,90 @@
           <w:bCs/>
           <w:sz w:val="24"/>
         </w:rPr>
-        <w:t>4</w:t>
-      </w:r>
-      <w:r>
+        <w:t>Estētika</w:t>
+      </w:r>
+    </w:p>
+    <w:p>
+      <w:pPr>
+        <w:spacing w:after="0" w:line="360" w:lineRule="auto"/>
+        <w:ind w:left="0" w:right="0" w:firstLine="851"/>
+        <w:rPr>
+          <w:sz w:val="24"/>
+        </w:rPr>
+      </w:pPr>
+      <w:r>
+        <w:rPr>
+          <w:sz w:val="24"/>
+        </w:rPr>
+        <w:t>Grafikai un animācijām jābūt vienotā stilā un vizuāli pievilcīgām.</w:t>
+      </w:r>
+    </w:p>
+    <w:p>
+      <w:pPr>
+        <w:spacing w:after="0" w:line="360" w:lineRule="auto"/>
+        <w:ind w:left="0" w:right="0" w:firstLine="851"/>
         <w:rPr>
           <w:b/>
           <w:bCs/>
           <w:sz w:val="24"/>
         </w:rPr>
-        <w:t xml:space="preserve">. </w:t>
-      </w:r>
+      </w:pPr>
       <w:r>
         <w:rPr>
           <w:b/>
           <w:bCs/>
           <w:sz w:val="24"/>
         </w:rPr>
-        <w:t>Datu drošība</w:t>
-      </w:r>
-    </w:p>
-    <w:p>
-      <w:pPr>
-        <w:spacing w:after="0" w:line="360" w:lineRule="auto"/>
-        <w:ind w:left="0" w:right="0" w:firstLine="851"/>
-        <w:rPr>
-          <w:sz w:val="24"/>
-        </w:rPr>
-      </w:pPr>
-      <w:r>
-        <w:rPr>
-          <w:sz w:val="24"/>
-        </w:rPr>
-        <w:t>Lietotāja iestatījumi un progress</w:t>
-      </w:r>
-      <w:r>
-        <w:rPr>
-          <w:sz w:val="24"/>
-        </w:rPr>
-        <w:t xml:space="preserve"> jāglabā droši, bez bojājumiem.</w:t>
-      </w:r>
-    </w:p>
-    <w:p>
-      <w:pPr>
-        <w:spacing w:after="0" w:line="360" w:lineRule="auto"/>
-        <w:ind w:left="0" w:right="0" w:firstLine="851"/>
+        <w:t xml:space="preserve">NP.7. </w:t>
+      </w:r>
+      <w:r>
         <w:rPr>
           <w:b/>
           <w:bCs/>
           <w:sz w:val="24"/>
         </w:rPr>
-      </w:pPr>
-      <w:r>
+        <w:t>Koda kvalitāte</w:t>
+      </w:r>
+    </w:p>
+    <w:p>
+      <w:pPr>
+        <w:spacing w:after="0" w:line="360" w:lineRule="auto"/>
+        <w:ind w:left="0" w:right="0" w:firstLine="851"/>
+        <w:rPr>
+          <w:sz w:val="24"/>
+        </w:rPr>
+      </w:pPr>
+      <w:r>
+        <w:rPr>
+          <w:sz w:val="24"/>
+        </w:rPr>
+        <w:t xml:space="preserve">Projekta kodam </w:t>
+      </w:r>
+      <w:r>
+        <w:rPr>
+          <w:sz w:val="24"/>
+        </w:rPr>
+        <w:t>jābūt strukturētam un viegli uzturamam.</w:t>
+      </w:r>
+    </w:p>
+    <w:p>
+      <w:pPr>
+        <w:spacing w:after="0" w:line="360" w:lineRule="auto"/>
+        <w:ind w:left="0" w:right="0" w:firstLine="851"/>
         <w:rPr>
           <w:b/>
           <w:bCs/>
           <w:sz w:val="24"/>
         </w:rPr>
-        <w:t>NP.</w:t>
-      </w:r>
+      </w:pPr>
       <w:r>
         <w:rPr>
           <w:b/>
           <w:bCs/>
           <w:sz w:val="24"/>
         </w:rPr>
-        <w:t>5</w:t>
+        <w:lastRenderedPageBreak/>
+        <w:t xml:space="preserve">NP.8. </w:t>
       </w:r>
       <w:r>
         <w:rPr>
@@ -8926,389 +8590,145 @@
           <w:bCs/>
           <w:sz w:val="24"/>
         </w:rPr>
-        <w:t xml:space="preserve">. </w:t>
-      </w:r>
-      <w:r>
+        <w:t>Atmiņas patēriņš</w:t>
+      </w:r>
+    </w:p>
+    <w:p>
+      <w:pPr>
+        <w:spacing w:after="0" w:line="360" w:lineRule="auto"/>
+        <w:ind w:left="0" w:right="0" w:firstLine="851"/>
+        <w:rPr>
+          <w:sz w:val="24"/>
+        </w:rPr>
+      </w:pPr>
+      <w:r>
+        <w:rPr>
+          <w:sz w:val="24"/>
+        </w:rPr>
+        <w:t xml:space="preserve">Spēles atmiņas patēriņam jābūt ne vairāk kā </w:t>
+      </w:r>
+      <w:r>
+        <w:rPr>
+          <w:sz w:val="24"/>
+        </w:rPr>
+        <w:t>1 GB.</w:t>
+      </w:r>
+    </w:p>
+    <w:p>
+      <w:pPr>
+        <w:spacing w:after="0" w:line="360" w:lineRule="auto"/>
+        <w:ind w:left="0" w:right="0" w:firstLine="851"/>
         <w:rPr>
           <w:b/>
           <w:bCs/>
           <w:sz w:val="24"/>
         </w:rPr>
-        <w:t>Atjaunošana</w:t>
-      </w:r>
-    </w:p>
-    <w:p>
-      <w:pPr>
-        <w:spacing w:after="0" w:line="360" w:lineRule="auto"/>
-        <w:ind w:left="0" w:right="0" w:firstLine="851"/>
-        <w:rPr>
-          <w:sz w:val="24"/>
-        </w:rPr>
-      </w:pPr>
-      <w:r>
-        <w:rPr>
-          <w:sz w:val="24"/>
-        </w:rPr>
-        <w:t xml:space="preserve">Spēlei jābūt viegli papildināmai ar jauniem līmeņiem un </w:t>
-      </w:r>
-      <w:r>
-        <w:rPr>
-          <w:sz w:val="24"/>
-        </w:rPr>
-        <w:t>funkcijām</w:t>
-      </w:r>
-      <w:r>
-        <w:rPr>
-          <w:sz w:val="24"/>
-        </w:rPr>
-        <w:t>.</w:t>
-      </w:r>
-    </w:p>
-    <w:p>
-      <w:pPr>
-        <w:spacing w:after="0" w:line="360" w:lineRule="auto"/>
-        <w:ind w:left="0" w:right="0" w:firstLine="851"/>
+      </w:pPr>
+      <w:r>
         <w:rPr>
           <w:b/>
           <w:bCs/>
           <w:sz w:val="24"/>
-          <w:lang w:val="ru-RU"/>
-        </w:rPr>
-      </w:pPr>
+        </w:rPr>
+        <w:t xml:space="preserve">NP.9. </w:t>
+      </w:r>
+      <w:proofErr w:type="spellStart"/>
       <w:r>
         <w:rPr>
           <w:b/>
           <w:bCs/>
           <w:sz w:val="24"/>
         </w:rPr>
-        <w:t>NP.</w:t>
-      </w:r>
+        <w:t>Ielādes</w:t>
+      </w:r>
+      <w:proofErr w:type="spellEnd"/>
       <w:r>
         <w:rPr>
           <w:b/>
           <w:bCs/>
           <w:sz w:val="24"/>
         </w:rPr>
-        <w:t>6</w:t>
-      </w:r>
-      <w:r>
+        <w:t xml:space="preserve"> indikators</w:t>
+      </w:r>
+    </w:p>
+    <w:p>
+      <w:pPr>
+        <w:spacing w:after="0" w:line="360" w:lineRule="auto"/>
+        <w:ind w:left="0" w:right="0" w:firstLine="851"/>
+        <w:rPr>
+          <w:sz w:val="24"/>
+        </w:rPr>
+      </w:pPr>
+      <w:proofErr w:type="spellStart"/>
+      <w:r>
+        <w:rPr>
+          <w:sz w:val="24"/>
+        </w:rPr>
+        <w:t>Ielādes</w:t>
+      </w:r>
+      <w:proofErr w:type="spellEnd"/>
+      <w:r>
+        <w:rPr>
+          <w:sz w:val="24"/>
+        </w:rPr>
+        <w:t xml:space="preserve"> laikā jābūt redzamam progresam </w:t>
+      </w:r>
+      <w:r>
+        <w:rPr>
+          <w:sz w:val="24"/>
+        </w:rPr>
+        <w:t>vai animācijai.</w:t>
+      </w:r>
+    </w:p>
+    <w:p>
+      <w:pPr>
+        <w:spacing w:after="0" w:line="360" w:lineRule="auto"/>
+        <w:ind w:left="0" w:right="0" w:firstLine="851"/>
         <w:rPr>
           <w:b/>
           <w:bCs/>
           <w:sz w:val="24"/>
         </w:rPr>
-        <w:t xml:space="preserve">. </w:t>
-      </w:r>
+      </w:pPr>
       <w:r>
         <w:rPr>
           <w:b/>
           <w:bCs/>
           <w:sz w:val="24"/>
         </w:rPr>
-        <w:t>Estētika</w:t>
-      </w:r>
-    </w:p>
-    <w:p>
-      <w:pPr>
-        <w:spacing w:after="0" w:line="360" w:lineRule="auto"/>
-        <w:ind w:left="0" w:right="0" w:firstLine="851"/>
-        <w:rPr>
-          <w:sz w:val="24"/>
-        </w:rPr>
-      </w:pPr>
-      <w:r>
-        <w:rPr>
-          <w:sz w:val="24"/>
-        </w:rPr>
-        <w:t>Grafikai un animācijām jābūt vienotā stilā un vizuāli pievilcīgām.</w:t>
-      </w:r>
-    </w:p>
-    <w:p>
-      <w:pPr>
-        <w:spacing w:after="0" w:line="360" w:lineRule="auto"/>
-        <w:ind w:left="0" w:right="0" w:firstLine="851"/>
-        <w:rPr>
-          <w:b/>
-          <w:bCs/>
-          <w:sz w:val="24"/>
-        </w:rPr>
-      </w:pPr>
-      <w:r>
-        <w:rPr>
-          <w:b/>
-          <w:bCs/>
-          <w:sz w:val="24"/>
-        </w:rPr>
-        <w:t>NP.</w:t>
-      </w:r>
-      <w:r>
-        <w:rPr>
-          <w:b/>
-          <w:bCs/>
-          <w:sz w:val="24"/>
-        </w:rPr>
-        <w:t>7</w:t>
-      </w:r>
-      <w:r>
-        <w:rPr>
-          <w:b/>
-          <w:bCs/>
-          <w:sz w:val="24"/>
-        </w:rPr>
-        <w:t xml:space="preserve">. </w:t>
-      </w:r>
-      <w:r>
-        <w:rPr>
-          <w:b/>
-          <w:bCs/>
-          <w:sz w:val="24"/>
-        </w:rPr>
-        <w:t>Koda kvalitāte</w:t>
-      </w:r>
-    </w:p>
-    <w:p>
-      <w:pPr>
-        <w:spacing w:after="0" w:line="360" w:lineRule="auto"/>
-        <w:ind w:left="0" w:right="0" w:firstLine="851"/>
-        <w:rPr>
-          <w:sz w:val="24"/>
-        </w:rPr>
-      </w:pPr>
-      <w:r>
-        <w:rPr>
-          <w:sz w:val="24"/>
-        </w:rPr>
-        <w:t xml:space="preserve">Projekta kodam </w:t>
-      </w:r>
-      <w:r>
-        <w:rPr>
-          <w:sz w:val="24"/>
-        </w:rPr>
-        <w:t>jābūt strukturētam un viegli uzturamam.</w:t>
-      </w:r>
-    </w:p>
-    <w:p>
-      <w:pPr>
-        <w:spacing w:after="0" w:line="360" w:lineRule="auto"/>
-        <w:ind w:left="0" w:right="0" w:firstLine="851"/>
-        <w:rPr>
-          <w:b/>
-          <w:bCs/>
-          <w:sz w:val="24"/>
-        </w:rPr>
-      </w:pPr>
-      <w:r>
-        <w:rPr>
-          <w:b/>
-          <w:bCs/>
-          <w:sz w:val="24"/>
-        </w:rPr>
-        <w:lastRenderedPageBreak/>
-        <w:t>NP.</w:t>
-      </w:r>
-      <w:r>
-        <w:rPr>
-          <w:b/>
-          <w:bCs/>
-          <w:sz w:val="24"/>
-        </w:rPr>
-        <w:t>8</w:t>
-      </w:r>
-      <w:r>
-        <w:rPr>
-          <w:b/>
-          <w:bCs/>
-          <w:sz w:val="24"/>
-        </w:rPr>
-        <w:t xml:space="preserve">. </w:t>
-      </w:r>
-      <w:r>
-        <w:rPr>
-          <w:b/>
-          <w:bCs/>
-          <w:sz w:val="24"/>
-        </w:rPr>
-        <w:t>Atmiņas patēriņš</w:t>
-      </w:r>
-    </w:p>
-    <w:p>
-      <w:pPr>
-        <w:spacing w:after="0" w:line="360" w:lineRule="auto"/>
-        <w:ind w:left="0" w:right="0" w:firstLine="851"/>
-        <w:rPr>
-          <w:sz w:val="24"/>
-        </w:rPr>
-      </w:pPr>
-      <w:r>
-        <w:rPr>
-          <w:sz w:val="24"/>
-        </w:rPr>
-        <w:t xml:space="preserve">Spēles atmiņas patēriņam jābūt ne vairāk kā </w:t>
-      </w:r>
-      <w:r>
-        <w:rPr>
-          <w:sz w:val="24"/>
-        </w:rPr>
-        <w:t>1 GB.</w:t>
-      </w:r>
-    </w:p>
-    <w:p>
-      <w:pPr>
-        <w:spacing w:after="0" w:line="360" w:lineRule="auto"/>
-        <w:ind w:left="0" w:right="0" w:firstLine="851"/>
-        <w:rPr>
-          <w:b/>
-          <w:bCs/>
-          <w:sz w:val="24"/>
-        </w:rPr>
-      </w:pPr>
-      <w:r>
-        <w:rPr>
-          <w:b/>
-          <w:bCs/>
-          <w:sz w:val="24"/>
-        </w:rPr>
-        <w:t>NP.</w:t>
-      </w:r>
-      <w:r>
-        <w:rPr>
-          <w:b/>
-          <w:bCs/>
-          <w:sz w:val="24"/>
-        </w:rPr>
-        <w:t>9</w:t>
-      </w:r>
-      <w:r>
-        <w:rPr>
-          <w:b/>
-          <w:bCs/>
-          <w:sz w:val="24"/>
-        </w:rPr>
-        <w:t xml:space="preserve">. </w:t>
+        <w:t>NP.10. Starta logs</w:t>
+      </w:r>
+    </w:p>
+    <w:p>
+      <w:pPr>
+        <w:spacing w:after="0" w:line="360" w:lineRule="auto"/>
+        <w:ind w:left="0" w:right="0" w:firstLine="851"/>
+        <w:rPr>
+          <w:sz w:val="24"/>
+        </w:rPr>
+      </w:pPr>
+      <w:r>
+        <w:rPr>
+          <w:sz w:val="24"/>
+        </w:rPr>
+        <w:t>Spēlei jāuzsākas ar galveno izvēlni bez ka</w:t>
+      </w:r>
+      <w:r>
+        <w:rPr>
+          <w:sz w:val="24"/>
+        </w:rPr>
+        <w:t xml:space="preserve">vēšanās vai papildus </w:t>
       </w:r>
       <w:proofErr w:type="spellStart"/>
       <w:r>
         <w:rPr>
-          <w:b/>
-          <w:bCs/>
-          <w:sz w:val="24"/>
-        </w:rPr>
-        <w:t>Ielādes</w:t>
+          <w:sz w:val="24"/>
+        </w:rPr>
+        <w:t>ielādes</w:t>
       </w:r>
       <w:proofErr w:type="spellEnd"/>
       <w:r>
         <w:rPr>
-          <w:b/>
-          <w:bCs/>
-          <w:sz w:val="24"/>
-        </w:rPr>
-        <w:t xml:space="preserve"> indikators</w:t>
-      </w:r>
-    </w:p>
-    <w:p>
-      <w:pPr>
-        <w:spacing w:after="0" w:line="360" w:lineRule="auto"/>
-        <w:ind w:left="0" w:right="0" w:firstLine="851"/>
-        <w:rPr>
-          <w:sz w:val="24"/>
-          <w:lang w:val="ru-RU"/>
-        </w:rPr>
-      </w:pPr>
-      <w:proofErr w:type="spellStart"/>
-      <w:r>
-        <w:rPr>
-          <w:sz w:val="24"/>
-        </w:rPr>
-        <w:t>Ielādes</w:t>
-      </w:r>
-      <w:proofErr w:type="spellEnd"/>
-      <w:r>
-        <w:rPr>
-          <w:sz w:val="24"/>
-        </w:rPr>
-        <w:t xml:space="preserve"> laikā jābūt redzamam progresam </w:t>
-      </w:r>
-      <w:r>
-        <w:rPr>
-          <w:sz w:val="24"/>
-        </w:rPr>
-        <w:t>vai animācijai.</w:t>
-      </w:r>
-    </w:p>
-    <w:p>
-      <w:pPr>
-        <w:spacing w:after="0" w:line="360" w:lineRule="auto"/>
-        <w:ind w:left="0" w:right="0" w:firstLine="851"/>
-        <w:rPr>
-          <w:b/>
-          <w:bCs/>
-          <w:sz w:val="24"/>
-        </w:rPr>
-      </w:pPr>
-      <w:r>
-        <w:rPr>
-          <w:b/>
-          <w:bCs/>
-          <w:sz w:val="24"/>
-        </w:rPr>
-        <w:t>NP.</w:t>
-      </w:r>
-      <w:r>
-        <w:rPr>
-          <w:b/>
-          <w:bCs/>
-          <w:sz w:val="24"/>
-          <w:lang w:val="en-US"/>
-        </w:rPr>
-        <w:t>10</w:t>
-      </w:r>
-      <w:r>
-        <w:rPr>
-          <w:b/>
-          <w:bCs/>
-          <w:sz w:val="24"/>
-        </w:rPr>
-        <w:t xml:space="preserve">. </w:t>
-      </w:r>
-      <w:r>
-        <w:rPr>
-          <w:b/>
-          <w:bCs/>
-          <w:sz w:val="24"/>
-        </w:rPr>
-        <w:t>Starta logs</w:t>
-      </w:r>
-    </w:p>
-    <w:p>
-      <w:pPr>
-        <w:spacing w:after="0" w:line="360" w:lineRule="auto"/>
-        <w:ind w:left="0" w:right="0" w:firstLine="851"/>
-        <w:rPr>
-          <w:sz w:val="24"/>
-        </w:rPr>
-      </w:pPr>
-      <w:r>
-        <w:rPr>
-          <w:sz w:val="24"/>
-        </w:rPr>
-        <w:t>Spēlei jāuzsākas ar galveno izvēlni bez ka</w:t>
-      </w:r>
-      <w:r>
-        <w:rPr>
-          <w:sz w:val="24"/>
-        </w:rPr>
-        <w:t xml:space="preserve">vēšanās vai papildus </w:t>
-      </w:r>
-      <w:proofErr w:type="spellStart"/>
-      <w:r>
-        <w:rPr>
-          <w:sz w:val="24"/>
-        </w:rPr>
-        <w:t>ielādes</w:t>
-      </w:r>
-      <w:proofErr w:type="spellEnd"/>
-      <w:r>
-        <w:rPr>
           <w:sz w:val="24"/>
         </w:rPr>
         <w:t xml:space="preserve"> ekrāniem.</w:t>
@@ -9330,7 +8750,6 @@
         <w:ind w:left="0" w:right="0" w:firstLine="851"/>
         <w:rPr>
           <w:sz w:val="24"/>
-          <w:lang w:val="ru-RU"/>
         </w:rPr>
       </w:pPr>
       <w:r>
@@ -9395,6 +8814,70 @@
     </w:p>
     <w:p>
       <w:pPr>
+        <w:pStyle w:val="a8"/>
+        <w:spacing w:before="0" w:beforeAutospacing="0" w:after="0" w:afterAutospacing="0" w:line="360" w:lineRule="auto"/>
+        <w:ind w:firstLine="851"/>
+        <w:contextualSpacing/>
+        <w:jc w:val="both"/>
+        <w:rPr>
+          <w:lang w:val="lv-LV"/>
+        </w:rPr>
+      </w:pPr>
+      <w:r>
+        <w:rPr>
+          <w:lang w:val="lv-LV"/>
+        </w:rPr>
+        <w:t>Šajā nodaļā tiek aprakstīti visi rīki un tehnoloģijas, kas tika izmantoti spēles “</w:t>
+      </w:r>
+      <w:proofErr w:type="spellStart"/>
+      <w:r>
+        <w:rPr>
+          <w:lang w:val="lv-LV"/>
+        </w:rPr>
+        <w:t>Light</w:t>
+      </w:r>
+      <w:proofErr w:type="spellEnd"/>
+      <w:r>
+        <w:rPr>
+          <w:lang w:val="lv-LV"/>
+        </w:rPr>
+        <w:t xml:space="preserve"> </w:t>
+      </w:r>
+      <w:proofErr w:type="spellStart"/>
+      <w:r>
+        <w:rPr>
+          <w:lang w:val="lv-LV"/>
+        </w:rPr>
+        <w:t>Seeker</w:t>
+      </w:r>
+      <w:proofErr w:type="spellEnd"/>
+      <w:r>
+        <w:rPr>
+          <w:lang w:val="lv-LV"/>
+        </w:rPr>
+        <w:t>” izstrādes procesā, kā arī sniegts pamatojums to izvēlei. Autors analizē izmantoto programmēšanas valodu, izstrādes vidi un citas nepieciešamās programmas, kas palīdzēja realizēt projekta mērķus. Tiek izskaidrots, kāpēc konkrētie risinājumi tika izvēlēti, ņemot vērā projekta prasības, autora zināšanu līmeni un tehniskās iespējas.</w:t>
+      </w:r>
+    </w:p>
+    <w:p>
+      <w:pPr>
+        <w:pStyle w:val="a8"/>
+        <w:spacing w:before="0" w:beforeAutospacing="0" w:after="0" w:afterAutospacing="0" w:line="360" w:lineRule="auto"/>
+        <w:ind w:firstLine="851"/>
+        <w:contextualSpacing/>
+        <w:jc w:val="both"/>
+        <w:rPr>
+          <w:lang w:val="lv-LV"/>
+        </w:rPr>
+      </w:pPr>
+      <w:r>
+        <w:rPr>
+          <w:lang w:val="lv-LV"/>
+        </w:rPr>
+        <w:t>Tāpat šajā nodaļā tiek apskatīti arī alternatīvie risinājumi — citi rīki un valodas, kas potenciāli varētu tikt izmantoti līdzīga tipa spēles izstrādei. Tiek norādīti to plusi un mīnusi, salīdzinot ar izvēlēto risinājumu. Šī analīze palīdz pamatot, ka izvēlētā pieeja ir visefektīvākā konkrētajam projektam un atbilst gan funkcionālajām, gan nefunkcionālajām prasībām.</w:t>
+      </w:r>
+    </w:p>
+    <w:p>
+      <w:pPr>
         <w:pStyle w:val="2"/>
       </w:pPr>
       <w:bookmarkStart w:id="8" w:name="_Toc212298889"/>
@@ -9405,16 +8888,723 @@
     </w:p>
     <w:p>
       <w:pPr>
-        <w:pStyle w:val="2"/>
-      </w:pPr>
-      <w:bookmarkStart w:id="9" w:name="_Toc212298890"/>
-      <w:r>
-        <w:t xml:space="preserve">Iespējamo </w:t>
-      </w:r>
+        <w:pStyle w:val="a8"/>
+        <w:spacing w:before="0" w:beforeAutospacing="0" w:after="0" w:afterAutospacing="0" w:line="360" w:lineRule="auto"/>
+        <w:ind w:firstLine="851"/>
+        <w:contextualSpacing/>
+        <w:jc w:val="both"/>
+      </w:pPr>
+      <w:r>
+        <w:rPr>
+          <w:lang w:val="lv-LV"/>
+        </w:rPr>
+        <w:t>Lai nodrošinātu kvalitatīvu un efektīvu spēles izstrādes procesu, darbā tiek izmantoti vairāki rīki un tehnoloģijas, kas savstarpēji papildina viens otru un ļauj sasniegt vēlamo rezultātu.</w:t>
+      </w:r>
+    </w:p>
+    <w:p>
+      <w:pPr>
+        <w:pStyle w:val="a8"/>
+        <w:numPr>
+          <w:ilvl w:val="1"/>
+          <w:numId w:val="21"/>
+        </w:numPr>
+        <w:spacing w:before="0" w:beforeAutospacing="0" w:after="0" w:afterAutospacing="0" w:line="360" w:lineRule="auto"/>
+        <w:ind w:left="0" w:firstLine="851"/>
+        <w:contextualSpacing/>
+        <w:jc w:val="both"/>
+        <w:rPr>
+          <w:b/>
+          <w:bCs/>
+        </w:rPr>
+      </w:pPr>
+      <w:proofErr w:type="spellStart"/>
+      <w:r>
+        <w:rPr>
+          <w:b/>
+          <w:bCs/>
+          <w:lang w:val="lv-LV"/>
+        </w:rPr>
+        <w:t>Godot</w:t>
+      </w:r>
+      <w:proofErr w:type="spellEnd"/>
+      <w:r>
+        <w:rPr>
+          <w:b/>
+          <w:bCs/>
+          <w:lang w:val="lv-LV"/>
+        </w:rPr>
+        <w:t xml:space="preserve"> </w:t>
+      </w:r>
+      <w:proofErr w:type="spellStart"/>
+      <w:r>
+        <w:rPr>
+          <w:b/>
+          <w:bCs/>
+          <w:lang w:val="lv-LV"/>
+        </w:rPr>
+        <w:t>Engine</w:t>
+      </w:r>
+      <w:proofErr w:type="spellEnd"/>
+    </w:p>
+    <w:p>
+      <w:pPr>
+        <w:pStyle w:val="a8"/>
+        <w:spacing w:before="0" w:beforeAutospacing="0" w:after="0" w:afterAutospacing="0" w:line="360" w:lineRule="auto"/>
+        <w:ind w:firstLine="851"/>
+        <w:contextualSpacing/>
+        <w:jc w:val="both"/>
+        <w:rPr>
+          <w:lang w:val="lv-LV"/>
+        </w:rPr>
+      </w:pPr>
+      <w:r>
+        <w:rPr>
+          <w:rStyle w:val="ab"/>
+          <w:b w:val="0"/>
+          <w:bCs w:val="0"/>
+          <w:lang w:val="lv-LV"/>
+        </w:rPr>
+        <w:t>Galvenā izstrādes vide</w:t>
+      </w:r>
+      <w:r>
+        <w:rPr>
+          <w:lang w:val="lv-LV"/>
+        </w:rPr>
+        <w:t xml:space="preserve"> ir </w:t>
+      </w:r>
+      <w:proofErr w:type="spellStart"/>
+      <w:r>
+        <w:rPr>
+          <w:rStyle w:val="ac"/>
+          <w:i w:val="0"/>
+          <w:iCs w:val="0"/>
+          <w:lang w:val="lv-LV"/>
+        </w:rPr>
+        <w:t>Godot</w:t>
+      </w:r>
+      <w:proofErr w:type="spellEnd"/>
+      <w:r>
+        <w:rPr>
+          <w:rStyle w:val="ac"/>
+          <w:i w:val="0"/>
+          <w:iCs w:val="0"/>
+          <w:lang w:val="lv-LV"/>
+        </w:rPr>
+        <w:t xml:space="preserve"> </w:t>
+      </w:r>
+      <w:proofErr w:type="spellStart"/>
+      <w:r>
+        <w:rPr>
+          <w:rStyle w:val="ac"/>
+          <w:i w:val="0"/>
+          <w:iCs w:val="0"/>
+          <w:lang w:val="lv-LV"/>
+        </w:rPr>
+        <w:t>Engine</w:t>
+      </w:r>
+      <w:proofErr w:type="spellEnd"/>
       <w:r>
         <w:rPr>
           <w:i/>
           <w:iCs/>
+          <w:lang w:val="lv-LV"/>
+        </w:rPr>
+        <w:t>.</w:t>
+      </w:r>
+      <w:r>
+        <w:rPr>
+          <w:lang w:val="lv-LV"/>
+        </w:rPr>
+        <w:t xml:space="preserve"> Tā ir moderna, atvērtā koda spēļu izstrādes vide, kas piedāvā plašas iespējas 2D projektu veidošanai. </w:t>
+      </w:r>
+      <w:proofErr w:type="spellStart"/>
+      <w:r>
+        <w:rPr>
+          <w:lang w:val="lv-LV"/>
+        </w:rPr>
+        <w:t>Godot</w:t>
+      </w:r>
+      <w:proofErr w:type="spellEnd"/>
+      <w:r>
+        <w:rPr>
+          <w:lang w:val="lv-LV"/>
+        </w:rPr>
+        <w:t xml:space="preserve"> ir ērts interfeiss, viegli pārskatāma struktūra un ļoti labs 2D atbalsts, kas ir būtiski šī projekta ietvaros. Šis dzinējs ļauj izveidot spēles mehānikas, animācijas un vadību vienotā vidē, neizmantojot ārējos papildinājumus.</w:t>
+      </w:r>
+    </w:p>
+    <w:p>
+      <w:pPr>
+        <w:pStyle w:val="a8"/>
+        <w:numPr>
+          <w:ilvl w:val="1"/>
+          <w:numId w:val="21"/>
+        </w:numPr>
+        <w:spacing w:before="0" w:beforeAutospacing="0" w:after="0" w:afterAutospacing="0" w:line="360" w:lineRule="auto"/>
+        <w:ind w:left="0" w:firstLine="851"/>
+        <w:contextualSpacing/>
+        <w:jc w:val="both"/>
+        <w:rPr>
+          <w:b/>
+          <w:bCs/>
+          <w:lang w:val="lv-LV"/>
+        </w:rPr>
+      </w:pPr>
+      <w:proofErr w:type="spellStart"/>
+      <w:r>
+        <w:rPr>
+          <w:b/>
+          <w:bCs/>
+          <w:lang w:val="lv-LV"/>
+        </w:rPr>
+        <w:t>GDScript</w:t>
+      </w:r>
+      <w:proofErr w:type="spellEnd"/>
+    </w:p>
+    <w:p>
+      <w:pPr>
+        <w:pStyle w:val="a8"/>
+        <w:spacing w:before="0" w:beforeAutospacing="0" w:after="0" w:afterAutospacing="0" w:line="360" w:lineRule="auto"/>
+        <w:ind w:firstLine="851"/>
+        <w:contextualSpacing/>
+        <w:jc w:val="both"/>
+        <w:rPr>
+          <w:lang w:val="lv-LV"/>
+        </w:rPr>
+      </w:pPr>
+      <w:r>
+        <w:rPr>
+          <w:lang w:val="lv-LV"/>
+        </w:rPr>
+        <w:t xml:space="preserve">Kā </w:t>
+      </w:r>
+      <w:r>
+        <w:rPr>
+          <w:rStyle w:val="ab"/>
+          <w:b w:val="0"/>
+          <w:bCs w:val="0"/>
+          <w:lang w:val="lv-LV"/>
+        </w:rPr>
+        <w:t>programmēšanas valoda</w:t>
+      </w:r>
+      <w:r>
+        <w:rPr>
+          <w:lang w:val="lv-LV"/>
+        </w:rPr>
+        <w:t xml:space="preserve"> tiek izmantots </w:t>
+      </w:r>
+      <w:proofErr w:type="spellStart"/>
+      <w:r>
+        <w:rPr>
+          <w:rStyle w:val="ac"/>
+          <w:i w:val="0"/>
+          <w:iCs w:val="0"/>
+          <w:lang w:val="lv-LV"/>
+        </w:rPr>
+        <w:t>GDScript</w:t>
+      </w:r>
+      <w:proofErr w:type="spellEnd"/>
+      <w:r>
+        <w:rPr>
+          <w:lang w:val="lv-LV"/>
+        </w:rPr>
+        <w:t xml:space="preserve">, kas ir speciāli izstrādāta </w:t>
+      </w:r>
+      <w:proofErr w:type="spellStart"/>
+      <w:r>
+        <w:rPr>
+          <w:lang w:val="lv-LV"/>
+        </w:rPr>
+        <w:t>Godot</w:t>
+      </w:r>
+      <w:proofErr w:type="spellEnd"/>
+      <w:r>
+        <w:rPr>
+          <w:lang w:val="lv-LV"/>
+        </w:rPr>
+        <w:t xml:space="preserve"> dzinējam. Tā ir līdzīga </w:t>
+      </w:r>
+      <w:proofErr w:type="spellStart"/>
+      <w:r>
+        <w:rPr>
+          <w:lang w:val="lv-LV"/>
+        </w:rPr>
+        <w:t>Python</w:t>
+      </w:r>
+      <w:proofErr w:type="spellEnd"/>
+      <w:r>
+        <w:rPr>
+          <w:lang w:val="lv-LV"/>
+        </w:rPr>
+        <w:t xml:space="preserve"> sintaksei, kas padara to viegli apgūstamu un ļauj koncentrēties uz loģiku, nevis tehniskām detaļām. </w:t>
+      </w:r>
+      <w:proofErr w:type="spellStart"/>
+      <w:r>
+        <w:rPr>
+          <w:lang w:val="lv-LV"/>
+        </w:rPr>
+        <w:t>GDScript</w:t>
+      </w:r>
+      <w:proofErr w:type="spellEnd"/>
+      <w:r>
+        <w:rPr>
+          <w:lang w:val="lv-LV"/>
+        </w:rPr>
+        <w:t xml:space="preserve"> nodrošina labu veiktspēju un ātru izstrādes tempu, kas ir būtiski kvalifikācijas darba ietvaros.</w:t>
+      </w:r>
+    </w:p>
+    <w:p>
+      <w:pPr>
+        <w:pStyle w:val="a8"/>
+        <w:numPr>
+          <w:ilvl w:val="1"/>
+          <w:numId w:val="21"/>
+        </w:numPr>
+        <w:spacing w:before="0" w:beforeAutospacing="0" w:after="0" w:afterAutospacing="0" w:line="360" w:lineRule="auto"/>
+        <w:ind w:left="0" w:firstLine="851"/>
+        <w:contextualSpacing/>
+        <w:jc w:val="both"/>
+        <w:rPr>
+          <w:b/>
+          <w:bCs/>
+          <w:lang w:val="lv-LV"/>
+        </w:rPr>
+      </w:pPr>
+      <w:proofErr w:type="spellStart"/>
+      <w:r>
+        <w:rPr>
+          <w:b/>
+          <w:bCs/>
+          <w:lang w:val="lv-LV"/>
+        </w:rPr>
+        <w:t>Visual</w:t>
+      </w:r>
+      <w:proofErr w:type="spellEnd"/>
+      <w:r>
+        <w:rPr>
+          <w:b/>
+          <w:bCs/>
+          <w:lang w:val="lv-LV"/>
+        </w:rPr>
+        <w:t xml:space="preserve"> </w:t>
+      </w:r>
+      <w:proofErr w:type="spellStart"/>
+      <w:r>
+        <w:rPr>
+          <w:b/>
+          <w:bCs/>
+          <w:lang w:val="lv-LV"/>
+        </w:rPr>
+        <w:t>Studio</w:t>
+      </w:r>
+      <w:proofErr w:type="spellEnd"/>
+      <w:r>
+        <w:rPr>
+          <w:b/>
+          <w:bCs/>
+          <w:lang w:val="lv-LV"/>
+        </w:rPr>
+        <w:t xml:space="preserve"> Code</w:t>
+      </w:r>
+    </w:p>
+    <w:p>
+      <w:pPr>
+        <w:pStyle w:val="a8"/>
+        <w:spacing w:before="0" w:beforeAutospacing="0" w:after="0" w:afterAutospacing="0" w:line="360" w:lineRule="auto"/>
+        <w:ind w:firstLine="851"/>
+        <w:contextualSpacing/>
+        <w:jc w:val="both"/>
+        <w:rPr>
+          <w:lang w:val="lv-LV"/>
+        </w:rPr>
+      </w:pPr>
+      <w:r>
+        <w:rPr>
+          <w:lang w:val="lv-LV"/>
+        </w:rPr>
+        <w:t xml:space="preserve">Papildu tiek izmantots </w:t>
+      </w:r>
+      <w:proofErr w:type="spellStart"/>
+      <w:r>
+        <w:rPr>
+          <w:rStyle w:val="ab"/>
+          <w:b w:val="0"/>
+          <w:bCs w:val="0"/>
+          <w:lang w:val="lv-LV"/>
+        </w:rPr>
+        <w:t>Visual</w:t>
+      </w:r>
+      <w:proofErr w:type="spellEnd"/>
+      <w:r>
+        <w:rPr>
+          <w:rStyle w:val="ab"/>
+          <w:b w:val="0"/>
+          <w:bCs w:val="0"/>
+          <w:lang w:val="lv-LV"/>
+        </w:rPr>
+        <w:t xml:space="preserve"> </w:t>
+      </w:r>
+      <w:proofErr w:type="spellStart"/>
+      <w:r>
+        <w:rPr>
+          <w:rStyle w:val="ab"/>
+          <w:b w:val="0"/>
+          <w:bCs w:val="0"/>
+          <w:lang w:val="lv-LV"/>
+        </w:rPr>
+        <w:t>Studio</w:t>
+      </w:r>
+      <w:proofErr w:type="spellEnd"/>
+      <w:r>
+        <w:rPr>
+          <w:rStyle w:val="ab"/>
+          <w:b w:val="0"/>
+          <w:bCs w:val="0"/>
+          <w:lang w:val="lv-LV"/>
+        </w:rPr>
+        <w:t xml:space="preserve"> Code</w:t>
+      </w:r>
+      <w:r>
+        <w:rPr>
+          <w:lang w:val="lv-LV"/>
+        </w:rPr>
+        <w:t xml:space="preserve">, kas kalpo kā ērts un funkcionāls koda redaktors. Tas piedāvā sintakses izcelšanu, automātisku formatēšanu, kļūdu pārbaudi un integrāciju ar </w:t>
+      </w:r>
+      <w:proofErr w:type="spellStart"/>
+      <w:r>
+        <w:rPr>
+          <w:lang w:val="lv-LV"/>
+        </w:rPr>
+        <w:t>GitHub</w:t>
+      </w:r>
+      <w:proofErr w:type="spellEnd"/>
+      <w:r>
+        <w:rPr>
+          <w:lang w:val="lv-LV"/>
+        </w:rPr>
+        <w:t>, kas būtiski paātrina darbu.</w:t>
+      </w:r>
+    </w:p>
+    <w:p>
+      <w:pPr>
+        <w:pStyle w:val="a8"/>
+        <w:numPr>
+          <w:ilvl w:val="1"/>
+          <w:numId w:val="21"/>
+        </w:numPr>
+        <w:spacing w:before="0" w:beforeAutospacing="0" w:after="0" w:afterAutospacing="0" w:line="360" w:lineRule="auto"/>
+        <w:ind w:left="0" w:firstLine="851"/>
+        <w:contextualSpacing/>
+        <w:jc w:val="both"/>
+        <w:rPr>
+          <w:b/>
+          <w:bCs/>
+          <w:lang w:val="lv-LV"/>
+        </w:rPr>
+      </w:pPr>
+      <w:proofErr w:type="spellStart"/>
+      <w:r>
+        <w:rPr>
+          <w:b/>
+          <w:bCs/>
+          <w:lang w:val="lv-LV"/>
+        </w:rPr>
+        <w:t>GitHub</w:t>
+      </w:r>
+      <w:proofErr w:type="spellEnd"/>
+    </w:p>
+    <w:p>
+      <w:pPr>
+        <w:pStyle w:val="a8"/>
+        <w:spacing w:before="0" w:beforeAutospacing="0" w:after="0" w:afterAutospacing="0" w:line="360" w:lineRule="auto"/>
+        <w:ind w:firstLine="851"/>
+        <w:contextualSpacing/>
+        <w:jc w:val="both"/>
+        <w:rPr>
+          <w:lang w:val="lv-LV"/>
+        </w:rPr>
+      </w:pPr>
+      <w:r>
+        <w:rPr>
+          <w:lang w:val="lv-LV"/>
+        </w:rPr>
+        <w:t xml:space="preserve">Lai nodrošinātu versiju kontroli un failu drošu glabāšanu, tiek izmantots </w:t>
+      </w:r>
+      <w:proofErr w:type="spellStart"/>
+      <w:r>
+        <w:rPr>
+          <w:rStyle w:val="ab"/>
+          <w:b w:val="0"/>
+          <w:bCs w:val="0"/>
+          <w:lang w:val="lv-LV"/>
+        </w:rPr>
+        <w:t>GitHub</w:t>
+      </w:r>
+      <w:proofErr w:type="spellEnd"/>
+      <w:r>
+        <w:rPr>
+          <w:lang w:val="lv-LV"/>
+        </w:rPr>
+        <w:t>. Tas ļauj saglabāt projekta izmaiņu vēsturi, atgriezties pie iepriekšējām versijām un nodrošina ērtu sadarbību un rezerves kopiju izveidi.</w:t>
+      </w:r>
+    </w:p>
+    <w:p>
+      <w:pPr>
+        <w:pStyle w:val="a8"/>
+        <w:numPr>
+          <w:ilvl w:val="1"/>
+          <w:numId w:val="21"/>
+        </w:numPr>
+        <w:spacing w:before="0" w:beforeAutospacing="0" w:after="0" w:afterAutospacing="0" w:line="360" w:lineRule="auto"/>
+        <w:ind w:left="0" w:firstLine="851"/>
+        <w:contextualSpacing/>
+        <w:jc w:val="both"/>
+        <w:rPr>
+          <w:b/>
+          <w:bCs/>
+          <w:lang w:val="lv-LV"/>
+        </w:rPr>
+      </w:pPr>
+      <w:proofErr w:type="spellStart"/>
+      <w:r>
+        <w:rPr>
+          <w:b/>
+          <w:bCs/>
+          <w:lang w:val="lv-LV"/>
+        </w:rPr>
+        <w:t>Aseprite</w:t>
+      </w:r>
+      <w:proofErr w:type="spellEnd"/>
+    </w:p>
+    <w:p>
+      <w:pPr>
+        <w:pStyle w:val="a8"/>
+        <w:spacing w:before="0" w:beforeAutospacing="0" w:after="0" w:afterAutospacing="0" w:line="360" w:lineRule="auto"/>
+        <w:ind w:firstLine="851"/>
+        <w:contextualSpacing/>
+        <w:jc w:val="both"/>
+        <w:rPr>
+          <w:lang w:val="lv-LV"/>
+        </w:rPr>
+      </w:pPr>
+      <w:proofErr w:type="spellStart"/>
+      <w:r>
+        <w:rPr>
+          <w:rStyle w:val="ab"/>
+          <w:b w:val="0"/>
+          <w:bCs w:val="0"/>
+          <w:lang w:val="lv-LV"/>
+        </w:rPr>
+        <w:lastRenderedPageBreak/>
+        <w:t>Aseprite</w:t>
+      </w:r>
+      <w:proofErr w:type="spellEnd"/>
+      <w:r>
+        <w:rPr>
+          <w:lang w:val="lv-LV"/>
+        </w:rPr>
+        <w:t xml:space="preserve"> tiek izmantots spēles vizuālo elementu izveidei. Tas ir specializēts rīks pikseļu grafikas un animāciju veidošanai, kas ir īpaši piemērots retro stila 2D spēlēm. Ar tā palīdzību iespējams izstrādāt spēles varoņu, objektu un vides elementu dizainu.</w:t>
+      </w:r>
+    </w:p>
+    <w:p>
+      <w:pPr>
+        <w:pStyle w:val="a8"/>
+        <w:spacing w:before="0" w:beforeAutospacing="0" w:after="0" w:afterAutospacing="0" w:line="360" w:lineRule="auto"/>
+        <w:ind w:firstLine="851"/>
+        <w:contextualSpacing/>
+        <w:jc w:val="both"/>
+        <w:rPr>
+          <w:lang w:val="lv-LV"/>
+        </w:rPr>
+      </w:pPr>
+      <w:r>
+        <w:rPr>
+          <w:lang w:val="lv-LV"/>
+        </w:rPr>
+        <w:t xml:space="preserve">Apvienojot visus šos rīkus </w:t>
+      </w:r>
+      <w:r>
+        <w:rPr>
+          <w:i/>
+          <w:iCs/>
+          <w:lang w:val="lv-LV"/>
+        </w:rPr>
+        <w:t xml:space="preserve">— </w:t>
+      </w:r>
+      <w:proofErr w:type="spellStart"/>
+      <w:r>
+        <w:rPr>
+          <w:rStyle w:val="ac"/>
+          <w:i w:val="0"/>
+          <w:iCs w:val="0"/>
+          <w:lang w:val="lv-LV"/>
+        </w:rPr>
+        <w:t>Godot</w:t>
+      </w:r>
+      <w:proofErr w:type="spellEnd"/>
+      <w:r>
+        <w:rPr>
+          <w:rStyle w:val="ac"/>
+          <w:i w:val="0"/>
+          <w:iCs w:val="0"/>
+          <w:lang w:val="lv-LV"/>
+        </w:rPr>
+        <w:t xml:space="preserve"> </w:t>
+      </w:r>
+      <w:proofErr w:type="spellStart"/>
+      <w:r>
+        <w:rPr>
+          <w:rStyle w:val="ac"/>
+          <w:i w:val="0"/>
+          <w:iCs w:val="0"/>
+          <w:lang w:val="lv-LV"/>
+        </w:rPr>
+        <w:t>Engine</w:t>
+      </w:r>
+      <w:proofErr w:type="spellEnd"/>
+      <w:r>
+        <w:rPr>
+          <w:i/>
+          <w:iCs/>
+          <w:lang w:val="lv-LV"/>
+        </w:rPr>
+        <w:t xml:space="preserve">, </w:t>
+      </w:r>
+      <w:proofErr w:type="spellStart"/>
+      <w:r>
+        <w:rPr>
+          <w:rStyle w:val="ac"/>
+          <w:i w:val="0"/>
+          <w:iCs w:val="0"/>
+          <w:lang w:val="lv-LV"/>
+        </w:rPr>
+        <w:t>GDScript</w:t>
+      </w:r>
+      <w:proofErr w:type="spellEnd"/>
+      <w:r>
+        <w:rPr>
+          <w:i/>
+          <w:iCs/>
+          <w:lang w:val="lv-LV"/>
+        </w:rPr>
+        <w:t xml:space="preserve">, </w:t>
+      </w:r>
+      <w:proofErr w:type="spellStart"/>
+      <w:r>
+        <w:rPr>
+          <w:rStyle w:val="ac"/>
+          <w:i w:val="0"/>
+          <w:iCs w:val="0"/>
+          <w:lang w:val="lv-LV"/>
+        </w:rPr>
+        <w:t>Visual</w:t>
+      </w:r>
+      <w:proofErr w:type="spellEnd"/>
+      <w:r>
+        <w:rPr>
+          <w:rStyle w:val="ac"/>
+          <w:i w:val="0"/>
+          <w:iCs w:val="0"/>
+          <w:lang w:val="lv-LV"/>
+        </w:rPr>
+        <w:t xml:space="preserve"> </w:t>
+      </w:r>
+      <w:proofErr w:type="spellStart"/>
+      <w:r>
+        <w:rPr>
+          <w:rStyle w:val="ac"/>
+          <w:i w:val="0"/>
+          <w:iCs w:val="0"/>
+          <w:lang w:val="lv-LV"/>
+        </w:rPr>
+        <w:t>Studio</w:t>
+      </w:r>
+      <w:proofErr w:type="spellEnd"/>
+      <w:r>
+        <w:rPr>
+          <w:rStyle w:val="ac"/>
+          <w:i w:val="0"/>
+          <w:iCs w:val="0"/>
+          <w:lang w:val="lv-LV"/>
+        </w:rPr>
+        <w:t xml:space="preserve"> Code</w:t>
+      </w:r>
+      <w:r>
+        <w:rPr>
+          <w:i/>
+          <w:iCs/>
+          <w:lang w:val="lv-LV"/>
+        </w:rPr>
+        <w:t xml:space="preserve">, </w:t>
+      </w:r>
+      <w:proofErr w:type="spellStart"/>
+      <w:r>
+        <w:rPr>
+          <w:rStyle w:val="ac"/>
+          <w:i w:val="0"/>
+          <w:iCs w:val="0"/>
+          <w:lang w:val="lv-LV"/>
+        </w:rPr>
+        <w:t>GitHub</w:t>
+      </w:r>
+      <w:proofErr w:type="spellEnd"/>
+      <w:r>
+        <w:rPr>
+          <w:lang w:val="lv-LV"/>
+        </w:rPr>
+        <w:t xml:space="preserve"> un </w:t>
+      </w:r>
+      <w:proofErr w:type="spellStart"/>
+      <w:r>
+        <w:rPr>
+          <w:rStyle w:val="ac"/>
+          <w:i w:val="0"/>
+          <w:iCs w:val="0"/>
+          <w:lang w:val="lv-LV"/>
+        </w:rPr>
+        <w:t>Aseprite</w:t>
+      </w:r>
+      <w:proofErr w:type="spellEnd"/>
+      <w:r>
+        <w:rPr>
+          <w:i/>
+          <w:iCs/>
+          <w:lang w:val="lv-LV"/>
+        </w:rPr>
+        <w:t xml:space="preserve"> </w:t>
+      </w:r>
+      <w:r>
+        <w:rPr>
+          <w:lang w:val="lv-LV"/>
+        </w:rPr>
+        <w:t xml:space="preserve">— tiek nodrošināta pilnvērtīga un efektīva izstrādes vide, kas ļaus izveidot kvalitatīvu 2D </w:t>
+      </w:r>
+      <w:proofErr w:type="spellStart"/>
+      <w:r>
+        <w:rPr>
+          <w:lang w:val="lv-LV"/>
+        </w:rPr>
+        <w:t>platformera</w:t>
+      </w:r>
+      <w:proofErr w:type="spellEnd"/>
+      <w:r>
+        <w:rPr>
+          <w:lang w:val="lv-LV"/>
+        </w:rPr>
+        <w:t xml:space="preserve"> spēli no idejas līdz gatavam produktam.</w:t>
+      </w:r>
+    </w:p>
+    <w:p>
+      <w:pPr>
+        <w:pStyle w:val="2"/>
+      </w:pPr>
+      <w:bookmarkStart w:id="9" w:name="_Toc212298890"/>
+      <w:r>
+        <w:t xml:space="preserve">Iespējamo </w:t>
+      </w:r>
+      <w:r>
+        <w:rPr>
+          <w:i/>
+          <w:iCs/>
         </w:rPr>
         <w:t xml:space="preserve">(alternatīvo) </w:t>
       </w:r>
@@ -9428,15 +9618,395 @@
     </w:p>
     <w:p>
       <w:pPr>
-        <w:spacing w:after="160" w:line="278" w:lineRule="auto"/>
-        <w:ind w:left="0" w:right="0" w:firstLine="0"/>
-        <w:jc w:val="left"/>
-        <w:rPr>
-          <w:b/>
-          <w:sz w:val="28"/>
-        </w:rPr>
-      </w:pPr>
-      <w:r>
+        <w:pStyle w:val="a8"/>
+        <w:spacing w:before="0" w:beforeAutospacing="0" w:after="0" w:afterAutospacing="0" w:line="360" w:lineRule="auto"/>
+        <w:ind w:firstLine="851"/>
+        <w:contextualSpacing/>
+        <w:jc w:val="both"/>
+        <w:rPr>
+          <w:lang w:val="lv-LV"/>
+        </w:rPr>
+      </w:pPr>
+      <w:r>
+        <w:rPr>
+          <w:lang w:val="lv-LV"/>
+        </w:rPr>
+        <w:t xml:space="preserve">Izstrādes procesa sākumā tika apsvērti vairāki citi spēļu dzinēji un programmēšanas risinājumi, kuri teorētiski varētu nodrošināt līdzīgu rezultātu kā </w:t>
+      </w:r>
+      <w:proofErr w:type="spellStart"/>
+      <w:r>
+        <w:rPr>
+          <w:rStyle w:val="ac"/>
+          <w:i w:val="0"/>
+          <w:iCs w:val="0"/>
+          <w:lang w:val="lv-LV"/>
+        </w:rPr>
+        <w:t>Godot</w:t>
+      </w:r>
+      <w:proofErr w:type="spellEnd"/>
+      <w:r>
+        <w:rPr>
+          <w:rStyle w:val="ac"/>
+          <w:i w:val="0"/>
+          <w:iCs w:val="0"/>
+          <w:lang w:val="lv-LV"/>
+        </w:rPr>
+        <w:t xml:space="preserve"> </w:t>
+      </w:r>
+      <w:proofErr w:type="spellStart"/>
+      <w:r>
+        <w:rPr>
+          <w:rStyle w:val="ac"/>
+          <w:i w:val="0"/>
+          <w:iCs w:val="0"/>
+          <w:lang w:val="lv-LV"/>
+        </w:rPr>
+        <w:t>Engine</w:t>
+      </w:r>
+      <w:proofErr w:type="spellEnd"/>
+      <w:r>
+        <w:rPr>
+          <w:lang w:val="lv-LV"/>
+        </w:rPr>
+        <w:t>, tomēr katram no tiem bija arī savi trūkumi, kas padarīja tos mazāk piemērotus šī projekta vajadzībām.</w:t>
+      </w:r>
+    </w:p>
+    <w:p>
+      <w:pPr>
+        <w:pStyle w:val="a8"/>
+        <w:spacing w:before="0" w:beforeAutospacing="0" w:after="0" w:afterAutospacing="0" w:line="360" w:lineRule="auto"/>
+        <w:ind w:firstLine="851"/>
+        <w:contextualSpacing/>
+        <w:jc w:val="both"/>
+        <w:rPr>
+          <w:lang w:val="lv-LV"/>
+        </w:rPr>
+      </w:pPr>
+      <w:proofErr w:type="spellStart"/>
+      <w:r>
+        <w:rPr>
+          <w:rStyle w:val="ab"/>
+          <w:lang w:val="lv-LV"/>
+        </w:rPr>
+        <w:t>Unity</w:t>
+      </w:r>
+      <w:proofErr w:type="spellEnd"/>
+      <w:r>
+        <w:rPr>
+          <w:rStyle w:val="ab"/>
+          <w:lang w:val="lv-LV"/>
+        </w:rPr>
+        <w:t xml:space="preserve"> (C#)</w:t>
+      </w:r>
+      <w:r>
+        <w:rPr>
+          <w:lang w:val="lv-LV"/>
+        </w:rPr>
+        <w:t xml:space="preserve"> ir viens no populārākajiem spēļu dzinējiem pasaulē, taču tā izmantošana prasa vairāk laika, jo vide ir salīdzinoši sarežģīta un resursu prasīga. </w:t>
+      </w:r>
+      <w:proofErr w:type="spellStart"/>
+      <w:r>
+        <w:rPr>
+          <w:lang w:val="lv-LV"/>
+        </w:rPr>
+        <w:t>Unity</w:t>
+      </w:r>
+      <w:proofErr w:type="spellEnd"/>
+      <w:r>
+        <w:rPr>
+          <w:lang w:val="lv-LV"/>
+        </w:rPr>
+        <w:t xml:space="preserve"> ir lielisks risinājums 3D spēlēm, taču 2D projektiem tas bieži vien ir pārāk apjomīgs, un daudzas funkcijas paliek neizmantotas. Turklāt bezmaksas versijā ir noteikti ierobežojumi, kas var radīt problēmas turpmākai projekta attīstībai.</w:t>
+      </w:r>
+    </w:p>
+    <w:p>
+      <w:pPr>
+        <w:pStyle w:val="a8"/>
+        <w:spacing w:before="0" w:beforeAutospacing="0" w:after="0" w:afterAutospacing="0" w:line="360" w:lineRule="auto"/>
+        <w:ind w:firstLine="851"/>
+        <w:contextualSpacing/>
+        <w:jc w:val="both"/>
+        <w:rPr>
+          <w:lang w:val="lv-LV"/>
+        </w:rPr>
+      </w:pPr>
+      <w:proofErr w:type="spellStart"/>
+      <w:r>
+        <w:rPr>
+          <w:rStyle w:val="ab"/>
+          <w:lang w:val="lv-LV"/>
+        </w:rPr>
+        <w:t>Unreal</w:t>
+      </w:r>
+      <w:proofErr w:type="spellEnd"/>
+      <w:r>
+        <w:rPr>
+          <w:rStyle w:val="ab"/>
+          <w:lang w:val="lv-LV"/>
+        </w:rPr>
+        <w:t xml:space="preserve"> </w:t>
+      </w:r>
+      <w:proofErr w:type="spellStart"/>
+      <w:r>
+        <w:rPr>
+          <w:rStyle w:val="ab"/>
+          <w:lang w:val="lv-LV"/>
+        </w:rPr>
+        <w:t>Engine</w:t>
+      </w:r>
+      <w:proofErr w:type="spellEnd"/>
+      <w:r>
+        <w:rPr>
+          <w:rStyle w:val="ab"/>
+          <w:lang w:val="lv-LV"/>
+        </w:rPr>
+        <w:t xml:space="preserve"> (C++)</w:t>
+      </w:r>
+      <w:r>
+        <w:rPr>
+          <w:lang w:val="lv-LV"/>
+        </w:rPr>
+        <w:t xml:space="preserve"> piedāvā ļoti augstu veiktspēju un grafisko kvalitāti, tomēr tas ir daudz komplicētāks rīks, kas vairāk piemērots lieliem un tehniski sarežģītiem projektiem. C++ valoda ir sarežģītāka, tās apgūšanai nepieciešams vairāk laika, un tas nebūtu efektīvi šī darba ietvaros, kur mērķis ir izstrādāt 2D </w:t>
+      </w:r>
+      <w:proofErr w:type="spellStart"/>
+      <w:r>
+        <w:rPr>
+          <w:lang w:val="lv-LV"/>
+        </w:rPr>
+        <w:t>platformera</w:t>
+      </w:r>
+      <w:proofErr w:type="spellEnd"/>
+      <w:r>
+        <w:rPr>
+          <w:lang w:val="lv-LV"/>
+        </w:rPr>
+        <w:t xml:space="preserve"> tipa spēli.</w:t>
+      </w:r>
+    </w:p>
+    <w:p>
+      <w:pPr>
+        <w:pStyle w:val="a8"/>
+        <w:spacing w:before="0" w:beforeAutospacing="0" w:after="0" w:afterAutospacing="0" w:line="360" w:lineRule="auto"/>
+        <w:ind w:firstLine="851"/>
+        <w:contextualSpacing/>
+        <w:jc w:val="both"/>
+        <w:rPr>
+          <w:lang w:val="lv-LV"/>
+        </w:rPr>
+      </w:pPr>
+      <w:proofErr w:type="spellStart"/>
+      <w:r>
+        <w:rPr>
+          <w:rStyle w:val="ab"/>
+          <w:lang w:val="lv-LV"/>
+        </w:rPr>
+        <w:t>Python</w:t>
+      </w:r>
+      <w:proofErr w:type="spellEnd"/>
+      <w:r>
+        <w:rPr>
+          <w:rStyle w:val="ab"/>
+          <w:lang w:val="lv-LV"/>
+        </w:rPr>
+        <w:t xml:space="preserve"> + </w:t>
+      </w:r>
+      <w:proofErr w:type="spellStart"/>
+      <w:r>
+        <w:rPr>
+          <w:rStyle w:val="ab"/>
+          <w:lang w:val="lv-LV"/>
+        </w:rPr>
+        <w:t>Pygame</w:t>
+      </w:r>
+      <w:proofErr w:type="spellEnd"/>
+      <w:r>
+        <w:rPr>
+          <w:lang w:val="lv-LV"/>
+        </w:rPr>
+        <w:t xml:space="preserve"> ir vienkāršs un piemērots mazākiem projektiem vai mācību nolūkiem, tomēr tam ir ierobežotas grafiskās un veiktspējas iespējas. </w:t>
+      </w:r>
+      <w:proofErr w:type="spellStart"/>
+      <w:r>
+        <w:rPr>
+          <w:lang w:val="lv-LV"/>
+        </w:rPr>
+        <w:t>Pygame</w:t>
+      </w:r>
+      <w:proofErr w:type="spellEnd"/>
+      <w:r>
+        <w:rPr>
+          <w:lang w:val="lv-LV"/>
+        </w:rPr>
+        <w:t xml:space="preserve"> nav optimizēts lielākām spēlēm vai animācijām, un tas prasa manuālu darbu ar daudzām pamatfunkcijām, kas citos dzinējos jau ir iebūvētas.</w:t>
+      </w:r>
+    </w:p>
+    <w:p>
+      <w:pPr>
+        <w:pStyle w:val="a8"/>
+        <w:spacing w:before="0" w:beforeAutospacing="0" w:after="0" w:afterAutospacing="0" w:line="360" w:lineRule="auto"/>
+        <w:ind w:firstLine="851"/>
+        <w:contextualSpacing/>
+        <w:jc w:val="both"/>
+        <w:rPr>
+          <w:lang w:val="lv-LV"/>
+        </w:rPr>
+      </w:pPr>
+      <w:proofErr w:type="spellStart"/>
+      <w:r>
+        <w:rPr>
+          <w:rStyle w:val="ab"/>
+          <w:lang w:val="lv-LV"/>
+        </w:rPr>
+        <w:t>JavaScript</w:t>
+      </w:r>
+      <w:proofErr w:type="spellEnd"/>
+      <w:r>
+        <w:rPr>
+          <w:rStyle w:val="ab"/>
+          <w:lang w:val="lv-LV"/>
+        </w:rPr>
+        <w:t xml:space="preserve"> + </w:t>
+      </w:r>
+      <w:proofErr w:type="spellStart"/>
+      <w:r>
+        <w:rPr>
+          <w:rStyle w:val="ab"/>
+          <w:lang w:val="lv-LV"/>
+        </w:rPr>
+        <w:t>Phaser</w:t>
+      </w:r>
+      <w:proofErr w:type="spellEnd"/>
+      <w:r>
+        <w:rPr>
+          <w:lang w:val="lv-LV"/>
+        </w:rPr>
+        <w:t xml:space="preserve"> tika apsvērts kā iespēja tīmekļa spēles izstrādei, tomēr šajā gadījumā spēle tiek paredzēta darbam uz </w:t>
+      </w:r>
+      <w:r>
+        <w:rPr>
+          <w:rStyle w:val="ac"/>
+          <w:i w:val="0"/>
+          <w:iCs w:val="0"/>
+          <w:lang w:val="lv-LV"/>
+        </w:rPr>
+        <w:t>Windows</w:t>
+      </w:r>
+      <w:r>
+        <w:rPr>
+          <w:i/>
+          <w:iCs/>
+          <w:lang w:val="lv-LV"/>
+        </w:rPr>
+        <w:t xml:space="preserve"> </w:t>
+      </w:r>
+      <w:r>
+        <w:rPr>
+          <w:lang w:val="lv-LV"/>
+        </w:rPr>
+        <w:t xml:space="preserve">platformas, tāpēc šāds risinājums nebūtu piemērots. Turklāt </w:t>
+      </w:r>
+      <w:proofErr w:type="spellStart"/>
+      <w:r>
+        <w:rPr>
+          <w:lang w:val="lv-LV"/>
+        </w:rPr>
+        <w:t>Phaser</w:t>
+      </w:r>
+      <w:proofErr w:type="spellEnd"/>
+      <w:r>
+        <w:rPr>
+          <w:lang w:val="lv-LV"/>
+        </w:rPr>
+        <w:t xml:space="preserve"> vairāk orientēts uz vieglām, pārlūkprogrammā darbināmām spēlēm, nevis uz pilnvērtīgiem lokāliem projektiem ar plašākām iespējām.</w:t>
+      </w:r>
+    </w:p>
+    <w:p>
+      <w:pPr>
+        <w:pStyle w:val="a8"/>
+        <w:spacing w:before="0" w:beforeAutospacing="0" w:after="0" w:afterAutospacing="0" w:line="360" w:lineRule="auto"/>
+        <w:ind w:firstLine="851"/>
+        <w:contextualSpacing/>
+        <w:jc w:val="both"/>
+        <w:rPr>
+          <w:lang w:val="lv-LV"/>
+        </w:rPr>
+      </w:pPr>
+      <w:r>
+        <w:rPr>
+          <w:lang w:val="lv-LV"/>
+        </w:rPr>
+        <w:t xml:space="preserve">Apkopojot, visi minētie risinājumi ir funkcionāli un spēcīgi savās jomās, taču tie nebija optimāli izvēlētajam mērķim — 2D </w:t>
+      </w:r>
+      <w:proofErr w:type="spellStart"/>
+      <w:r>
+        <w:rPr>
+          <w:lang w:val="lv-LV"/>
+        </w:rPr>
+        <w:t>platformera</w:t>
+      </w:r>
+      <w:proofErr w:type="spellEnd"/>
+      <w:r>
+        <w:rPr>
+          <w:lang w:val="lv-LV"/>
+        </w:rPr>
+        <w:t xml:space="preserve"> izveidei uz </w:t>
+      </w:r>
+      <w:r>
+        <w:rPr>
+          <w:rStyle w:val="ac"/>
+          <w:i w:val="0"/>
+          <w:iCs w:val="0"/>
+          <w:lang w:val="lv-LV"/>
+        </w:rPr>
+        <w:t>Windows</w:t>
+      </w:r>
+      <w:r>
+        <w:rPr>
+          <w:lang w:val="lv-LV"/>
+        </w:rPr>
+        <w:t xml:space="preserve"> vides, kur galvenais uzsvars ir uz izstrādes vienkāršību, ātru testēšanu un radošu pieeju, ko vislabāk nodrošina </w:t>
+      </w:r>
+      <w:proofErr w:type="spellStart"/>
+      <w:r>
+        <w:rPr>
+          <w:rStyle w:val="ac"/>
+          <w:i w:val="0"/>
+          <w:iCs w:val="0"/>
+          <w:lang w:val="lv-LV"/>
+        </w:rPr>
+        <w:t>Godot</w:t>
+      </w:r>
+      <w:proofErr w:type="spellEnd"/>
+      <w:r>
+        <w:rPr>
+          <w:rStyle w:val="ac"/>
+          <w:i w:val="0"/>
+          <w:iCs w:val="0"/>
+          <w:lang w:val="lv-LV"/>
+        </w:rPr>
+        <w:t xml:space="preserve"> </w:t>
+      </w:r>
+      <w:proofErr w:type="spellStart"/>
+      <w:r>
+        <w:rPr>
+          <w:rStyle w:val="ac"/>
+          <w:i w:val="0"/>
+          <w:iCs w:val="0"/>
+          <w:lang w:val="lv-LV"/>
+        </w:rPr>
+        <w:t>Engine</w:t>
+      </w:r>
+      <w:proofErr w:type="spellEnd"/>
+      <w:r>
+        <w:rPr>
+          <w:lang w:val="lv-LV"/>
+        </w:rPr>
+        <w:t>.</w:t>
+      </w:r>
+      <w:r>
+        <w:rPr>
+          <w:lang w:val="lv-LV"/>
+        </w:rPr>
         <w:br w:type="page"/>
       </w:r>
     </w:p>
@@ -21427,6 +21997,7 @@
   <w:style w:type="character" w:default="1" w:styleId="a0">
     <w:name w:val="Default Paragraph Font"/>
     <w:uiPriority w:val="1"/>
+    <w:semiHidden/>
     <w:unhideWhenUsed/>
   </w:style>
   <w:style w:type="table" w:default="1" w:styleId="a1">
@@ -21704,7 +22275,6 @@
     <w:name w:val="Normal (Web)"/>
     <w:basedOn w:val="a"/>
     <w:uiPriority w:val="99"/>
-    <w:semiHidden/>
     <w:unhideWhenUsed/>
     <w:rsid w:val="00353929"/>
     <w:pPr>
@@ -21741,6 +22311,28 @@
     <w:rPr>
       <w:color w:val="605E5C"/>
       <w:shd w:val="clear" w:color="auto" w:fill="E1DFDD"/>
+    </w:rPr>
+  </w:style>
+  <w:style w:type="character" w:styleId="ab">
+    <w:name w:val="Strong"/>
+    <w:basedOn w:val="a0"/>
+    <w:uiPriority w:val="22"/>
+    <w:qFormat/>
+    <w:rsid w:val="00E71176"/>
+    <w:rPr>
+      <w:b/>
+      <w:bCs/>
+    </w:rPr>
+  </w:style>
+  <w:style w:type="character" w:styleId="ac">
+    <w:name w:val="Emphasis"/>
+    <w:basedOn w:val="a0"/>
+    <w:uiPriority w:val="20"/>
+    <w:qFormat/>
+    <w:rsid w:val="00E71176"/>
+    <w:rPr>
+      <w:i/>
+      <w:iCs/>
     </w:rPr>
   </w:style>
 </w:styles>

</xml_diff>